<commit_message>
nmv  25 04 2026
</commit_message>
<xml_diff>
--- a/TS Jatai Ghanam Project/TS 1.2/TS 1.2 Jatai Malayalam Corrections.docx
+++ b/TS Jatai Ghanam Project/TS 1.2/TS 1.2 Jatai Malayalam Corrections.docx
@@ -22,7 +22,18 @@
           <w:szCs w:val="32"/>
           <w:u w:val="single"/>
         </w:rPr>
-        <w:t xml:space="preserve">TS Jatai – TS 1.2 Malayalam Corrections – Observed till </w:t>
+        <w:t xml:space="preserve">TS Jatai – TS 1.2 Malayalam Corrections – Observed </w:t>
+      </w:r>
+      <w:proofErr w:type="gramStart"/>
+      <w:r>
+        <w:rPr>
+          <w:b/>
+          <w:bCs/>
+          <w:sz w:val="32"/>
+          <w:szCs w:val="32"/>
+          <w:u w:val="single"/>
+        </w:rPr>
+        <w:t xml:space="preserve">till </w:t>
       </w:r>
       <w:r>
         <w:rPr>
@@ -35,6 +46,7 @@
         </w:rPr>
         <w:t>?????</w:t>
       </w:r>
+      <w:proofErr w:type="gramEnd"/>
     </w:p>
     <w:p>
       <w:pPr>
@@ -166,7 +178,7 @@
               <w:autoSpaceDE w:val="0"/>
               <w:autoSpaceDN w:val="0"/>
               <w:adjustRightInd w:val="0"/>
-              <w:spacing w:line="240" w:lineRule="auto"/>
+              <w:spacing w:before="0" w:line="240" w:lineRule="auto"/>
               <w:rPr>
                 <w:rFonts w:ascii="BRH Malayalam Extra" w:hAnsi="BRH Malayalam Extra" w:cs="BRH Malayalam Extra"/>
                 <w:color w:val="000000"/>
@@ -451,7 +463,7 @@
               <w:autoSpaceDE w:val="0"/>
               <w:autoSpaceDN w:val="0"/>
               <w:adjustRightInd w:val="0"/>
-              <w:spacing w:line="240" w:lineRule="auto"/>
+              <w:spacing w:before="0" w:line="240" w:lineRule="auto"/>
               <w:rPr>
                 <w:rFonts w:ascii="BRH Malayalam Extra" w:hAnsi="BRH Malayalam Extra" w:cs="BRH Malayalam Extra"/>
                 <w:color w:val="000000"/>
@@ -643,7 +655,7 @@
               <w:autoSpaceDE w:val="0"/>
               <w:autoSpaceDN w:val="0"/>
               <w:adjustRightInd w:val="0"/>
-              <w:spacing w:line="240" w:lineRule="auto"/>
+              <w:spacing w:before="0" w:line="240" w:lineRule="auto"/>
               <w:rPr>
                 <w:rFonts w:ascii="BRH Malayalam Extra" w:hAnsi="BRH Malayalam Extra" w:cs="BRH Malayalam Extra"/>
                 <w:color w:val="000000"/>
@@ -713,7 +725,7 @@
               <w:autoSpaceDE w:val="0"/>
               <w:autoSpaceDN w:val="0"/>
               <w:adjustRightInd w:val="0"/>
-              <w:spacing w:line="240" w:lineRule="auto"/>
+              <w:spacing w:before="0" w:line="240" w:lineRule="auto"/>
               <w:rPr>
                 <w:rFonts w:ascii="BRH Malayalam Extra" w:hAnsi="BRH Malayalam Extra" w:cs="BRH Malayalam Extra"/>
                 <w:color w:val="000000"/>
@@ -962,7 +974,7 @@
               <w:autoSpaceDE w:val="0"/>
               <w:autoSpaceDN w:val="0"/>
               <w:adjustRightInd w:val="0"/>
-              <w:spacing w:line="240" w:lineRule="auto"/>
+              <w:spacing w:before="0" w:line="240" w:lineRule="auto"/>
               <w:rPr>
                 <w:rFonts w:ascii="BRH Malayalam Extra" w:hAnsi="BRH Malayalam Extra" w:cs="BRH Malayalam Extra"/>
                 <w:color w:val="000000"/>
@@ -1108,7 +1120,7 @@
               <w:autoSpaceDE w:val="0"/>
               <w:autoSpaceDN w:val="0"/>
               <w:adjustRightInd w:val="0"/>
-              <w:spacing w:line="240" w:lineRule="auto"/>
+              <w:spacing w:before="0" w:line="240" w:lineRule="auto"/>
               <w:rPr>
                 <w:rFonts w:ascii="BRH Malayalam Extra" w:hAnsi="BRH Malayalam Extra" w:cs="BRH Malayalam Extra"/>
                 <w:color w:val="000000"/>
@@ -1199,7 +1211,7 @@
               <w:autoSpaceDE w:val="0"/>
               <w:autoSpaceDN w:val="0"/>
               <w:adjustRightInd w:val="0"/>
-              <w:spacing w:line="240" w:lineRule="auto"/>
+              <w:spacing w:before="0" w:line="240" w:lineRule="auto"/>
               <w:rPr>
                 <w:rFonts w:ascii="BRH Malayalam Extra" w:hAnsi="BRH Malayalam Extra" w:cs="BRH Malayalam Extra"/>
                 <w:color w:val="000000"/>
@@ -1448,134 +1460,6 @@
               <w:autoSpaceDE w:val="0"/>
               <w:autoSpaceDN w:val="0"/>
               <w:adjustRightInd w:val="0"/>
-              <w:spacing w:line="240" w:lineRule="auto"/>
-              <w:rPr>
-                <w:rFonts w:ascii="BRH Malayalam Extra" w:hAnsi="BRH Malayalam Extra" w:cs="BRH Malayalam Extra"/>
-                <w:color w:val="000000"/>
-                <w:sz w:val="32"/>
-                <w:szCs w:val="40"/>
-              </w:rPr>
-            </w:pPr>
-            <w:r>
-              <w:rPr>
-                <w:rFonts w:ascii="BRH Malayalam Extra" w:hAnsi="BRH Malayalam Extra" w:cs="BRH Malayalam Extra"/>
-                <w:color w:val="000000"/>
-                <w:sz w:val="32"/>
-                <w:szCs w:val="40"/>
-              </w:rPr>
-              <w:t>D</w:t>
-            </w:r>
-            <w:r>
-              <w:rPr>
-                <w:rFonts w:ascii="BRH Malayalam Extra" w:hAnsi="BRH Malayalam Extra" w:cs="BRH Malayalam Extra"/>
-                <w:color w:val="000000"/>
-                <w:sz w:val="25"/>
-                <w:szCs w:val="40"/>
-              </w:rPr>
-              <w:t>–</w:t>
-            </w:r>
-            <w:r>
-              <w:rPr>
-                <w:rFonts w:ascii="BRH Malayalam Extra" w:hAnsi="BRH Malayalam Extra" w:cs="BRH Malayalam Extra"/>
-                <w:color w:val="000000"/>
-                <w:sz w:val="32"/>
-                <w:szCs w:val="40"/>
-              </w:rPr>
-              <w:t>h</w:t>
-            </w:r>
-            <w:r>
-              <w:rPr>
-                <w:rFonts w:ascii="BRH Malayalam Extra" w:hAnsi="BRH Malayalam Extra" w:cs="BRH Malayalam Extra"/>
-                <w:color w:val="000000"/>
-                <w:sz w:val="25"/>
-                <w:szCs w:val="40"/>
-              </w:rPr>
-              <w:t>–</w:t>
-            </w:r>
-            <w:r>
-              <w:rPr>
-                <w:rFonts w:ascii="BRH Malayalam Extra" w:hAnsi="BRH Malayalam Extra" w:cs="BRH Malayalam Extra"/>
-                <w:color w:val="000000"/>
-                <w:sz w:val="32"/>
-                <w:szCs w:val="40"/>
-              </w:rPr>
-              <w:t>jZ—qüz</w:t>
-            </w:r>
-            <w:r>
-              <w:rPr>
-                <w:rFonts w:ascii="BRH Malayalam Extra" w:hAnsi="BRH Malayalam Extra" w:cs="BRH Malayalam Extra"/>
-                <w:color w:val="000000"/>
-                <w:sz w:val="25"/>
-                <w:szCs w:val="40"/>
-              </w:rPr>
-              <w:t>–</w:t>
-            </w:r>
-            <w:r>
-              <w:rPr>
-                <w:rFonts w:ascii="BRH Malayalam Extra" w:hAnsi="BRH Malayalam Extra" w:cs="BRH Malayalam Extra"/>
-                <w:color w:val="000000"/>
-                <w:sz w:val="32"/>
-                <w:szCs w:val="40"/>
-              </w:rPr>
-              <w:t>ªrêzZõ¡—h</w:t>
-            </w:r>
-            <w:r>
-              <w:rPr>
-                <w:rFonts w:ascii="BRH Malayalam Extra" w:hAnsi="BRH Malayalam Extra" w:cs="BRH Malayalam Extra"/>
-                <w:color w:val="000000"/>
-                <w:sz w:val="25"/>
-                <w:szCs w:val="40"/>
-              </w:rPr>
-              <w:t>–</w:t>
-            </w:r>
-            <w:r>
-              <w:rPr>
-                <w:rFonts w:ascii="BRH Malayalam Extra" w:hAnsi="BRH Malayalam Extra" w:cs="BRH Malayalam Extra"/>
-                <w:color w:val="000000"/>
-                <w:sz w:val="32"/>
-                <w:szCs w:val="40"/>
-              </w:rPr>
-              <w:t>jZ—J - qz</w:t>
-            </w:r>
-            <w:r>
-              <w:rPr>
-                <w:rFonts w:ascii="BRH Malayalam Extra" w:hAnsi="BRH Malayalam Extra" w:cs="BRH Malayalam Extra"/>
-                <w:color w:val="000000"/>
-                <w:sz w:val="25"/>
-                <w:szCs w:val="40"/>
-              </w:rPr>
-              <w:t>–</w:t>
-            </w:r>
-            <w:r>
-              <w:rPr>
-                <w:rFonts w:ascii="BRH Malayalam Extra" w:hAnsi="BRH Malayalam Extra" w:cs="BRH Malayalam Extra"/>
-                <w:color w:val="000000"/>
-                <w:sz w:val="32"/>
-                <w:szCs w:val="40"/>
-              </w:rPr>
-              <w:t>ªrêz</w:t>
-            </w:r>
-            <w:r>
-              <w:rPr>
-                <w:rFonts w:ascii="BRH Malayalam Extra" w:hAnsi="BRH Malayalam Extra" w:cs="BRH Malayalam Extra"/>
-                <w:color w:val="000000"/>
-                <w:sz w:val="25"/>
-                <w:szCs w:val="40"/>
-              </w:rPr>
-              <w:t>–</w:t>
-            </w:r>
-            <w:r>
-              <w:rPr>
-                <w:rFonts w:ascii="BRH Malayalam Extra" w:hAnsi="BRH Malayalam Extra" w:cs="BRH Malayalam Extra"/>
-                <w:color w:val="000000"/>
-                <w:sz w:val="32"/>
-                <w:szCs w:val="40"/>
-              </w:rPr>
-              <w:t xml:space="preserve"> | </w:t>
-            </w:r>
-          </w:p>
-          <w:p>
-            <w:pPr>
               <w:spacing w:before="0" w:line="240" w:lineRule="auto"/>
               <w:rPr>
                 <w:b/>
@@ -1584,6 +1468,123 @@
                 <w:u w:val="single"/>
               </w:rPr>
             </w:pPr>
+            <w:r>
+              <w:rPr>
+                <w:rFonts w:ascii="BRH Malayalam Extra" w:hAnsi="BRH Malayalam Extra" w:cs="BRH Malayalam Extra"/>
+                <w:color w:val="000000"/>
+                <w:sz w:val="32"/>
+                <w:szCs w:val="40"/>
+              </w:rPr>
+              <w:t>D</w:t>
+            </w:r>
+            <w:r>
+              <w:rPr>
+                <w:rFonts w:ascii="BRH Malayalam Extra" w:hAnsi="BRH Malayalam Extra" w:cs="BRH Malayalam Extra"/>
+                <w:color w:val="000000"/>
+                <w:sz w:val="25"/>
+                <w:szCs w:val="40"/>
+              </w:rPr>
+              <w:t>–</w:t>
+            </w:r>
+            <w:r>
+              <w:rPr>
+                <w:rFonts w:ascii="BRH Malayalam Extra" w:hAnsi="BRH Malayalam Extra" w:cs="BRH Malayalam Extra"/>
+                <w:color w:val="000000"/>
+                <w:sz w:val="32"/>
+                <w:szCs w:val="40"/>
+              </w:rPr>
+              <w:t>h</w:t>
+            </w:r>
+            <w:r>
+              <w:rPr>
+                <w:rFonts w:ascii="BRH Malayalam Extra" w:hAnsi="BRH Malayalam Extra" w:cs="BRH Malayalam Extra"/>
+                <w:color w:val="000000"/>
+                <w:sz w:val="25"/>
+                <w:szCs w:val="40"/>
+              </w:rPr>
+              <w:t>–</w:t>
+            </w:r>
+            <w:r>
+              <w:rPr>
+                <w:rFonts w:ascii="BRH Malayalam Extra" w:hAnsi="BRH Malayalam Extra" w:cs="BRH Malayalam Extra"/>
+                <w:color w:val="000000"/>
+                <w:sz w:val="32"/>
+                <w:szCs w:val="40"/>
+              </w:rPr>
+              <w:t>jZ—qüz</w:t>
+            </w:r>
+            <w:r>
+              <w:rPr>
+                <w:rFonts w:ascii="BRH Malayalam Extra" w:hAnsi="BRH Malayalam Extra" w:cs="BRH Malayalam Extra"/>
+                <w:color w:val="000000"/>
+                <w:sz w:val="25"/>
+                <w:szCs w:val="40"/>
+              </w:rPr>
+              <w:t>–</w:t>
+            </w:r>
+            <w:r>
+              <w:rPr>
+                <w:rFonts w:ascii="BRH Malayalam Extra" w:hAnsi="BRH Malayalam Extra" w:cs="BRH Malayalam Extra"/>
+                <w:color w:val="000000"/>
+                <w:sz w:val="32"/>
+                <w:szCs w:val="40"/>
+              </w:rPr>
+              <w:t>ªrêzZõ¡—h</w:t>
+            </w:r>
+            <w:r>
+              <w:rPr>
+                <w:rFonts w:ascii="BRH Malayalam Extra" w:hAnsi="BRH Malayalam Extra" w:cs="BRH Malayalam Extra"/>
+                <w:color w:val="000000"/>
+                <w:sz w:val="25"/>
+                <w:szCs w:val="40"/>
+              </w:rPr>
+              <w:t>–</w:t>
+            </w:r>
+            <w:r>
+              <w:rPr>
+                <w:rFonts w:ascii="BRH Malayalam Extra" w:hAnsi="BRH Malayalam Extra" w:cs="BRH Malayalam Extra"/>
+                <w:color w:val="000000"/>
+                <w:sz w:val="32"/>
+                <w:szCs w:val="40"/>
+              </w:rPr>
+              <w:t>jZ—J - qz</w:t>
+            </w:r>
+            <w:r>
+              <w:rPr>
+                <w:rFonts w:ascii="BRH Malayalam Extra" w:hAnsi="BRH Malayalam Extra" w:cs="BRH Malayalam Extra"/>
+                <w:color w:val="000000"/>
+                <w:sz w:val="25"/>
+                <w:szCs w:val="40"/>
+              </w:rPr>
+              <w:t>–</w:t>
+            </w:r>
+            <w:r>
+              <w:rPr>
+                <w:rFonts w:ascii="BRH Malayalam Extra" w:hAnsi="BRH Malayalam Extra" w:cs="BRH Malayalam Extra"/>
+                <w:color w:val="000000"/>
+                <w:sz w:val="32"/>
+                <w:szCs w:val="40"/>
+              </w:rPr>
+              <w:t>ªrêz</w:t>
+            </w:r>
+            <w:r>
+              <w:rPr>
+                <w:rFonts w:ascii="BRH Malayalam Extra" w:hAnsi="BRH Malayalam Extra" w:cs="BRH Malayalam Extra"/>
+                <w:color w:val="000000"/>
+                <w:sz w:val="25"/>
+                <w:szCs w:val="40"/>
+              </w:rPr>
+              <w:t>–</w:t>
+            </w:r>
+            <w:r>
+              <w:rPr>
+                <w:rFonts w:ascii="BRH Malayalam Extra" w:hAnsi="BRH Malayalam Extra" w:cs="BRH Malayalam Extra"/>
+                <w:color w:val="000000"/>
+                <w:sz w:val="32"/>
+                <w:szCs w:val="40"/>
+              </w:rPr>
+              <w:t xml:space="preserve"> | </w:t>
+            </w:r>
           </w:p>
         </w:tc>
         <w:tc>
@@ -1596,7 +1597,7 @@
               <w:autoSpaceDE w:val="0"/>
               <w:autoSpaceDN w:val="0"/>
               <w:adjustRightInd w:val="0"/>
-              <w:spacing w:line="240" w:lineRule="auto"/>
+              <w:spacing w:before="0" w:line="240" w:lineRule="auto"/>
               <w:rPr>
                 <w:rFonts w:ascii="BRH Malayalam Extra" w:hAnsi="BRH Malayalam Extra" w:cs="BRH Malayalam Extra"/>
                 <w:color w:val="000000"/>
@@ -1872,7 +1873,7 @@
               <w:autoSpaceDE w:val="0"/>
               <w:autoSpaceDN w:val="0"/>
               <w:adjustRightInd w:val="0"/>
-              <w:spacing w:line="240" w:lineRule="auto"/>
+              <w:spacing w:before="0" w:line="240" w:lineRule="auto"/>
               <w:rPr>
                 <w:rFonts w:ascii="BRH Malayalam Extra" w:hAnsi="BRH Malayalam Extra" w:cs="BRH Malayalam Extra"/>
                 <w:color w:val="000000"/>
@@ -2025,7 +2026,7 @@
               <w:autoSpaceDE w:val="0"/>
               <w:autoSpaceDN w:val="0"/>
               <w:adjustRightInd w:val="0"/>
-              <w:spacing w:line="240" w:lineRule="auto"/>
+              <w:spacing w:before="0" w:line="240" w:lineRule="auto"/>
               <w:rPr>
                 <w:rFonts w:ascii="BRH Malayalam Extra" w:hAnsi="BRH Malayalam Extra" w:cs="BRH Malayalam Extra"/>
                 <w:color w:val="000000"/>
@@ -2086,7 +2087,7 @@
               <w:autoSpaceDE w:val="0"/>
               <w:autoSpaceDN w:val="0"/>
               <w:adjustRightInd w:val="0"/>
-              <w:spacing w:line="240" w:lineRule="auto"/>
+              <w:spacing w:before="0" w:line="240" w:lineRule="auto"/>
               <w:rPr>
                 <w:rFonts w:ascii="BRH Malayalam Extra" w:hAnsi="BRH Malayalam Extra" w:cs="BRH Malayalam Extra"/>
                 <w:color w:val="000000"/>
@@ -2326,7 +2327,7 @@
               <w:autoSpaceDE w:val="0"/>
               <w:autoSpaceDN w:val="0"/>
               <w:adjustRightInd w:val="0"/>
-              <w:spacing w:line="240" w:lineRule="auto"/>
+              <w:spacing w:before="0" w:line="240" w:lineRule="auto"/>
               <w:rPr>
                 <w:rFonts w:ascii="BRH Malayalam Extra" w:hAnsi="BRH Malayalam Extra" w:cs="BRH Malayalam Extra"/>
                 <w:color w:val="000000"/>
@@ -2499,7 +2500,7 @@
               <w:autoSpaceDE w:val="0"/>
               <w:autoSpaceDN w:val="0"/>
               <w:adjustRightInd w:val="0"/>
-              <w:spacing w:line="240" w:lineRule="auto"/>
+              <w:spacing w:before="0" w:line="240" w:lineRule="auto"/>
               <w:rPr>
                 <w:rFonts w:ascii="BRH Malayalam Extra" w:hAnsi="BRH Malayalam Extra" w:cs="BRH Malayalam Extra"/>
                 <w:color w:val="000000"/>
@@ -2739,7 +2740,7 @@
               <w:autoSpaceDE w:val="0"/>
               <w:autoSpaceDN w:val="0"/>
               <w:adjustRightInd w:val="0"/>
-              <w:spacing w:line="240" w:lineRule="auto"/>
+              <w:spacing w:before="0" w:line="240" w:lineRule="auto"/>
               <w:rPr>
                 <w:rFonts w:ascii="BRH Malayalam Extra" w:hAnsi="BRH Malayalam Extra" w:cs="BRH Malayalam Extra"/>
                 <w:color w:val="000000"/>
@@ -2890,7 +2891,7 @@
               <w:autoSpaceDE w:val="0"/>
               <w:autoSpaceDN w:val="0"/>
               <w:adjustRightInd w:val="0"/>
-              <w:spacing w:line="240" w:lineRule="auto"/>
+              <w:spacing w:before="0" w:line="240" w:lineRule="auto"/>
               <w:rPr>
                 <w:rFonts w:cs="Arial"/>
                 <w:color w:val="000000"/>
@@ -3054,7 +3055,7 @@
               <w:autoSpaceDE w:val="0"/>
               <w:autoSpaceDN w:val="0"/>
               <w:adjustRightInd w:val="0"/>
-              <w:spacing w:line="240" w:lineRule="auto"/>
+              <w:spacing w:before="0" w:line="240" w:lineRule="auto"/>
               <w:rPr>
                 <w:rFonts w:ascii="BRH Malayalam Extra" w:hAnsi="BRH Malayalam Extra" w:cs="BRH Malayalam Extra"/>
                 <w:color w:val="000000"/>
@@ -3170,12 +3171,13 @@
               <w:autoSpaceDE w:val="0"/>
               <w:autoSpaceDN w:val="0"/>
               <w:adjustRightInd w:val="0"/>
-              <w:spacing w:line="240" w:lineRule="auto"/>
-              <w:rPr>
-                <w:rFonts w:ascii="BRH Malayalam Extra" w:hAnsi="BRH Malayalam Extra" w:cs="BRH Malayalam Extra"/>
-                <w:color w:val="000000"/>
-                <w:sz w:val="32"/>
-                <w:szCs w:val="40"/>
+              <w:spacing w:before="0" w:line="240" w:lineRule="auto"/>
+              <w:rPr>
+                <w:rFonts w:ascii="BRH Malayalam Extra" w:hAnsi="BRH Malayalam Extra" w:cs="BRH Malayalam Extra"/>
+                <w:color w:val="000000"/>
+                <w:sz w:val="32"/>
+                <w:szCs w:val="40"/>
+                <w:lang w:val="it-IT"/>
               </w:rPr>
             </w:pPr>
             <w:r>
@@ -3186,6 +3188,172 @@
                 <w:szCs w:val="40"/>
               </w:rPr>
               <w:t xml:space="preserve"> </w:t>
+            </w:r>
+            <w:r>
+              <w:rPr>
+                <w:rFonts w:cs="BRH Malayalam Extra"/>
+                <w:color w:val="000000"/>
+                <w:szCs w:val="40"/>
+                <w:lang w:val="it-IT"/>
+              </w:rPr>
+              <w:t>28</w:t>
+            </w:r>
+            <w:r>
+              <w:rPr>
+                <w:rFonts w:ascii="BRH Malayalam Extra" w:hAnsi="BRH Malayalam Extra" w:cs="BRH Malayalam Extra"/>
+                <w:color w:val="000000"/>
+                <w:sz w:val="32"/>
+                <w:szCs w:val="40"/>
+                <w:lang w:val="it-IT"/>
+              </w:rPr>
+              <w:t xml:space="preserve">) </w:t>
+            </w:r>
+            <w:r>
+              <w:rPr>
+                <w:rFonts w:cs="BRH Malayalam Extra"/>
+                <w:color w:val="000000"/>
+                <w:szCs w:val="40"/>
+                <w:lang w:val="it-IT"/>
+              </w:rPr>
+              <w:t>1</w:t>
+            </w:r>
+            <w:r>
+              <w:rPr>
+                <w:rFonts w:ascii="BRH Malayalam Extra" w:hAnsi="BRH Malayalam Extra" w:cs="BRH Malayalam Extra"/>
+                <w:color w:val="000000"/>
+                <w:sz w:val="32"/>
+                <w:szCs w:val="40"/>
+                <w:lang w:val="it-IT"/>
+              </w:rPr>
+              <w:t>.</w:t>
+            </w:r>
+            <w:r>
+              <w:rPr>
+                <w:rFonts w:cs="BRH Malayalam Extra"/>
+                <w:color w:val="000000"/>
+                <w:szCs w:val="40"/>
+                <w:lang w:val="it-IT"/>
+              </w:rPr>
+              <w:t>2</w:t>
+            </w:r>
+            <w:r>
+              <w:rPr>
+                <w:rFonts w:ascii="BRH Malayalam Extra" w:hAnsi="BRH Malayalam Extra" w:cs="BRH Malayalam Extra"/>
+                <w:color w:val="000000"/>
+                <w:sz w:val="32"/>
+                <w:szCs w:val="40"/>
+                <w:lang w:val="it-IT"/>
+              </w:rPr>
+              <w:t>.</w:t>
+            </w:r>
+            <w:r>
+              <w:rPr>
+                <w:rFonts w:cs="BRH Malayalam Extra"/>
+                <w:color w:val="000000"/>
+                <w:szCs w:val="40"/>
+                <w:lang w:val="it-IT"/>
+              </w:rPr>
+              <w:t>5</w:t>
+            </w:r>
+            <w:r>
+              <w:rPr>
+                <w:rFonts w:ascii="BRH Malayalam Extra" w:hAnsi="BRH Malayalam Extra" w:cs="BRH Malayalam Extra"/>
+                <w:color w:val="000000"/>
+                <w:sz w:val="32"/>
+                <w:szCs w:val="40"/>
+                <w:lang w:val="it-IT"/>
+              </w:rPr>
+              <w:t>.</w:t>
+            </w:r>
+            <w:r>
+              <w:rPr>
+                <w:rFonts w:cs="BRH Malayalam Extra"/>
+                <w:color w:val="000000"/>
+                <w:szCs w:val="40"/>
+                <w:lang w:val="it-IT"/>
+              </w:rPr>
+              <w:t>2</w:t>
+            </w:r>
+            <w:r>
+              <w:rPr>
+                <w:rFonts w:ascii="BRH Malayalam Extra" w:hAnsi="BRH Malayalam Extra" w:cs="BRH Malayalam Extra"/>
+                <w:color w:val="000000"/>
+                <w:sz w:val="32"/>
+                <w:szCs w:val="40"/>
+                <w:lang w:val="it-IT"/>
+              </w:rPr>
+              <w:t>(</w:t>
+            </w:r>
+            <w:r>
+              <w:rPr>
+                <w:rFonts w:cs="BRH Malayalam Extra"/>
+                <w:color w:val="000000"/>
+                <w:szCs w:val="40"/>
+                <w:lang w:val="it-IT"/>
+              </w:rPr>
+              <w:t>24</w:t>
+            </w:r>
+            <w:r>
+              <w:rPr>
+                <w:rFonts w:ascii="BRH Malayalam Extra" w:hAnsi="BRH Malayalam Extra" w:cs="BRH Malayalam Extra"/>
+                <w:color w:val="000000"/>
+                <w:sz w:val="32"/>
+                <w:szCs w:val="40"/>
+                <w:lang w:val="it-IT"/>
+              </w:rPr>
+              <w:t xml:space="preserve">)- </w:t>
+            </w:r>
+            <w:r>
+              <w:rPr>
+                <w:rFonts w:ascii="BRH Malayalam Extra" w:hAnsi="BRH Malayalam Extra" w:cs="BRH Malayalam Extra"/>
+                <w:color w:val="000000"/>
+                <w:sz w:val="32"/>
+                <w:szCs w:val="40"/>
+                <w:highlight w:val="yellow"/>
+                <w:lang w:val="it-IT"/>
+              </w:rPr>
+              <w:t>ix</w:t>
+            </w:r>
+            <w:r>
+              <w:rPr>
+                <w:rFonts w:ascii="BRH Malayalam Extra" w:hAnsi="BRH Malayalam Extra" w:cs="BRH Malayalam Extra"/>
+                <w:color w:val="000000"/>
+                <w:sz w:val="25"/>
+                <w:szCs w:val="40"/>
+                <w:highlight w:val="yellow"/>
+                <w:lang w:val="it-IT"/>
+              </w:rPr>
+              <w:t>–</w:t>
+            </w:r>
+            <w:r>
+              <w:rPr>
+                <w:rFonts w:ascii="BRH Malayalam Extra" w:hAnsi="BRH Malayalam Extra" w:cs="BRH Malayalam Extra"/>
+                <w:color w:val="000000"/>
+                <w:sz w:val="32"/>
+                <w:szCs w:val="40"/>
+                <w:lang w:val="it-IT"/>
+              </w:rPr>
+              <w:t xml:space="preserve"> | A</w:t>
+            </w:r>
+            <w:r>
+              <w:rPr>
+                <w:rFonts w:ascii="BRH Malayalam Extra" w:hAnsi="BRH Malayalam Extra" w:cs="BRH Malayalam Extra"/>
+                <w:color w:val="000000"/>
+                <w:sz w:val="25"/>
+                <w:szCs w:val="40"/>
+                <w:lang w:val="it-IT"/>
+              </w:rPr>
+              <w:t>–</w:t>
+            </w:r>
+            <w:r>
+              <w:rPr>
+                <w:rFonts w:ascii="BRH Malayalam Extra" w:hAnsi="BRH Malayalam Extra" w:cs="BRH Malayalam Extra"/>
+                <w:color w:val="000000"/>
+                <w:sz w:val="32"/>
+                <w:szCs w:val="40"/>
+                <w:lang w:val="it-IT"/>
+              </w:rPr>
+              <w:t>tI |</w:t>
             </w:r>
           </w:p>
           <w:p>
@@ -3194,7 +3362,7 @@
               <w:autoSpaceDE w:val="0"/>
               <w:autoSpaceDN w:val="0"/>
               <w:adjustRightInd w:val="0"/>
-              <w:spacing w:line="240" w:lineRule="auto"/>
+              <w:spacing w:before="0" w:line="240" w:lineRule="auto"/>
               <w:rPr>
                 <w:rFonts w:ascii="BRH Malayalam Extra" w:hAnsi="BRH Malayalam Extra" w:cs="BRH Malayalam Extra"/>
                 <w:color w:val="000000"/>
@@ -3205,121 +3373,6 @@
             </w:pPr>
             <w:r>
               <w:rPr>
-                <w:rFonts w:cs="BRH Malayalam Extra"/>
-                <w:color w:val="000000"/>
-                <w:szCs w:val="40"/>
-                <w:lang w:val="it-IT"/>
-              </w:rPr>
-              <w:lastRenderedPageBreak/>
-              <w:t>28</w:t>
-            </w:r>
-            <w:r>
-              <w:rPr>
-                <w:rFonts w:ascii="BRH Malayalam Extra" w:hAnsi="BRH Malayalam Extra" w:cs="BRH Malayalam Extra"/>
-                <w:color w:val="000000"/>
-                <w:sz w:val="32"/>
-                <w:szCs w:val="40"/>
-                <w:lang w:val="it-IT"/>
-              </w:rPr>
-              <w:t xml:space="preserve">) </w:t>
-            </w:r>
-            <w:r>
-              <w:rPr>
-                <w:rFonts w:cs="BRH Malayalam Extra"/>
-                <w:color w:val="000000"/>
-                <w:szCs w:val="40"/>
-                <w:lang w:val="it-IT"/>
-              </w:rPr>
-              <w:t>1</w:t>
-            </w:r>
-            <w:r>
-              <w:rPr>
-                <w:rFonts w:ascii="BRH Malayalam Extra" w:hAnsi="BRH Malayalam Extra" w:cs="BRH Malayalam Extra"/>
-                <w:color w:val="000000"/>
-                <w:sz w:val="32"/>
-                <w:szCs w:val="40"/>
-                <w:lang w:val="it-IT"/>
-              </w:rPr>
-              <w:t>.</w:t>
-            </w:r>
-            <w:r>
-              <w:rPr>
-                <w:rFonts w:cs="BRH Malayalam Extra"/>
-                <w:color w:val="000000"/>
-                <w:szCs w:val="40"/>
-                <w:lang w:val="it-IT"/>
-              </w:rPr>
-              <w:t>2</w:t>
-            </w:r>
-            <w:r>
-              <w:rPr>
-                <w:rFonts w:ascii="BRH Malayalam Extra" w:hAnsi="BRH Malayalam Extra" w:cs="BRH Malayalam Extra"/>
-                <w:color w:val="000000"/>
-                <w:sz w:val="32"/>
-                <w:szCs w:val="40"/>
-                <w:lang w:val="it-IT"/>
-              </w:rPr>
-              <w:t>.</w:t>
-            </w:r>
-            <w:r>
-              <w:rPr>
-                <w:rFonts w:cs="BRH Malayalam Extra"/>
-                <w:color w:val="000000"/>
-                <w:szCs w:val="40"/>
-                <w:lang w:val="it-IT"/>
-              </w:rPr>
-              <w:t>5</w:t>
-            </w:r>
-            <w:r>
-              <w:rPr>
-                <w:rFonts w:ascii="BRH Malayalam Extra" w:hAnsi="BRH Malayalam Extra" w:cs="BRH Malayalam Extra"/>
-                <w:color w:val="000000"/>
-                <w:sz w:val="32"/>
-                <w:szCs w:val="40"/>
-                <w:lang w:val="it-IT"/>
-              </w:rPr>
-              <w:t>.</w:t>
-            </w:r>
-            <w:r>
-              <w:rPr>
-                <w:rFonts w:cs="BRH Malayalam Extra"/>
-                <w:color w:val="000000"/>
-                <w:szCs w:val="40"/>
-                <w:lang w:val="it-IT"/>
-              </w:rPr>
-              <w:t>2</w:t>
-            </w:r>
-            <w:r>
-              <w:rPr>
-                <w:rFonts w:ascii="BRH Malayalam Extra" w:hAnsi="BRH Malayalam Extra" w:cs="BRH Malayalam Extra"/>
-                <w:color w:val="000000"/>
-                <w:sz w:val="32"/>
-                <w:szCs w:val="40"/>
-                <w:lang w:val="it-IT"/>
-              </w:rPr>
-              <w:t>(</w:t>
-            </w:r>
-            <w:r>
-              <w:rPr>
-                <w:rFonts w:cs="BRH Malayalam Extra"/>
-                <w:color w:val="000000"/>
-                <w:szCs w:val="40"/>
-                <w:lang w:val="it-IT"/>
-              </w:rPr>
-              <w:t>24</w:t>
-            </w:r>
-            <w:r>
-              <w:rPr>
-                <w:rFonts w:ascii="BRH Malayalam Extra" w:hAnsi="BRH Malayalam Extra" w:cs="BRH Malayalam Extra"/>
-                <w:color w:val="000000"/>
-                <w:sz w:val="32"/>
-                <w:szCs w:val="40"/>
-                <w:lang w:val="it-IT"/>
-              </w:rPr>
-              <w:t xml:space="preserve">)- </w:t>
-            </w:r>
-            <w:r>
-              <w:rPr>
                 <w:rFonts w:ascii="BRH Malayalam Extra" w:hAnsi="BRH Malayalam Extra" w:cs="BRH Malayalam Extra"/>
                 <w:color w:val="000000"/>
                 <w:sz w:val="32"/>
@@ -3335,40 +3388,71 @@
                 <w:color w:val="000000"/>
                 <w:sz w:val="25"/>
                 <w:szCs w:val="40"/>
+                <w:highlight w:val="red"/>
+                <w:lang w:val="it-IT"/>
+              </w:rPr>
+              <w:t>–</w:t>
+            </w:r>
+            <w:r>
+              <w:rPr>
+                <w:rFonts w:ascii="BRH Malayalam Extra" w:hAnsi="BRH Malayalam Extra" w:cs="BRH Malayalam Extra"/>
+                <w:color w:val="000000"/>
+                <w:sz w:val="32"/>
+                <w:szCs w:val="40"/>
+                <w:lang w:val="it-IT"/>
+              </w:rPr>
+              <w:t xml:space="preserve"> „t i</w:t>
+            </w:r>
+            <w:r>
+              <w:rPr>
+                <w:rFonts w:ascii="BRH Malayalam Extra" w:hAnsi="BRH Malayalam Extra" w:cs="BRH Malayalam Extra"/>
+                <w:color w:val="000000"/>
+                <w:sz w:val="25"/>
+                <w:szCs w:val="40"/>
+                <w:lang w:val="it-IT"/>
+              </w:rPr>
+              <w:t>–</w:t>
+            </w:r>
+            <w:r>
+              <w:rPr>
+                <w:rFonts w:ascii="BRH Malayalam Extra" w:hAnsi="BRH Malayalam Extra" w:cs="BRH Malayalam Extra"/>
+                <w:color w:val="000000"/>
+                <w:sz w:val="32"/>
+                <w:szCs w:val="40"/>
+                <w:lang w:val="it-IT"/>
+              </w:rPr>
+              <w:t xml:space="preserve">tI </w:t>
+            </w:r>
+            <w:r>
+              <w:rPr>
+                <w:rFonts w:ascii="BRH Malayalam Extra" w:hAnsi="BRH Malayalam Extra" w:cs="BRH Malayalam Extra"/>
+                <w:color w:val="000000"/>
+                <w:sz w:val="32"/>
+                <w:szCs w:val="40"/>
                 <w:highlight w:val="yellow"/>
                 <w:lang w:val="it-IT"/>
               </w:rPr>
-              <w:t>–</w:t>
-            </w:r>
-            <w:r>
-              <w:rPr>
-                <w:rFonts w:ascii="BRH Malayalam Extra" w:hAnsi="BRH Malayalam Extra" w:cs="BRH Malayalam Extra"/>
-                <w:color w:val="000000"/>
-                <w:sz w:val="32"/>
-                <w:szCs w:val="40"/>
-                <w:lang w:val="it-IT"/>
-              </w:rPr>
-              <w:t xml:space="preserve"> | A</w:t>
-            </w:r>
-            <w:r>
-              <w:rPr>
-                <w:rFonts w:ascii="BRH Malayalam Extra" w:hAnsi="BRH Malayalam Extra" w:cs="BRH Malayalam Extra"/>
-                <w:color w:val="000000"/>
-                <w:sz w:val="25"/>
-                <w:szCs w:val="40"/>
-                <w:lang w:val="it-IT"/>
-              </w:rPr>
-              <w:t>–</w:t>
-            </w:r>
-            <w:r>
-              <w:rPr>
-                <w:rFonts w:ascii="BRH Malayalam Extra" w:hAnsi="BRH Malayalam Extra" w:cs="BRH Malayalam Extra"/>
-                <w:color w:val="000000"/>
-                <w:sz w:val="32"/>
-                <w:szCs w:val="40"/>
-                <w:lang w:val="it-IT"/>
-              </w:rPr>
-              <w:t>tI |</w:t>
+              <w:t>ix— ix</w:t>
+            </w:r>
+            <w:r>
+              <w:rPr>
+                <w:rFonts w:ascii="BRH Malayalam Extra" w:hAnsi="BRH Malayalam Extra" w:cs="BRH Malayalam Extra"/>
+                <w:color w:val="000000"/>
+                <w:sz w:val="25"/>
+                <w:szCs w:val="40"/>
+                <w:lang w:val="it-IT"/>
+              </w:rPr>
+              <w:t>–</w:t>
+            </w:r>
+            <w:r>
+              <w:rPr>
+                <w:rFonts w:ascii="BRH Malayalam Extra" w:hAnsi="BRH Malayalam Extra" w:cs="BRH Malayalam Extra"/>
+                <w:color w:val="000000"/>
+                <w:sz w:val="32"/>
+                <w:szCs w:val="40"/>
+                <w:lang w:val="it-IT"/>
+              </w:rPr>
+              <w:t xml:space="preserve"> „tI | </w:t>
             </w:r>
           </w:p>
           <w:p>
@@ -3377,106 +3461,7 @@
               <w:autoSpaceDE w:val="0"/>
               <w:autoSpaceDN w:val="0"/>
               <w:adjustRightInd w:val="0"/>
-              <w:spacing w:line="240" w:lineRule="auto"/>
-              <w:rPr>
-                <w:rFonts w:ascii="BRH Malayalam Extra" w:hAnsi="BRH Malayalam Extra" w:cs="BRH Malayalam Extra"/>
-                <w:color w:val="000000"/>
-                <w:sz w:val="32"/>
-                <w:szCs w:val="40"/>
-                <w:lang w:val="it-IT"/>
-              </w:rPr>
-            </w:pPr>
-            <w:r>
-              <w:rPr>
-                <w:rFonts w:ascii="BRH Malayalam Extra" w:hAnsi="BRH Malayalam Extra" w:cs="BRH Malayalam Extra"/>
-                <w:color w:val="000000"/>
-                <w:sz w:val="32"/>
-                <w:szCs w:val="40"/>
-                <w:highlight w:val="yellow"/>
-                <w:lang w:val="it-IT"/>
-              </w:rPr>
-              <w:t>ix</w:t>
-            </w:r>
-            <w:r>
-              <w:rPr>
-                <w:rFonts w:ascii="BRH Malayalam Extra" w:hAnsi="BRH Malayalam Extra" w:cs="BRH Malayalam Extra"/>
-                <w:color w:val="000000"/>
-                <w:sz w:val="25"/>
-                <w:szCs w:val="40"/>
-                <w:highlight w:val="red"/>
-                <w:lang w:val="it-IT"/>
-              </w:rPr>
-              <w:t>–</w:t>
-            </w:r>
-            <w:r>
-              <w:rPr>
-                <w:rFonts w:ascii="BRH Malayalam Extra" w:hAnsi="BRH Malayalam Extra" w:cs="BRH Malayalam Extra"/>
-                <w:color w:val="000000"/>
-                <w:sz w:val="32"/>
-                <w:szCs w:val="40"/>
-                <w:lang w:val="it-IT"/>
-              </w:rPr>
-              <w:t xml:space="preserve"> „t i</w:t>
-            </w:r>
-            <w:r>
-              <w:rPr>
-                <w:rFonts w:ascii="BRH Malayalam Extra" w:hAnsi="BRH Malayalam Extra" w:cs="BRH Malayalam Extra"/>
-                <w:color w:val="000000"/>
-                <w:sz w:val="25"/>
-                <w:szCs w:val="40"/>
-                <w:lang w:val="it-IT"/>
-              </w:rPr>
-              <w:t>–</w:t>
-            </w:r>
-            <w:r>
-              <w:rPr>
-                <w:rFonts w:ascii="BRH Malayalam Extra" w:hAnsi="BRH Malayalam Extra" w:cs="BRH Malayalam Extra"/>
-                <w:color w:val="000000"/>
-                <w:sz w:val="32"/>
-                <w:szCs w:val="40"/>
-                <w:lang w:val="it-IT"/>
-              </w:rPr>
-              <w:t xml:space="preserve">tI </w:t>
-            </w:r>
-            <w:r>
-              <w:rPr>
-                <w:rFonts w:ascii="BRH Malayalam Extra" w:hAnsi="BRH Malayalam Extra" w:cs="BRH Malayalam Extra"/>
-                <w:color w:val="000000"/>
-                <w:sz w:val="32"/>
-                <w:szCs w:val="40"/>
-                <w:highlight w:val="yellow"/>
-                <w:lang w:val="it-IT"/>
-              </w:rPr>
-              <w:t>ix— ix</w:t>
-            </w:r>
-            <w:r>
-              <w:rPr>
-                <w:rFonts w:ascii="BRH Malayalam Extra" w:hAnsi="BRH Malayalam Extra" w:cs="BRH Malayalam Extra"/>
-                <w:color w:val="000000"/>
-                <w:sz w:val="25"/>
-                <w:szCs w:val="40"/>
-                <w:lang w:val="it-IT"/>
-              </w:rPr>
-              <w:t>–</w:t>
-            </w:r>
-            <w:r>
-              <w:rPr>
-                <w:rFonts w:ascii="BRH Malayalam Extra" w:hAnsi="BRH Malayalam Extra" w:cs="BRH Malayalam Extra"/>
-                <w:color w:val="000000"/>
-                <w:sz w:val="32"/>
-                <w:szCs w:val="40"/>
-                <w:lang w:val="it-IT"/>
-              </w:rPr>
-              <w:t xml:space="preserve"> „tI | </w:t>
-            </w:r>
-          </w:p>
-          <w:p>
-            <w:pPr>
-              <w:widowControl w:val="0"/>
-              <w:autoSpaceDE w:val="0"/>
-              <w:autoSpaceDN w:val="0"/>
-              <w:adjustRightInd w:val="0"/>
-              <w:spacing w:line="240" w:lineRule="auto"/>
+              <w:spacing w:before="0" w:line="240" w:lineRule="auto"/>
               <w:rPr>
                 <w:rFonts w:cs="BRH Malayalam Extra"/>
                 <w:color w:val="000000"/>
@@ -3496,7 +3481,7 @@
               <w:autoSpaceDE w:val="0"/>
               <w:autoSpaceDN w:val="0"/>
               <w:adjustRightInd w:val="0"/>
-              <w:spacing w:line="240" w:lineRule="auto"/>
+              <w:spacing w:before="0" w:line="240" w:lineRule="auto"/>
               <w:rPr>
                 <w:rFonts w:cs="Arial"/>
                 <w:color w:val="000000"/>
@@ -3510,7 +3495,6 @@
                 <w:color w:val="000000"/>
                 <w:szCs w:val="40"/>
               </w:rPr>
-              <w:lastRenderedPageBreak/>
               <w:t>26</w:t>
             </w:r>
             <w:r>
@@ -3660,7 +3644,7 @@
               <w:autoSpaceDE w:val="0"/>
               <w:autoSpaceDN w:val="0"/>
               <w:adjustRightInd w:val="0"/>
-              <w:spacing w:line="240" w:lineRule="auto"/>
+              <w:spacing w:before="0" w:line="240" w:lineRule="auto"/>
               <w:rPr>
                 <w:rFonts w:ascii="BRH Malayalam Extra" w:hAnsi="BRH Malayalam Extra" w:cs="BRH Malayalam Extra"/>
                 <w:color w:val="000000"/>
@@ -3795,12 +3779,13 @@
               <w:autoSpaceDE w:val="0"/>
               <w:autoSpaceDN w:val="0"/>
               <w:adjustRightInd w:val="0"/>
-              <w:spacing w:line="240" w:lineRule="auto"/>
-              <w:rPr>
-                <w:rFonts w:ascii="BRH Malayalam Extra" w:hAnsi="BRH Malayalam Extra" w:cs="BRH Malayalam Extra"/>
-                <w:color w:val="000000"/>
-                <w:sz w:val="32"/>
-                <w:szCs w:val="40"/>
+              <w:spacing w:before="0" w:line="240" w:lineRule="auto"/>
+              <w:rPr>
+                <w:rFonts w:ascii="BRH Malayalam Extra" w:hAnsi="BRH Malayalam Extra" w:cs="BRH Malayalam Extra"/>
+                <w:color w:val="000000"/>
+                <w:sz w:val="32"/>
+                <w:szCs w:val="40"/>
+                <w:lang w:val="it-IT"/>
               </w:rPr>
             </w:pPr>
             <w:r>
@@ -3811,6 +3796,161 @@
                 <w:szCs w:val="40"/>
               </w:rPr>
               <w:t xml:space="preserve"> </w:t>
+            </w:r>
+            <w:r>
+              <w:rPr>
+                <w:rFonts w:cs="BRH Malayalam Extra"/>
+                <w:color w:val="000000"/>
+                <w:szCs w:val="40"/>
+                <w:lang w:val="it-IT"/>
+              </w:rPr>
+              <w:t>28</w:t>
+            </w:r>
+            <w:r>
+              <w:rPr>
+                <w:rFonts w:ascii="BRH Malayalam Extra" w:hAnsi="BRH Malayalam Extra" w:cs="BRH Malayalam Extra"/>
+                <w:color w:val="000000"/>
+                <w:sz w:val="32"/>
+                <w:szCs w:val="40"/>
+                <w:lang w:val="it-IT"/>
+              </w:rPr>
+              <w:t xml:space="preserve">) </w:t>
+            </w:r>
+            <w:r>
+              <w:rPr>
+                <w:rFonts w:cs="BRH Malayalam Extra"/>
+                <w:color w:val="000000"/>
+                <w:szCs w:val="40"/>
+                <w:lang w:val="it-IT"/>
+              </w:rPr>
+              <w:t>1</w:t>
+            </w:r>
+            <w:r>
+              <w:rPr>
+                <w:rFonts w:ascii="BRH Malayalam Extra" w:hAnsi="BRH Malayalam Extra" w:cs="BRH Malayalam Extra"/>
+                <w:color w:val="000000"/>
+                <w:sz w:val="32"/>
+                <w:szCs w:val="40"/>
+                <w:lang w:val="it-IT"/>
+              </w:rPr>
+              <w:t>.</w:t>
+            </w:r>
+            <w:r>
+              <w:rPr>
+                <w:rFonts w:cs="BRH Malayalam Extra"/>
+                <w:color w:val="000000"/>
+                <w:szCs w:val="40"/>
+                <w:lang w:val="it-IT"/>
+              </w:rPr>
+              <w:t>2</w:t>
+            </w:r>
+            <w:r>
+              <w:rPr>
+                <w:rFonts w:ascii="BRH Malayalam Extra" w:hAnsi="BRH Malayalam Extra" w:cs="BRH Malayalam Extra"/>
+                <w:color w:val="000000"/>
+                <w:sz w:val="32"/>
+                <w:szCs w:val="40"/>
+                <w:lang w:val="it-IT"/>
+              </w:rPr>
+              <w:t>.</w:t>
+            </w:r>
+            <w:r>
+              <w:rPr>
+                <w:rFonts w:cs="BRH Malayalam Extra"/>
+                <w:color w:val="000000"/>
+                <w:szCs w:val="40"/>
+                <w:lang w:val="it-IT"/>
+              </w:rPr>
+              <w:t>5</w:t>
+            </w:r>
+            <w:r>
+              <w:rPr>
+                <w:rFonts w:ascii="BRH Malayalam Extra" w:hAnsi="BRH Malayalam Extra" w:cs="BRH Malayalam Extra"/>
+                <w:color w:val="000000"/>
+                <w:sz w:val="32"/>
+                <w:szCs w:val="40"/>
+                <w:lang w:val="it-IT"/>
+              </w:rPr>
+              <w:t>.</w:t>
+            </w:r>
+            <w:r>
+              <w:rPr>
+                <w:rFonts w:cs="BRH Malayalam Extra"/>
+                <w:color w:val="000000"/>
+                <w:szCs w:val="40"/>
+                <w:lang w:val="it-IT"/>
+              </w:rPr>
+              <w:t>2</w:t>
+            </w:r>
+            <w:r>
+              <w:rPr>
+                <w:rFonts w:ascii="BRH Malayalam Extra" w:hAnsi="BRH Malayalam Extra" w:cs="BRH Malayalam Extra"/>
+                <w:color w:val="000000"/>
+                <w:sz w:val="32"/>
+                <w:szCs w:val="40"/>
+                <w:lang w:val="it-IT"/>
+              </w:rPr>
+              <w:t>(</w:t>
+            </w:r>
+            <w:r>
+              <w:rPr>
+                <w:rFonts w:cs="BRH Malayalam Extra"/>
+                <w:color w:val="000000"/>
+                <w:szCs w:val="40"/>
+                <w:lang w:val="it-IT"/>
+              </w:rPr>
+              <w:t>24</w:t>
+            </w:r>
+            <w:r>
+              <w:rPr>
+                <w:rFonts w:ascii="BRH Malayalam Extra" w:hAnsi="BRH Malayalam Extra" w:cs="BRH Malayalam Extra"/>
+                <w:color w:val="000000"/>
+                <w:sz w:val="32"/>
+                <w:szCs w:val="40"/>
+                <w:lang w:val="it-IT"/>
+              </w:rPr>
+              <w:t xml:space="preserve">)- </w:t>
+            </w:r>
+            <w:r>
+              <w:rPr>
+                <w:rFonts w:ascii="BRH Malayalam Extra" w:hAnsi="BRH Malayalam Extra" w:cs="BRH Malayalam Extra"/>
+                <w:color w:val="000000"/>
+                <w:sz w:val="32"/>
+                <w:szCs w:val="40"/>
+                <w:highlight w:val="green"/>
+                <w:lang w:val="it-IT"/>
+              </w:rPr>
+              <w:t>ix</w:t>
+            </w:r>
+            <w:r>
+              <w:rPr>
+                <w:rFonts w:ascii="BRH Malayalam Extra" w:hAnsi="BRH Malayalam Extra" w:cs="BRH Malayalam Extra"/>
+                <w:color w:val="000000"/>
+                <w:sz w:val="32"/>
+                <w:szCs w:val="40"/>
+                <w:lang w:val="it-IT"/>
+              </w:rPr>
+              <w:t xml:space="preserve"> | A</w:t>
+            </w:r>
+            <w:r>
+              <w:rPr>
+                <w:rFonts w:ascii="BRH Malayalam Extra" w:hAnsi="BRH Malayalam Extra" w:cs="BRH Malayalam Extra"/>
+                <w:color w:val="000000"/>
+                <w:sz w:val="25"/>
+                <w:szCs w:val="40"/>
+                <w:lang w:val="it-IT"/>
+              </w:rPr>
+              <w:t>–</w:t>
+            </w:r>
+            <w:r>
+              <w:rPr>
+                <w:rFonts w:ascii="BRH Malayalam Extra" w:hAnsi="BRH Malayalam Extra" w:cs="BRH Malayalam Extra"/>
+                <w:color w:val="000000"/>
+                <w:sz w:val="32"/>
+                <w:szCs w:val="40"/>
+                <w:lang w:val="it-IT"/>
+              </w:rPr>
+              <w:t>tI |</w:t>
             </w:r>
           </w:p>
           <w:p>
@@ -3819,7 +3959,7 @@
               <w:autoSpaceDE w:val="0"/>
               <w:autoSpaceDN w:val="0"/>
               <w:adjustRightInd w:val="0"/>
-              <w:spacing w:line="240" w:lineRule="auto"/>
+              <w:spacing w:before="0" w:line="240" w:lineRule="auto"/>
               <w:rPr>
                 <w:rFonts w:ascii="BRH Malayalam Extra" w:hAnsi="BRH Malayalam Extra" w:cs="BRH Malayalam Extra"/>
                 <w:color w:val="000000"/>
@@ -3830,121 +3970,6 @@
             </w:pPr>
             <w:r>
               <w:rPr>
-                <w:rFonts w:cs="BRH Malayalam Extra"/>
-                <w:color w:val="000000"/>
-                <w:szCs w:val="40"/>
-                <w:lang w:val="it-IT"/>
-              </w:rPr>
-              <w:lastRenderedPageBreak/>
-              <w:t>28</w:t>
-            </w:r>
-            <w:r>
-              <w:rPr>
-                <w:rFonts w:ascii="BRH Malayalam Extra" w:hAnsi="BRH Malayalam Extra" w:cs="BRH Malayalam Extra"/>
-                <w:color w:val="000000"/>
-                <w:sz w:val="32"/>
-                <w:szCs w:val="40"/>
-                <w:lang w:val="it-IT"/>
-              </w:rPr>
-              <w:t xml:space="preserve">) </w:t>
-            </w:r>
-            <w:r>
-              <w:rPr>
-                <w:rFonts w:cs="BRH Malayalam Extra"/>
-                <w:color w:val="000000"/>
-                <w:szCs w:val="40"/>
-                <w:lang w:val="it-IT"/>
-              </w:rPr>
-              <w:t>1</w:t>
-            </w:r>
-            <w:r>
-              <w:rPr>
-                <w:rFonts w:ascii="BRH Malayalam Extra" w:hAnsi="BRH Malayalam Extra" w:cs="BRH Malayalam Extra"/>
-                <w:color w:val="000000"/>
-                <w:sz w:val="32"/>
-                <w:szCs w:val="40"/>
-                <w:lang w:val="it-IT"/>
-              </w:rPr>
-              <w:t>.</w:t>
-            </w:r>
-            <w:r>
-              <w:rPr>
-                <w:rFonts w:cs="BRH Malayalam Extra"/>
-                <w:color w:val="000000"/>
-                <w:szCs w:val="40"/>
-                <w:lang w:val="it-IT"/>
-              </w:rPr>
-              <w:t>2</w:t>
-            </w:r>
-            <w:r>
-              <w:rPr>
-                <w:rFonts w:ascii="BRH Malayalam Extra" w:hAnsi="BRH Malayalam Extra" w:cs="BRH Malayalam Extra"/>
-                <w:color w:val="000000"/>
-                <w:sz w:val="32"/>
-                <w:szCs w:val="40"/>
-                <w:lang w:val="it-IT"/>
-              </w:rPr>
-              <w:t>.</w:t>
-            </w:r>
-            <w:r>
-              <w:rPr>
-                <w:rFonts w:cs="BRH Malayalam Extra"/>
-                <w:color w:val="000000"/>
-                <w:szCs w:val="40"/>
-                <w:lang w:val="it-IT"/>
-              </w:rPr>
-              <w:t>5</w:t>
-            </w:r>
-            <w:r>
-              <w:rPr>
-                <w:rFonts w:ascii="BRH Malayalam Extra" w:hAnsi="BRH Malayalam Extra" w:cs="BRH Malayalam Extra"/>
-                <w:color w:val="000000"/>
-                <w:sz w:val="32"/>
-                <w:szCs w:val="40"/>
-                <w:lang w:val="it-IT"/>
-              </w:rPr>
-              <w:t>.</w:t>
-            </w:r>
-            <w:r>
-              <w:rPr>
-                <w:rFonts w:cs="BRH Malayalam Extra"/>
-                <w:color w:val="000000"/>
-                <w:szCs w:val="40"/>
-                <w:lang w:val="it-IT"/>
-              </w:rPr>
-              <w:t>2</w:t>
-            </w:r>
-            <w:r>
-              <w:rPr>
-                <w:rFonts w:ascii="BRH Malayalam Extra" w:hAnsi="BRH Malayalam Extra" w:cs="BRH Malayalam Extra"/>
-                <w:color w:val="000000"/>
-                <w:sz w:val="32"/>
-                <w:szCs w:val="40"/>
-                <w:lang w:val="it-IT"/>
-              </w:rPr>
-              <w:t>(</w:t>
-            </w:r>
-            <w:r>
-              <w:rPr>
-                <w:rFonts w:cs="BRH Malayalam Extra"/>
-                <w:color w:val="000000"/>
-                <w:szCs w:val="40"/>
-                <w:lang w:val="it-IT"/>
-              </w:rPr>
-              <w:t>24</w:t>
-            </w:r>
-            <w:r>
-              <w:rPr>
-                <w:rFonts w:ascii="BRH Malayalam Extra" w:hAnsi="BRH Malayalam Extra" w:cs="BRH Malayalam Extra"/>
-                <w:color w:val="000000"/>
-                <w:sz w:val="32"/>
-                <w:szCs w:val="40"/>
-                <w:lang w:val="it-IT"/>
-              </w:rPr>
-              <w:t xml:space="preserve">)- </w:t>
-            </w:r>
-            <w:r>
-              <w:rPr>
                 <w:rFonts w:ascii="BRH Malayalam Extra" w:hAnsi="BRH Malayalam Extra" w:cs="BRH Malayalam Extra"/>
                 <w:color w:val="000000"/>
                 <w:sz w:val="32"/>
@@ -3962,27 +3987,48 @@
                 <w:szCs w:val="40"/>
                 <w:lang w:val="it-IT"/>
               </w:rPr>
-              <w:t xml:space="preserve"> | A</w:t>
-            </w:r>
-            <w:r>
-              <w:rPr>
-                <w:rFonts w:ascii="BRH Malayalam Extra" w:hAnsi="BRH Malayalam Extra" w:cs="BRH Malayalam Extra"/>
-                <w:color w:val="000000"/>
-                <w:sz w:val="25"/>
-                <w:szCs w:val="40"/>
-                <w:lang w:val="it-IT"/>
-              </w:rPr>
-              <w:t>–</w:t>
-            </w:r>
-            <w:r>
-              <w:rPr>
-                <w:rFonts w:ascii="BRH Malayalam Extra" w:hAnsi="BRH Malayalam Extra" w:cs="BRH Malayalam Extra"/>
-                <w:color w:val="000000"/>
-                <w:sz w:val="32"/>
-                <w:szCs w:val="40"/>
-                <w:lang w:val="it-IT"/>
-              </w:rPr>
-              <w:t>tI |</w:t>
+              <w:t xml:space="preserve"> „t i</w:t>
+            </w:r>
+            <w:r>
+              <w:rPr>
+                <w:rFonts w:ascii="BRH Malayalam Extra" w:hAnsi="BRH Malayalam Extra" w:cs="BRH Malayalam Extra"/>
+                <w:color w:val="000000"/>
+                <w:sz w:val="25"/>
+                <w:szCs w:val="40"/>
+                <w:lang w:val="it-IT"/>
+              </w:rPr>
+              <w:t>–</w:t>
+            </w:r>
+            <w:r>
+              <w:rPr>
+                <w:rFonts w:ascii="BRH Malayalam Extra" w:hAnsi="BRH Malayalam Extra" w:cs="BRH Malayalam Extra"/>
+                <w:color w:val="000000"/>
+                <w:sz w:val="32"/>
+                <w:szCs w:val="40"/>
+                <w:lang w:val="it-IT"/>
+              </w:rPr>
+              <w:t xml:space="preserve">tI </w:t>
+            </w:r>
+            <w:r>
+              <w:rPr>
+                <w:rFonts w:ascii="BRH Malayalam Extra" w:hAnsi="BRH Malayalam Extra" w:cs="BRH Malayalam Extra"/>
+                <w:color w:val="000000"/>
+                <w:sz w:val="32"/>
+                <w:szCs w:val="40"/>
+                <w:highlight w:val="green"/>
+                <w:lang w:val="it-IT"/>
+              </w:rPr>
+              <w:t>ix ix</w:t>
+            </w:r>
+            <w:r>
+              <w:rPr>
+                <w:rFonts w:ascii="BRH Malayalam Extra" w:hAnsi="BRH Malayalam Extra" w:cs="BRH Malayalam Extra"/>
+                <w:color w:val="000000"/>
+                <w:sz w:val="32"/>
+                <w:szCs w:val="40"/>
+                <w:lang w:val="it-IT"/>
+              </w:rPr>
+              <w:t xml:space="preserve"> „tI | </w:t>
             </w:r>
           </w:p>
           <w:p>
@@ -3991,85 +4037,7 @@
               <w:autoSpaceDE w:val="0"/>
               <w:autoSpaceDN w:val="0"/>
               <w:adjustRightInd w:val="0"/>
-              <w:spacing w:line="240" w:lineRule="auto"/>
-              <w:rPr>
-                <w:rFonts w:ascii="BRH Malayalam Extra" w:hAnsi="BRH Malayalam Extra" w:cs="BRH Malayalam Extra"/>
-                <w:color w:val="000000"/>
-                <w:sz w:val="32"/>
-                <w:szCs w:val="40"/>
-                <w:lang w:val="it-IT"/>
-              </w:rPr>
-            </w:pPr>
-            <w:r>
-              <w:rPr>
-                <w:rFonts w:ascii="BRH Malayalam Extra" w:hAnsi="BRH Malayalam Extra" w:cs="BRH Malayalam Extra"/>
-                <w:color w:val="000000"/>
-                <w:sz w:val="32"/>
-                <w:szCs w:val="40"/>
-                <w:highlight w:val="green"/>
-                <w:lang w:val="it-IT"/>
-              </w:rPr>
-              <w:t>ix</w:t>
-            </w:r>
-            <w:r>
-              <w:rPr>
-                <w:rFonts w:ascii="BRH Malayalam Extra" w:hAnsi="BRH Malayalam Extra" w:cs="BRH Malayalam Extra"/>
-                <w:color w:val="000000"/>
-                <w:sz w:val="32"/>
-                <w:szCs w:val="40"/>
-                <w:lang w:val="it-IT"/>
-              </w:rPr>
-              <w:t xml:space="preserve"> „t i</w:t>
-            </w:r>
-            <w:r>
-              <w:rPr>
-                <w:rFonts w:ascii="BRH Malayalam Extra" w:hAnsi="BRH Malayalam Extra" w:cs="BRH Malayalam Extra"/>
-                <w:color w:val="000000"/>
-                <w:sz w:val="25"/>
-                <w:szCs w:val="40"/>
-                <w:lang w:val="it-IT"/>
-              </w:rPr>
-              <w:t>–</w:t>
-            </w:r>
-            <w:r>
-              <w:rPr>
-                <w:rFonts w:ascii="BRH Malayalam Extra" w:hAnsi="BRH Malayalam Extra" w:cs="BRH Malayalam Extra"/>
-                <w:color w:val="000000"/>
-                <w:sz w:val="32"/>
-                <w:szCs w:val="40"/>
-                <w:lang w:val="it-IT"/>
-              </w:rPr>
-              <w:t xml:space="preserve">tI </w:t>
-            </w:r>
-            <w:r>
-              <w:rPr>
-                <w:rFonts w:ascii="BRH Malayalam Extra" w:hAnsi="BRH Malayalam Extra" w:cs="BRH Malayalam Extra"/>
-                <w:color w:val="000000"/>
-                <w:sz w:val="32"/>
-                <w:szCs w:val="40"/>
-                <w:highlight w:val="green"/>
-                <w:lang w:val="it-IT"/>
-              </w:rPr>
-              <w:t>ix ix</w:t>
-            </w:r>
-            <w:r>
-              <w:rPr>
-                <w:rFonts w:ascii="BRH Malayalam Extra" w:hAnsi="BRH Malayalam Extra" w:cs="BRH Malayalam Extra"/>
-                <w:color w:val="000000"/>
-                <w:sz w:val="32"/>
-                <w:szCs w:val="40"/>
-                <w:lang w:val="it-IT"/>
-              </w:rPr>
-              <w:t xml:space="preserve"> „tI | </w:t>
-            </w:r>
-          </w:p>
-          <w:p>
-            <w:pPr>
-              <w:widowControl w:val="0"/>
-              <w:autoSpaceDE w:val="0"/>
-              <w:autoSpaceDN w:val="0"/>
-              <w:adjustRightInd w:val="0"/>
-              <w:spacing w:line="240" w:lineRule="auto"/>
+              <w:spacing w:before="0" w:line="240" w:lineRule="auto"/>
               <w:rPr>
                 <w:rFonts w:cs="BRH Malayalam Extra"/>
                 <w:color w:val="000000"/>
@@ -4091,161 +4059,14 @@
               <w:autoSpaceDE w:val="0"/>
               <w:autoSpaceDN w:val="0"/>
               <w:adjustRightInd w:val="0"/>
-              <w:spacing w:line="240" w:lineRule="auto"/>
-              <w:rPr>
-                <w:rFonts w:ascii="BRH Malayalam Extra" w:hAnsi="BRH Malayalam Extra" w:cs="BRH Malayalam Extra"/>
-                <w:color w:val="000000"/>
-                <w:sz w:val="32"/>
+              <w:spacing w:before="0" w:line="240" w:lineRule="auto"/>
+              <w:rPr>
+                <w:rFonts w:cs="BRH Malayalam Extra"/>
+                <w:color w:val="000000"/>
                 <w:szCs w:val="40"/>
                 <w:lang w:val="it-IT"/>
               </w:rPr>
             </w:pPr>
-            <w:r>
-              <w:rPr>
-                <w:rFonts w:cs="BRH Malayalam Extra"/>
-                <w:color w:val="000000"/>
-                <w:szCs w:val="40"/>
-                <w:lang w:val="it-IT"/>
-              </w:rPr>
-              <w:lastRenderedPageBreak/>
-              <w:t>38</w:t>
-            </w:r>
-            <w:r>
-              <w:rPr>
-                <w:rFonts w:ascii="BRH Malayalam Extra" w:hAnsi="BRH Malayalam Extra" w:cs="BRH Malayalam Extra"/>
-                <w:color w:val="000000"/>
-                <w:sz w:val="32"/>
-                <w:szCs w:val="40"/>
-                <w:lang w:val="it-IT"/>
-              </w:rPr>
-              <w:t xml:space="preserve">) </w:t>
-            </w:r>
-            <w:r>
-              <w:rPr>
-                <w:rFonts w:cs="BRH Malayalam Extra"/>
-                <w:color w:val="000000"/>
-                <w:szCs w:val="40"/>
-                <w:lang w:val="it-IT"/>
-              </w:rPr>
-              <w:t>1</w:t>
-            </w:r>
-            <w:r>
-              <w:rPr>
-                <w:rFonts w:ascii="BRH Malayalam Extra" w:hAnsi="BRH Malayalam Extra" w:cs="BRH Malayalam Extra"/>
-                <w:color w:val="000000"/>
-                <w:sz w:val="32"/>
-                <w:szCs w:val="40"/>
-                <w:lang w:val="it-IT"/>
-              </w:rPr>
-              <w:t>.</w:t>
-            </w:r>
-            <w:r>
-              <w:rPr>
-                <w:rFonts w:cs="BRH Malayalam Extra"/>
-                <w:color w:val="000000"/>
-                <w:szCs w:val="40"/>
-                <w:lang w:val="it-IT"/>
-              </w:rPr>
-              <w:t>2</w:t>
-            </w:r>
-            <w:r>
-              <w:rPr>
-                <w:rFonts w:ascii="BRH Malayalam Extra" w:hAnsi="BRH Malayalam Extra" w:cs="BRH Malayalam Extra"/>
-                <w:color w:val="000000"/>
-                <w:sz w:val="32"/>
-                <w:szCs w:val="40"/>
-                <w:lang w:val="it-IT"/>
-              </w:rPr>
-              <w:t>.</w:t>
-            </w:r>
-            <w:r>
-              <w:rPr>
-                <w:rFonts w:cs="BRH Malayalam Extra"/>
-                <w:color w:val="000000"/>
-                <w:szCs w:val="40"/>
-                <w:lang w:val="it-IT"/>
-              </w:rPr>
-              <w:t>9</w:t>
-            </w:r>
-            <w:r>
-              <w:rPr>
-                <w:rFonts w:ascii="BRH Malayalam Extra" w:hAnsi="BRH Malayalam Extra" w:cs="BRH Malayalam Extra"/>
-                <w:color w:val="000000"/>
-                <w:sz w:val="32"/>
-                <w:szCs w:val="40"/>
-                <w:lang w:val="it-IT"/>
-              </w:rPr>
-              <w:t>.</w:t>
-            </w:r>
-            <w:r>
-              <w:rPr>
-                <w:rFonts w:cs="BRH Malayalam Extra"/>
-                <w:color w:val="000000"/>
-                <w:szCs w:val="40"/>
-                <w:lang w:val="it-IT"/>
-              </w:rPr>
-              <w:t>1</w:t>
-            </w:r>
-            <w:r>
-              <w:rPr>
-                <w:rFonts w:ascii="BRH Malayalam Extra" w:hAnsi="BRH Malayalam Extra" w:cs="BRH Malayalam Extra"/>
-                <w:color w:val="000000"/>
-                <w:sz w:val="32"/>
-                <w:szCs w:val="40"/>
-                <w:lang w:val="it-IT"/>
-              </w:rPr>
-              <w:t>(</w:t>
-            </w:r>
-            <w:r>
-              <w:rPr>
-                <w:rFonts w:cs="BRH Malayalam Extra"/>
-                <w:color w:val="000000"/>
-                <w:szCs w:val="40"/>
-                <w:lang w:val="it-IT"/>
-              </w:rPr>
-              <w:t>34</w:t>
-            </w:r>
-            <w:r>
-              <w:rPr>
-                <w:rFonts w:ascii="BRH Malayalam Extra" w:hAnsi="BRH Malayalam Extra" w:cs="BRH Malayalam Extra"/>
-                <w:color w:val="000000"/>
-                <w:sz w:val="32"/>
-                <w:szCs w:val="40"/>
-                <w:lang w:val="it-IT"/>
-              </w:rPr>
-              <w:t>)- jR—ixdsõ | sû</w:t>
-            </w:r>
-            <w:r>
-              <w:rPr>
-                <w:rFonts w:ascii="BRH Malayalam Extra" w:hAnsi="BRH Malayalam Extra" w:cs="BRH Malayalam Extra"/>
-                <w:color w:val="000000"/>
-                <w:sz w:val="25"/>
-                <w:szCs w:val="40"/>
-                <w:lang w:val="it-IT"/>
-              </w:rPr>
-              <w:t>–</w:t>
-            </w:r>
-            <w:r>
-              <w:rPr>
-                <w:rFonts w:ascii="BRH Malayalam Extra" w:hAnsi="BRH Malayalam Extra" w:cs="BRH Malayalam Extra"/>
-                <w:color w:val="000000"/>
-                <w:sz w:val="32"/>
-                <w:szCs w:val="40"/>
-                <w:highlight w:val="yellow"/>
-                <w:lang w:val="it-IT"/>
-              </w:rPr>
-              <w:t>sëõ</w:t>
-            </w:r>
-            <w:r>
-              <w:rPr>
-                <w:rFonts w:ascii="BRH Malayalam Extra" w:hAnsi="BRH Malayalam Extra" w:cs="BRH Malayalam Extra"/>
-                <w:color w:val="000000"/>
-                <w:sz w:val="32"/>
-                <w:szCs w:val="40"/>
-                <w:lang w:val="it-IT"/>
-              </w:rPr>
-              <w:t>—jdz |</w:t>
-            </w:r>
           </w:p>
           <w:p>
             <w:pPr>
@@ -4253,159 +4074,14 @@
               <w:autoSpaceDE w:val="0"/>
               <w:autoSpaceDN w:val="0"/>
               <w:adjustRightInd w:val="0"/>
-              <w:spacing w:line="240" w:lineRule="auto"/>
-              <w:ind w:right="-234"/>
-              <w:rPr>
-                <w:rFonts w:ascii="BRH Malayalam Extra" w:hAnsi="BRH Malayalam Extra" w:cs="BRH Malayalam Extra"/>
-                <w:color w:val="000000"/>
-                <w:sz w:val="32"/>
+              <w:spacing w:before="0" w:line="240" w:lineRule="auto"/>
+              <w:rPr>
+                <w:rFonts w:cs="BRH Malayalam Extra"/>
+                <w:color w:val="000000"/>
                 <w:szCs w:val="40"/>
                 <w:lang w:val="it-IT"/>
               </w:rPr>
             </w:pPr>
-            <w:r>
-              <w:rPr>
-                <w:rFonts w:ascii="BRH Malayalam Extra" w:hAnsi="BRH Malayalam Extra" w:cs="BRH Malayalam Extra"/>
-                <w:color w:val="000000"/>
-                <w:sz w:val="32"/>
-                <w:szCs w:val="40"/>
-                <w:lang w:val="it-IT"/>
-              </w:rPr>
-              <w:t>jR—ixdsõ sû</w:t>
-            </w:r>
-            <w:r>
-              <w:rPr>
-                <w:rFonts w:ascii="BRH Malayalam Extra" w:hAnsi="BRH Malayalam Extra" w:cs="BRH Malayalam Extra"/>
-                <w:color w:val="000000"/>
-                <w:sz w:val="25"/>
-                <w:szCs w:val="40"/>
-                <w:lang w:val="it-IT"/>
-              </w:rPr>
-              <w:t>–</w:t>
-            </w:r>
-            <w:r>
-              <w:rPr>
-                <w:rFonts w:ascii="BRH Malayalam Extra" w:hAnsi="BRH Malayalam Extra" w:cs="BRH Malayalam Extra"/>
-                <w:color w:val="000000"/>
-                <w:sz w:val="32"/>
-                <w:szCs w:val="40"/>
-                <w:highlight w:val="yellow"/>
-                <w:lang w:val="it-IT"/>
-              </w:rPr>
-              <w:t>sëõ—</w:t>
-            </w:r>
-            <w:r>
-              <w:rPr>
-                <w:rFonts w:ascii="BRH Malayalam Extra" w:hAnsi="BRH Malayalam Extra" w:cs="BRH Malayalam Extra"/>
-                <w:color w:val="000000"/>
-                <w:sz w:val="32"/>
-                <w:szCs w:val="40"/>
-                <w:lang w:val="it-IT"/>
-              </w:rPr>
-              <w:t>jdz sû</w:t>
-            </w:r>
-            <w:r>
-              <w:rPr>
-                <w:rFonts w:ascii="BRH Malayalam Extra" w:hAnsi="BRH Malayalam Extra" w:cs="BRH Malayalam Extra"/>
-                <w:color w:val="000000"/>
-                <w:sz w:val="25"/>
-                <w:szCs w:val="40"/>
-                <w:lang w:val="it-IT"/>
-              </w:rPr>
-              <w:t>–</w:t>
-            </w:r>
-            <w:r>
-              <w:rPr>
-                <w:rFonts w:ascii="BRH Malayalam Extra" w:hAnsi="BRH Malayalam Extra" w:cs="BRH Malayalam Extra"/>
-                <w:color w:val="000000"/>
-                <w:sz w:val="32"/>
-                <w:szCs w:val="40"/>
-                <w:highlight w:val="yellow"/>
-                <w:lang w:val="it-IT"/>
-              </w:rPr>
-              <w:t>sëõ</w:t>
-            </w:r>
-            <w:r>
-              <w:rPr>
-                <w:rFonts w:ascii="BRH Malayalam Extra" w:hAnsi="BRH Malayalam Extra" w:cs="BRH Malayalam Extra"/>
-                <w:color w:val="000000"/>
-                <w:sz w:val="32"/>
-                <w:szCs w:val="40"/>
-                <w:lang w:val="it-IT"/>
-              </w:rPr>
-              <w:t>—jdz</w:t>
-            </w:r>
-            <w:r>
-              <w:rPr>
-                <w:rFonts w:ascii="BRH Malayalam Extra" w:hAnsi="BRH Malayalam Extra" w:cs="BRH Malayalam Extra"/>
-                <w:color w:val="000000"/>
-                <w:sz w:val="25"/>
-                <w:szCs w:val="40"/>
-                <w:lang w:val="it-IT"/>
-              </w:rPr>
-              <w:t>–</w:t>
-            </w:r>
-            <w:r>
-              <w:rPr>
-                <w:rFonts w:ascii="BRH Malayalam Extra" w:hAnsi="BRH Malayalam Extra" w:cs="BRH Malayalam Extra"/>
-                <w:color w:val="000000"/>
-                <w:sz w:val="32"/>
-                <w:szCs w:val="40"/>
-                <w:lang w:val="it-IT"/>
-              </w:rPr>
-              <w:t xml:space="preserve"> jR—ixdsõ</w:t>
-            </w:r>
-            <w:r>
-              <w:rPr>
-                <w:rFonts w:ascii="BRH Malayalam Extra" w:hAnsi="BRH Malayalam Extra" w:cs="BRH Malayalam Extra"/>
-                <w:color w:val="000000"/>
-                <w:sz w:val="25"/>
-                <w:szCs w:val="40"/>
-                <w:lang w:val="it-IT"/>
-              </w:rPr>
-              <w:t>–</w:t>
-            </w:r>
-            <w:r>
-              <w:rPr>
-                <w:rFonts w:ascii="BRH Malayalam Extra" w:hAnsi="BRH Malayalam Extra" w:cs="BRH Malayalam Extra"/>
-                <w:color w:val="000000"/>
-                <w:sz w:val="32"/>
-                <w:szCs w:val="40"/>
-                <w:lang w:val="it-IT"/>
-              </w:rPr>
-              <w:t xml:space="preserve"> jR—ixdsõ sû</w:t>
-            </w:r>
-            <w:r>
-              <w:rPr>
-                <w:rFonts w:ascii="BRH Malayalam Extra" w:hAnsi="BRH Malayalam Extra" w:cs="BRH Malayalam Extra"/>
-                <w:color w:val="000000"/>
-                <w:sz w:val="25"/>
-                <w:szCs w:val="40"/>
-                <w:lang w:val="it-IT"/>
-              </w:rPr>
-              <w:t>–</w:t>
-            </w:r>
-            <w:r>
-              <w:rPr>
-                <w:rFonts w:ascii="BRH Malayalam Extra" w:hAnsi="BRH Malayalam Extra" w:cs="BRH Malayalam Extra"/>
-                <w:color w:val="000000"/>
-                <w:sz w:val="32"/>
-                <w:szCs w:val="40"/>
-                <w:highlight w:val="yellow"/>
-                <w:lang w:val="it-IT"/>
-              </w:rPr>
-              <w:t>sëõ—</w:t>
-            </w:r>
-            <w:r>
-              <w:rPr>
-                <w:rFonts w:ascii="BRH Malayalam Extra" w:hAnsi="BRH Malayalam Extra" w:cs="BRH Malayalam Extra"/>
-                <w:color w:val="000000"/>
-                <w:sz w:val="32"/>
-                <w:szCs w:val="40"/>
-                <w:lang w:val="it-IT"/>
-              </w:rPr>
-              <w:t xml:space="preserve">jdz | </w:t>
-            </w:r>
           </w:p>
           <w:p>
             <w:pPr>
@@ -4413,12 +4089,13 @@
               <w:autoSpaceDE w:val="0"/>
               <w:autoSpaceDN w:val="0"/>
               <w:adjustRightInd w:val="0"/>
-              <w:spacing w:line="240" w:lineRule="auto"/>
-              <w:rPr>
-                <w:rFonts w:ascii="BRH Malayalam Extra" w:hAnsi="BRH Malayalam Extra" w:cs="BRH Malayalam Extra"/>
-                <w:color w:val="000000"/>
-                <w:sz w:val="32"/>
-                <w:szCs w:val="40"/>
+              <w:spacing w:before="0" w:line="240" w:lineRule="auto"/>
+              <w:rPr>
+                <w:rFonts w:ascii="BRH Malayalam Extra" w:hAnsi="BRH Malayalam Extra" w:cs="BRH Malayalam Extra"/>
+                <w:color w:val="000000"/>
+                <w:sz w:val="32"/>
+                <w:szCs w:val="40"/>
+                <w:lang w:val="it-IT"/>
               </w:rPr>
             </w:pPr>
             <w:r>
@@ -4426,15 +4103,18 @@
                 <w:rFonts w:cs="BRH Malayalam Extra"/>
                 <w:color w:val="000000"/>
                 <w:szCs w:val="40"/>
-              </w:rPr>
-              <w:t>39</w:t>
-            </w:r>
-            <w:r>
-              <w:rPr>
-                <w:rFonts w:ascii="BRH Malayalam Extra" w:hAnsi="BRH Malayalam Extra" w:cs="BRH Malayalam Extra"/>
-                <w:color w:val="000000"/>
-                <w:sz w:val="32"/>
-                <w:szCs w:val="40"/>
+                <w:lang w:val="it-IT"/>
+              </w:rPr>
+              <w:lastRenderedPageBreak/>
+              <w:t>38</w:t>
+            </w:r>
+            <w:r>
+              <w:rPr>
+                <w:rFonts w:ascii="BRH Malayalam Extra" w:hAnsi="BRH Malayalam Extra" w:cs="BRH Malayalam Extra"/>
+                <w:color w:val="000000"/>
+                <w:sz w:val="32"/>
+                <w:szCs w:val="40"/>
+                <w:lang w:val="it-IT"/>
               </w:rPr>
               <w:t xml:space="preserve">) </w:t>
             </w:r>
@@ -4443,6 +4123,7 @@
                 <w:rFonts w:cs="BRH Malayalam Extra"/>
                 <w:color w:val="000000"/>
                 <w:szCs w:val="40"/>
+                <w:lang w:val="it-IT"/>
               </w:rPr>
               <w:t>1</w:t>
             </w:r>
@@ -4452,6 +4133,7 @@
                 <w:color w:val="000000"/>
                 <w:sz w:val="32"/>
                 <w:szCs w:val="40"/>
+                <w:lang w:val="it-IT"/>
               </w:rPr>
               <w:t>.</w:t>
             </w:r>
@@ -4460,6 +4142,7 @@
                 <w:rFonts w:cs="BRH Malayalam Extra"/>
                 <w:color w:val="000000"/>
                 <w:szCs w:val="40"/>
+                <w:lang w:val="it-IT"/>
               </w:rPr>
               <w:t>2</w:t>
             </w:r>
@@ -4469,6 +4152,7 @@
                 <w:color w:val="000000"/>
                 <w:sz w:val="32"/>
                 <w:szCs w:val="40"/>
+                <w:lang w:val="it-IT"/>
               </w:rPr>
               <w:t>.</w:t>
             </w:r>
@@ -4477,6 +4161,7 @@
                 <w:rFonts w:cs="BRH Malayalam Extra"/>
                 <w:color w:val="000000"/>
                 <w:szCs w:val="40"/>
+                <w:lang w:val="it-IT"/>
               </w:rPr>
               <w:t>9</w:t>
             </w:r>
@@ -4486,6 +4171,7 @@
                 <w:color w:val="000000"/>
                 <w:sz w:val="32"/>
                 <w:szCs w:val="40"/>
+                <w:lang w:val="it-IT"/>
               </w:rPr>
               <w:t>.</w:t>
             </w:r>
@@ -4494,6 +4180,7 @@
                 <w:rFonts w:cs="BRH Malayalam Extra"/>
                 <w:color w:val="000000"/>
                 <w:szCs w:val="40"/>
+                <w:lang w:val="it-IT"/>
               </w:rPr>
               <w:t>1</w:t>
             </w:r>
@@ -4503,6 +4190,7 @@
                 <w:color w:val="000000"/>
                 <w:sz w:val="32"/>
                 <w:szCs w:val="40"/>
+                <w:lang w:val="it-IT"/>
               </w:rPr>
               <w:t>(</w:t>
             </w:r>
@@ -4511,24 +4199,27 @@
                 <w:rFonts w:cs="BRH Malayalam Extra"/>
                 <w:color w:val="000000"/>
                 <w:szCs w:val="40"/>
-              </w:rPr>
-              <w:t>35</w:t>
-            </w:r>
-            <w:r>
-              <w:rPr>
-                <w:rFonts w:ascii="BRH Malayalam Extra" w:hAnsi="BRH Malayalam Extra" w:cs="BRH Malayalam Extra"/>
-                <w:color w:val="000000"/>
-                <w:sz w:val="32"/>
-                <w:szCs w:val="40"/>
-              </w:rPr>
-              <w:t>)- sû</w:t>
-            </w:r>
-            <w:r>
-              <w:rPr>
-                <w:rFonts w:ascii="BRH Malayalam Extra" w:hAnsi="BRH Malayalam Extra" w:cs="BRH Malayalam Extra"/>
-                <w:color w:val="000000"/>
-                <w:sz w:val="25"/>
-                <w:szCs w:val="40"/>
+                <w:lang w:val="it-IT"/>
+              </w:rPr>
+              <w:t>34</w:t>
+            </w:r>
+            <w:r>
+              <w:rPr>
+                <w:rFonts w:ascii="BRH Malayalam Extra" w:hAnsi="BRH Malayalam Extra" w:cs="BRH Malayalam Extra"/>
+                <w:color w:val="000000"/>
+                <w:sz w:val="32"/>
+                <w:szCs w:val="40"/>
+                <w:lang w:val="it-IT"/>
+              </w:rPr>
+              <w:t>)- jR—ixdsõ | sû</w:t>
+            </w:r>
+            <w:r>
+              <w:rPr>
+                <w:rFonts w:ascii="BRH Malayalam Extra" w:hAnsi="BRH Malayalam Extra" w:cs="BRH Malayalam Extra"/>
+                <w:color w:val="000000"/>
+                <w:sz w:val="25"/>
+                <w:szCs w:val="40"/>
+                <w:lang w:val="it-IT"/>
               </w:rPr>
               <w:t>–</w:t>
             </w:r>
@@ -4539,6 +4230,7 @@
                 <w:sz w:val="32"/>
                 <w:szCs w:val="40"/>
                 <w:highlight w:val="yellow"/>
+                <w:lang w:val="it-IT"/>
               </w:rPr>
               <w:t>sëõ</w:t>
             </w:r>
@@ -4548,44 +4240,9 @@
                 <w:color w:val="000000"/>
                 <w:sz w:val="32"/>
                 <w:szCs w:val="40"/>
-              </w:rPr>
-              <w:t>—jdz | A</w:t>
-            </w:r>
-            <w:r>
-              <w:rPr>
-                <w:rFonts w:ascii="BRH Malayalam Extra" w:hAnsi="BRH Malayalam Extra" w:cs="BRH Malayalam Extra"/>
-                <w:color w:val="000000"/>
-                <w:sz w:val="25"/>
-                <w:szCs w:val="40"/>
-              </w:rPr>
-              <w:t>–</w:t>
-            </w:r>
-            <w:r>
-              <w:rPr>
-                <w:rFonts w:ascii="BRH Malayalam Extra" w:hAnsi="BRH Malayalam Extra" w:cs="BRH Malayalam Extra"/>
-                <w:color w:val="000000"/>
-                <w:sz w:val="32"/>
-                <w:szCs w:val="40"/>
-              </w:rPr>
-              <w:t>sy</w:t>
-            </w:r>
-            <w:r>
-              <w:rPr>
-                <w:rFonts w:ascii="BRH Malayalam Extra" w:hAnsi="BRH Malayalam Extra" w:cs="BRH Malayalam Extra"/>
-                <w:color w:val="000000"/>
-                <w:sz w:val="25"/>
-                <w:szCs w:val="40"/>
-              </w:rPr>
-              <w:t>–</w:t>
-            </w:r>
-            <w:r>
-              <w:rPr>
-                <w:rFonts w:ascii="BRH Malayalam Extra" w:hAnsi="BRH Malayalam Extra" w:cs="BRH Malayalam Extra"/>
-                <w:color w:val="000000"/>
-                <w:sz w:val="32"/>
-                <w:szCs w:val="40"/>
-              </w:rPr>
-              <w:t xml:space="preserve"> |</w:t>
+                <w:lang w:val="it-IT"/>
+              </w:rPr>
+              <w:t>—jdz |</w:t>
             </w:r>
           </w:p>
           <w:p>
@@ -4594,12 +4251,14 @@
               <w:autoSpaceDE w:val="0"/>
               <w:autoSpaceDN w:val="0"/>
               <w:adjustRightInd w:val="0"/>
-              <w:spacing w:line="240" w:lineRule="auto"/>
-              <w:rPr>
-                <w:rFonts w:ascii="BRH Malayalam Extra" w:hAnsi="BRH Malayalam Extra" w:cs="BRH Malayalam Extra"/>
-                <w:color w:val="000000"/>
-                <w:sz w:val="32"/>
-                <w:szCs w:val="40"/>
+              <w:spacing w:before="0" w:line="240" w:lineRule="auto"/>
+              <w:ind w:right="-234"/>
+              <w:rPr>
+                <w:rFonts w:ascii="BRH Malayalam Extra" w:hAnsi="BRH Malayalam Extra" w:cs="BRH Malayalam Extra"/>
+                <w:color w:val="000000"/>
+                <w:sz w:val="32"/>
+                <w:szCs w:val="40"/>
+                <w:lang w:val="it-IT"/>
               </w:rPr>
             </w:pPr>
             <w:r>
@@ -4608,15 +4267,17 @@
                 <w:color w:val="000000"/>
                 <w:sz w:val="32"/>
                 <w:szCs w:val="40"/>
-              </w:rPr>
-              <w:t>sû</w:t>
-            </w:r>
-            <w:r>
-              <w:rPr>
-                <w:rFonts w:ascii="BRH Malayalam Extra" w:hAnsi="BRH Malayalam Extra" w:cs="BRH Malayalam Extra"/>
-                <w:color w:val="000000"/>
-                <w:sz w:val="25"/>
-                <w:szCs w:val="40"/>
+                <w:lang w:val="it-IT"/>
+              </w:rPr>
+              <w:t>jR—ixdsõ sû</w:t>
+            </w:r>
+            <w:r>
+              <w:rPr>
+                <w:rFonts w:ascii="BRH Malayalam Extra" w:hAnsi="BRH Malayalam Extra" w:cs="BRH Malayalam Extra"/>
+                <w:color w:val="000000"/>
+                <w:sz w:val="25"/>
+                <w:szCs w:val="40"/>
+                <w:lang w:val="it-IT"/>
               </w:rPr>
               <w:t>–</w:t>
             </w:r>
@@ -4627,6 +4288,7 @@
                 <w:sz w:val="32"/>
                 <w:szCs w:val="40"/>
                 <w:highlight w:val="yellow"/>
+                <w:lang w:val="it-IT"/>
               </w:rPr>
               <w:t>sëõ—</w:t>
             </w:r>
@@ -4636,15 +4298,17 @@
                 <w:color w:val="000000"/>
                 <w:sz w:val="32"/>
                 <w:szCs w:val="40"/>
-              </w:rPr>
-              <w:t>j dõsõsy sû</w:t>
-            </w:r>
-            <w:r>
-              <w:rPr>
-                <w:rFonts w:ascii="BRH Malayalam Extra" w:hAnsi="BRH Malayalam Extra" w:cs="BRH Malayalam Extra"/>
-                <w:color w:val="000000"/>
-                <w:sz w:val="25"/>
-                <w:szCs w:val="40"/>
+                <w:lang w:val="it-IT"/>
+              </w:rPr>
+              <w:t>jdz sû</w:t>
+            </w:r>
+            <w:r>
+              <w:rPr>
+                <w:rFonts w:ascii="BRH Malayalam Extra" w:hAnsi="BRH Malayalam Extra" w:cs="BRH Malayalam Extra"/>
+                <w:color w:val="000000"/>
+                <w:sz w:val="25"/>
+                <w:szCs w:val="40"/>
+                <w:lang w:val="it-IT"/>
               </w:rPr>
               <w:t>–</w:t>
             </w:r>
@@ -4655,6 +4319,7 @@
                 <w:sz w:val="32"/>
                 <w:szCs w:val="40"/>
                 <w:highlight w:val="yellow"/>
+                <w:lang w:val="it-IT"/>
               </w:rPr>
               <w:t>sëõ</w:t>
             </w:r>
@@ -4664,15 +4329,57 @@
                 <w:color w:val="000000"/>
                 <w:sz w:val="32"/>
                 <w:szCs w:val="40"/>
-              </w:rPr>
-              <w:t>—jdz sû</w:t>
-            </w:r>
-            <w:r>
-              <w:rPr>
-                <w:rFonts w:ascii="BRH Malayalam Extra" w:hAnsi="BRH Malayalam Extra" w:cs="BRH Malayalam Extra"/>
-                <w:color w:val="000000"/>
-                <w:sz w:val="25"/>
-                <w:szCs w:val="40"/>
+                <w:lang w:val="it-IT"/>
+              </w:rPr>
+              <w:t>—jdz</w:t>
+            </w:r>
+            <w:r>
+              <w:rPr>
+                <w:rFonts w:ascii="BRH Malayalam Extra" w:hAnsi="BRH Malayalam Extra" w:cs="BRH Malayalam Extra"/>
+                <w:color w:val="000000"/>
+                <w:sz w:val="25"/>
+                <w:szCs w:val="40"/>
+                <w:lang w:val="it-IT"/>
+              </w:rPr>
+              <w:t>–</w:t>
+            </w:r>
+            <w:r>
+              <w:rPr>
+                <w:rFonts w:ascii="BRH Malayalam Extra" w:hAnsi="BRH Malayalam Extra" w:cs="BRH Malayalam Extra"/>
+                <w:color w:val="000000"/>
+                <w:sz w:val="32"/>
+                <w:szCs w:val="40"/>
+                <w:lang w:val="it-IT"/>
+              </w:rPr>
+              <w:t xml:space="preserve"> jR—ixdsõ</w:t>
+            </w:r>
+            <w:r>
+              <w:rPr>
+                <w:rFonts w:ascii="BRH Malayalam Extra" w:hAnsi="BRH Malayalam Extra" w:cs="BRH Malayalam Extra"/>
+                <w:color w:val="000000"/>
+                <w:sz w:val="25"/>
+                <w:szCs w:val="40"/>
+                <w:lang w:val="it-IT"/>
+              </w:rPr>
+              <w:t>–</w:t>
+            </w:r>
+            <w:r>
+              <w:rPr>
+                <w:rFonts w:ascii="BRH Malayalam Extra" w:hAnsi="BRH Malayalam Extra" w:cs="BRH Malayalam Extra"/>
+                <w:color w:val="000000"/>
+                <w:sz w:val="32"/>
+                <w:szCs w:val="40"/>
+                <w:lang w:val="it-IT"/>
+              </w:rPr>
+              <w:t xml:space="preserve"> jR—ixdsõ sû</w:t>
+            </w:r>
+            <w:r>
+              <w:rPr>
+                <w:rFonts w:ascii="BRH Malayalam Extra" w:hAnsi="BRH Malayalam Extra" w:cs="BRH Malayalam Extra"/>
+                <w:color w:val="000000"/>
+                <w:sz w:val="25"/>
+                <w:szCs w:val="40"/>
+                <w:lang w:val="it-IT"/>
               </w:rPr>
               <w:t>–</w:t>
             </w:r>
@@ -4683,6 +4390,7 @@
                 <w:sz w:val="32"/>
                 <w:szCs w:val="40"/>
                 <w:highlight w:val="yellow"/>
+                <w:lang w:val="it-IT"/>
               </w:rPr>
               <w:t>sëõ—</w:t>
             </w:r>
@@ -4692,8 +4400,9 @@
                 <w:color w:val="000000"/>
                 <w:sz w:val="32"/>
                 <w:szCs w:val="40"/>
-              </w:rPr>
-              <w:t xml:space="preserve">j dõsy | </w:t>
+                <w:lang w:val="it-IT"/>
+              </w:rPr>
+              <w:t xml:space="preserve">jdz | </w:t>
             </w:r>
           </w:p>
           <w:p>
@@ -4702,7 +4411,7 @@
               <w:autoSpaceDE w:val="0"/>
               <w:autoSpaceDN w:val="0"/>
               <w:adjustRightInd w:val="0"/>
-              <w:spacing w:line="240" w:lineRule="auto"/>
+              <w:spacing w:before="0" w:line="240" w:lineRule="auto"/>
               <w:rPr>
                 <w:rFonts w:ascii="BRH Malayalam Extra" w:hAnsi="BRH Malayalam Extra" w:cs="BRH Malayalam Extra"/>
                 <w:color w:val="000000"/>
@@ -4716,7 +4425,7 @@
                 <w:color w:val="000000"/>
                 <w:szCs w:val="40"/>
               </w:rPr>
-              <w:t>40</w:t>
+              <w:t>39</w:t>
             </w:r>
             <w:r>
               <w:rPr>
@@ -4838,7 +4547,43 @@
                 <w:sz w:val="32"/>
                 <w:szCs w:val="40"/>
               </w:rPr>
-              <w:t>—jdz |</w:t>
+              <w:t>—jdz | A</w:t>
+            </w:r>
+            <w:r>
+              <w:rPr>
+                <w:rFonts w:ascii="BRH Malayalam Extra" w:hAnsi="BRH Malayalam Extra" w:cs="BRH Malayalam Extra"/>
+                <w:color w:val="000000"/>
+                <w:sz w:val="25"/>
+                <w:szCs w:val="40"/>
+              </w:rPr>
+              <w:t>–</w:t>
+            </w:r>
+            <w:r>
+              <w:rPr>
+                <w:rFonts w:ascii="BRH Malayalam Extra" w:hAnsi="BRH Malayalam Extra" w:cs="BRH Malayalam Extra"/>
+                <w:color w:val="000000"/>
+                <w:sz w:val="32"/>
+                <w:szCs w:val="40"/>
+              </w:rPr>
+              <w:t>sy</w:t>
+            </w:r>
+            <w:r>
+              <w:rPr>
+                <w:rFonts w:ascii="BRH Malayalam Extra" w:hAnsi="BRH Malayalam Extra" w:cs="BRH Malayalam Extra"/>
+                <w:color w:val="000000"/>
+                <w:sz w:val="25"/>
+                <w:szCs w:val="40"/>
+              </w:rPr>
+              <w:t>–</w:t>
+            </w:r>
+            <w:r>
+              <w:rPr>
+                <w:rFonts w:ascii="BRH Malayalam Extra" w:hAnsi="BRH Malayalam Extra" w:cs="BRH Malayalam Extra"/>
+                <w:color w:val="000000"/>
+                <w:sz w:val="32"/>
+                <w:szCs w:val="40"/>
+              </w:rPr>
+              <w:t xml:space="preserve"> |</w:t>
             </w:r>
           </w:p>
           <w:p>
@@ -4847,7 +4592,7 @@
               <w:autoSpaceDE w:val="0"/>
               <w:autoSpaceDN w:val="0"/>
               <w:adjustRightInd w:val="0"/>
-              <w:spacing w:line="240" w:lineRule="auto"/>
+              <w:spacing w:before="0" w:line="240" w:lineRule="auto"/>
               <w:rPr>
                 <w:rFonts w:ascii="BRH Malayalam Extra" w:hAnsi="BRH Malayalam Extra" w:cs="BRH Malayalam Extra"/>
                 <w:color w:val="000000"/>
@@ -4879,26 +4624,74 @@
                 <w:color w:val="000000"/>
                 <w:sz w:val="32"/>
                 <w:szCs w:val="40"/>
-              </w:rPr>
-              <w:t>sëõj</w:t>
-            </w:r>
-            <w:r>
-              <w:rPr>
-                <w:rFonts w:ascii="BRH Malayalam Extra" w:hAnsi="BRH Malayalam Extra" w:cs="BRH Malayalam Extra"/>
-                <w:color w:val="000000"/>
-                <w:sz w:val="25"/>
-                <w:szCs w:val="40"/>
-              </w:rPr>
-              <w:t>–</w:t>
-            </w:r>
-            <w:r>
-              <w:rPr>
-                <w:rFonts w:ascii="BRH Malayalam Extra" w:hAnsi="BRH Malayalam Extra" w:cs="BRH Malayalam Extra"/>
-                <w:color w:val="000000"/>
-                <w:sz w:val="32"/>
-                <w:szCs w:val="40"/>
-              </w:rPr>
-              <w:t xml:space="preserve">dzZy— sûsëy - Aj—dz | </w:t>
+                <w:highlight w:val="yellow"/>
+              </w:rPr>
+              <w:t>sëõ—</w:t>
+            </w:r>
+            <w:r>
+              <w:rPr>
+                <w:rFonts w:ascii="BRH Malayalam Extra" w:hAnsi="BRH Malayalam Extra" w:cs="BRH Malayalam Extra"/>
+                <w:color w:val="000000"/>
+                <w:sz w:val="32"/>
+                <w:szCs w:val="40"/>
+              </w:rPr>
+              <w:t>j dõsõsy sû</w:t>
+            </w:r>
+            <w:r>
+              <w:rPr>
+                <w:rFonts w:ascii="BRH Malayalam Extra" w:hAnsi="BRH Malayalam Extra" w:cs="BRH Malayalam Extra"/>
+                <w:color w:val="000000"/>
+                <w:sz w:val="25"/>
+                <w:szCs w:val="40"/>
+              </w:rPr>
+              <w:t>–</w:t>
+            </w:r>
+            <w:r>
+              <w:rPr>
+                <w:rFonts w:ascii="BRH Malayalam Extra" w:hAnsi="BRH Malayalam Extra" w:cs="BRH Malayalam Extra"/>
+                <w:color w:val="000000"/>
+                <w:sz w:val="32"/>
+                <w:szCs w:val="40"/>
+                <w:highlight w:val="yellow"/>
+              </w:rPr>
+              <w:t>sëõ</w:t>
+            </w:r>
+            <w:r>
+              <w:rPr>
+                <w:rFonts w:ascii="BRH Malayalam Extra" w:hAnsi="BRH Malayalam Extra" w:cs="BRH Malayalam Extra"/>
+                <w:color w:val="000000"/>
+                <w:sz w:val="32"/>
+                <w:szCs w:val="40"/>
+              </w:rPr>
+              <w:t>—jdz sû</w:t>
+            </w:r>
+            <w:r>
+              <w:rPr>
+                <w:rFonts w:ascii="BRH Malayalam Extra" w:hAnsi="BRH Malayalam Extra" w:cs="BRH Malayalam Extra"/>
+                <w:color w:val="000000"/>
+                <w:sz w:val="25"/>
+                <w:szCs w:val="40"/>
+              </w:rPr>
+              <w:t>–</w:t>
+            </w:r>
+            <w:r>
+              <w:rPr>
+                <w:rFonts w:ascii="BRH Malayalam Extra" w:hAnsi="BRH Malayalam Extra" w:cs="BRH Malayalam Extra"/>
+                <w:color w:val="000000"/>
+                <w:sz w:val="32"/>
+                <w:szCs w:val="40"/>
+                <w:highlight w:val="yellow"/>
+              </w:rPr>
+              <w:t>sëõ—</w:t>
+            </w:r>
+            <w:r>
+              <w:rPr>
+                <w:rFonts w:ascii="BRH Malayalam Extra" w:hAnsi="BRH Malayalam Extra" w:cs="BRH Malayalam Extra"/>
+                <w:color w:val="000000"/>
+                <w:sz w:val="32"/>
+                <w:szCs w:val="40"/>
+              </w:rPr>
+              <w:t xml:space="preserve">j dõsy | </w:t>
             </w:r>
           </w:p>
           <w:p>
@@ -4907,7 +4700,212 @@
               <w:autoSpaceDE w:val="0"/>
               <w:autoSpaceDN w:val="0"/>
               <w:adjustRightInd w:val="0"/>
-              <w:spacing w:line="240" w:lineRule="auto"/>
+              <w:spacing w:before="0" w:line="240" w:lineRule="auto"/>
+              <w:rPr>
+                <w:rFonts w:ascii="BRH Malayalam Extra" w:hAnsi="BRH Malayalam Extra" w:cs="BRH Malayalam Extra"/>
+                <w:color w:val="000000"/>
+                <w:sz w:val="32"/>
+                <w:szCs w:val="40"/>
+              </w:rPr>
+            </w:pPr>
+            <w:r>
+              <w:rPr>
+                <w:rFonts w:cs="BRH Malayalam Extra"/>
+                <w:color w:val="000000"/>
+                <w:szCs w:val="40"/>
+              </w:rPr>
+              <w:t>40</w:t>
+            </w:r>
+            <w:r>
+              <w:rPr>
+                <w:rFonts w:ascii="BRH Malayalam Extra" w:hAnsi="BRH Malayalam Extra" w:cs="BRH Malayalam Extra"/>
+                <w:color w:val="000000"/>
+                <w:sz w:val="32"/>
+                <w:szCs w:val="40"/>
+              </w:rPr>
+              <w:t xml:space="preserve">) </w:t>
+            </w:r>
+            <w:r>
+              <w:rPr>
+                <w:rFonts w:cs="BRH Malayalam Extra"/>
+                <w:color w:val="000000"/>
+                <w:szCs w:val="40"/>
+              </w:rPr>
+              <w:t>1</w:t>
+            </w:r>
+            <w:r>
+              <w:rPr>
+                <w:rFonts w:ascii="BRH Malayalam Extra" w:hAnsi="BRH Malayalam Extra" w:cs="BRH Malayalam Extra"/>
+                <w:color w:val="000000"/>
+                <w:sz w:val="32"/>
+                <w:szCs w:val="40"/>
+              </w:rPr>
+              <w:t>.</w:t>
+            </w:r>
+            <w:r>
+              <w:rPr>
+                <w:rFonts w:cs="BRH Malayalam Extra"/>
+                <w:color w:val="000000"/>
+                <w:szCs w:val="40"/>
+              </w:rPr>
+              <w:t>2</w:t>
+            </w:r>
+            <w:r>
+              <w:rPr>
+                <w:rFonts w:ascii="BRH Malayalam Extra" w:hAnsi="BRH Malayalam Extra" w:cs="BRH Malayalam Extra"/>
+                <w:color w:val="000000"/>
+                <w:sz w:val="32"/>
+                <w:szCs w:val="40"/>
+              </w:rPr>
+              <w:t>.</w:t>
+            </w:r>
+            <w:r>
+              <w:rPr>
+                <w:rFonts w:cs="BRH Malayalam Extra"/>
+                <w:color w:val="000000"/>
+                <w:szCs w:val="40"/>
+              </w:rPr>
+              <w:t>9</w:t>
+            </w:r>
+            <w:r>
+              <w:rPr>
+                <w:rFonts w:ascii="BRH Malayalam Extra" w:hAnsi="BRH Malayalam Extra" w:cs="BRH Malayalam Extra"/>
+                <w:color w:val="000000"/>
+                <w:sz w:val="32"/>
+                <w:szCs w:val="40"/>
+              </w:rPr>
+              <w:t>.</w:t>
+            </w:r>
+            <w:r>
+              <w:rPr>
+                <w:rFonts w:cs="BRH Malayalam Extra"/>
+                <w:color w:val="000000"/>
+                <w:szCs w:val="40"/>
+              </w:rPr>
+              <w:t>1</w:t>
+            </w:r>
+            <w:r>
+              <w:rPr>
+                <w:rFonts w:ascii="BRH Malayalam Extra" w:hAnsi="BRH Malayalam Extra" w:cs="BRH Malayalam Extra"/>
+                <w:color w:val="000000"/>
+                <w:sz w:val="32"/>
+                <w:szCs w:val="40"/>
+              </w:rPr>
+              <w:t>(</w:t>
+            </w:r>
+            <w:r>
+              <w:rPr>
+                <w:rFonts w:cs="BRH Malayalam Extra"/>
+                <w:color w:val="000000"/>
+                <w:szCs w:val="40"/>
+              </w:rPr>
+              <w:t>35</w:t>
+            </w:r>
+            <w:r>
+              <w:rPr>
+                <w:rFonts w:ascii="BRH Malayalam Extra" w:hAnsi="BRH Malayalam Extra" w:cs="BRH Malayalam Extra"/>
+                <w:color w:val="000000"/>
+                <w:sz w:val="32"/>
+                <w:szCs w:val="40"/>
+              </w:rPr>
+              <w:t>)- sû</w:t>
+            </w:r>
+            <w:r>
+              <w:rPr>
+                <w:rFonts w:ascii="BRH Malayalam Extra" w:hAnsi="BRH Malayalam Extra" w:cs="BRH Malayalam Extra"/>
+                <w:color w:val="000000"/>
+                <w:sz w:val="25"/>
+                <w:szCs w:val="40"/>
+              </w:rPr>
+              <w:t>–</w:t>
+            </w:r>
+            <w:r>
+              <w:rPr>
+                <w:rFonts w:ascii="BRH Malayalam Extra" w:hAnsi="BRH Malayalam Extra" w:cs="BRH Malayalam Extra"/>
+                <w:color w:val="000000"/>
+                <w:sz w:val="32"/>
+                <w:szCs w:val="40"/>
+                <w:highlight w:val="yellow"/>
+              </w:rPr>
+              <w:t>sëõ</w:t>
+            </w:r>
+            <w:r>
+              <w:rPr>
+                <w:rFonts w:ascii="BRH Malayalam Extra" w:hAnsi="BRH Malayalam Extra" w:cs="BRH Malayalam Extra"/>
+                <w:color w:val="000000"/>
+                <w:sz w:val="32"/>
+                <w:szCs w:val="40"/>
+              </w:rPr>
+              <w:t>—jdz |</w:t>
+            </w:r>
+          </w:p>
+          <w:p>
+            <w:pPr>
+              <w:widowControl w:val="0"/>
+              <w:autoSpaceDE w:val="0"/>
+              <w:autoSpaceDN w:val="0"/>
+              <w:adjustRightInd w:val="0"/>
+              <w:spacing w:before="0" w:line="240" w:lineRule="auto"/>
+              <w:rPr>
+                <w:rFonts w:ascii="BRH Malayalam Extra" w:hAnsi="BRH Malayalam Extra" w:cs="BRH Malayalam Extra"/>
+                <w:color w:val="000000"/>
+                <w:sz w:val="32"/>
+                <w:szCs w:val="40"/>
+              </w:rPr>
+            </w:pPr>
+            <w:r>
+              <w:rPr>
+                <w:rFonts w:ascii="BRH Malayalam Extra" w:hAnsi="BRH Malayalam Extra" w:cs="BRH Malayalam Extra"/>
+                <w:color w:val="000000"/>
+                <w:sz w:val="32"/>
+                <w:szCs w:val="40"/>
+              </w:rPr>
+              <w:t>sû</w:t>
+            </w:r>
+            <w:r>
+              <w:rPr>
+                <w:rFonts w:ascii="BRH Malayalam Extra" w:hAnsi="BRH Malayalam Extra" w:cs="BRH Malayalam Extra"/>
+                <w:color w:val="000000"/>
+                <w:sz w:val="25"/>
+                <w:szCs w:val="40"/>
+              </w:rPr>
+              <w:t>–</w:t>
+            </w:r>
+            <w:r>
+              <w:rPr>
+                <w:rFonts w:ascii="BRH Malayalam Extra" w:hAnsi="BRH Malayalam Extra" w:cs="BRH Malayalam Extra"/>
+                <w:color w:val="000000"/>
+                <w:sz w:val="32"/>
+                <w:szCs w:val="40"/>
+              </w:rPr>
+              <w:t>sëõj</w:t>
+            </w:r>
+            <w:r>
+              <w:rPr>
+                <w:rFonts w:ascii="BRH Malayalam Extra" w:hAnsi="BRH Malayalam Extra" w:cs="BRH Malayalam Extra"/>
+                <w:color w:val="000000"/>
+                <w:sz w:val="25"/>
+                <w:szCs w:val="40"/>
+              </w:rPr>
+              <w:t>–</w:t>
+            </w:r>
+            <w:r>
+              <w:rPr>
+                <w:rFonts w:ascii="BRH Malayalam Extra" w:hAnsi="BRH Malayalam Extra" w:cs="BRH Malayalam Extra"/>
+                <w:color w:val="000000"/>
+                <w:sz w:val="32"/>
+                <w:szCs w:val="40"/>
+              </w:rPr>
+              <w:t xml:space="preserve">dzZy— sûsëy - Aj—dz | </w:t>
+            </w:r>
+          </w:p>
+          <w:p>
+            <w:pPr>
+              <w:widowControl w:val="0"/>
+              <w:autoSpaceDE w:val="0"/>
+              <w:autoSpaceDN w:val="0"/>
+              <w:adjustRightInd w:val="0"/>
+              <w:spacing w:before="0" w:line="240" w:lineRule="auto"/>
               <w:rPr>
                 <w:rFonts w:cs="BRH Malayalam Extra"/>
                 <w:color w:val="000000"/>
@@ -4926,144 +4924,13 @@
               <w:autoSpaceDE w:val="0"/>
               <w:autoSpaceDN w:val="0"/>
               <w:adjustRightInd w:val="0"/>
-              <w:spacing w:line="240" w:lineRule="auto"/>
-              <w:rPr>
-                <w:rFonts w:ascii="BRH Malayalam Extra" w:hAnsi="BRH Malayalam Extra" w:cs="BRH Malayalam Extra"/>
-                <w:color w:val="000000"/>
-                <w:sz w:val="32"/>
+              <w:spacing w:before="0" w:line="240" w:lineRule="auto"/>
+              <w:rPr>
+                <w:rFonts w:cs="BRH Malayalam Extra"/>
+                <w:color w:val="000000"/>
                 <w:szCs w:val="40"/>
               </w:rPr>
             </w:pPr>
-            <w:r>
-              <w:rPr>
-                <w:rFonts w:cs="BRH Malayalam Extra"/>
-                <w:color w:val="000000"/>
-                <w:szCs w:val="40"/>
-              </w:rPr>
-              <w:t>38</w:t>
-            </w:r>
-            <w:r>
-              <w:rPr>
-                <w:rFonts w:ascii="BRH Malayalam Extra" w:hAnsi="BRH Malayalam Extra" w:cs="BRH Malayalam Extra"/>
-                <w:color w:val="000000"/>
-                <w:sz w:val="32"/>
-                <w:szCs w:val="40"/>
-              </w:rPr>
-              <w:t xml:space="preserve">) </w:t>
-            </w:r>
-            <w:r>
-              <w:rPr>
-                <w:rFonts w:cs="BRH Malayalam Extra"/>
-                <w:color w:val="000000"/>
-                <w:szCs w:val="40"/>
-              </w:rPr>
-              <w:t>1</w:t>
-            </w:r>
-            <w:r>
-              <w:rPr>
-                <w:rFonts w:ascii="BRH Malayalam Extra" w:hAnsi="BRH Malayalam Extra" w:cs="BRH Malayalam Extra"/>
-                <w:color w:val="000000"/>
-                <w:sz w:val="32"/>
-                <w:szCs w:val="40"/>
-              </w:rPr>
-              <w:t>.</w:t>
-            </w:r>
-            <w:r>
-              <w:rPr>
-                <w:rFonts w:cs="BRH Malayalam Extra"/>
-                <w:color w:val="000000"/>
-                <w:szCs w:val="40"/>
-              </w:rPr>
-              <w:t>2</w:t>
-            </w:r>
-            <w:r>
-              <w:rPr>
-                <w:rFonts w:ascii="BRH Malayalam Extra" w:hAnsi="BRH Malayalam Extra" w:cs="BRH Malayalam Extra"/>
-                <w:color w:val="000000"/>
-                <w:sz w:val="32"/>
-                <w:szCs w:val="40"/>
-              </w:rPr>
-              <w:t>.</w:t>
-            </w:r>
-            <w:r>
-              <w:rPr>
-                <w:rFonts w:cs="BRH Malayalam Extra"/>
-                <w:color w:val="000000"/>
-                <w:szCs w:val="40"/>
-              </w:rPr>
-              <w:t>9</w:t>
-            </w:r>
-            <w:r>
-              <w:rPr>
-                <w:rFonts w:ascii="BRH Malayalam Extra" w:hAnsi="BRH Malayalam Extra" w:cs="BRH Malayalam Extra"/>
-                <w:color w:val="000000"/>
-                <w:sz w:val="32"/>
-                <w:szCs w:val="40"/>
-              </w:rPr>
-              <w:t>.</w:t>
-            </w:r>
-            <w:r>
-              <w:rPr>
-                <w:rFonts w:cs="BRH Malayalam Extra"/>
-                <w:color w:val="000000"/>
-                <w:szCs w:val="40"/>
-              </w:rPr>
-              <w:t>1</w:t>
-            </w:r>
-            <w:r>
-              <w:rPr>
-                <w:rFonts w:ascii="BRH Malayalam Extra" w:hAnsi="BRH Malayalam Extra" w:cs="BRH Malayalam Extra"/>
-                <w:color w:val="000000"/>
-                <w:sz w:val="32"/>
-                <w:szCs w:val="40"/>
-              </w:rPr>
-              <w:t>(</w:t>
-            </w:r>
-            <w:r>
-              <w:rPr>
-                <w:rFonts w:cs="BRH Malayalam Extra"/>
-                <w:color w:val="000000"/>
-                <w:szCs w:val="40"/>
-              </w:rPr>
-              <w:t>34</w:t>
-            </w:r>
-            <w:r>
-              <w:rPr>
-                <w:rFonts w:ascii="BRH Malayalam Extra" w:hAnsi="BRH Malayalam Extra" w:cs="BRH Malayalam Extra"/>
-                <w:color w:val="000000"/>
-                <w:sz w:val="32"/>
-                <w:szCs w:val="40"/>
-              </w:rPr>
-              <w:t>)- jR—ixdsõ | sû</w:t>
-            </w:r>
-            <w:r>
-              <w:rPr>
-                <w:rFonts w:ascii="BRH Malayalam Extra" w:hAnsi="BRH Malayalam Extra" w:cs="BRH Malayalam Extra"/>
-                <w:color w:val="000000"/>
-                <w:sz w:val="25"/>
-                <w:szCs w:val="40"/>
-              </w:rPr>
-              <w:t>–</w:t>
-            </w:r>
-            <w:r>
-              <w:rPr>
-                <w:rFonts w:ascii="BRH Malayalam Extra" w:hAnsi="BRH Malayalam Extra" w:cs="BRH Malayalam Extra"/>
-                <w:color w:val="000000"/>
-                <w:sz w:val="32"/>
-                <w:szCs w:val="40"/>
-                <w:highlight w:val="green"/>
-              </w:rPr>
-              <w:t>sëõj—</w:t>
-            </w:r>
-            <w:r>
-              <w:rPr>
-                <w:rFonts w:ascii="BRH Malayalam Extra" w:hAnsi="BRH Malayalam Extra" w:cs="BRH Malayalam Extra"/>
-                <w:color w:val="000000"/>
-                <w:sz w:val="32"/>
-                <w:szCs w:val="40"/>
-              </w:rPr>
-              <w:t>dz |</w:t>
-            </w:r>
           </w:p>
           <w:p>
             <w:pPr>
@@ -5071,154 +4938,13 @@
               <w:autoSpaceDE w:val="0"/>
               <w:autoSpaceDN w:val="0"/>
               <w:adjustRightInd w:val="0"/>
-              <w:spacing w:line="240" w:lineRule="auto"/>
-              <w:ind w:right="-234"/>
-              <w:rPr>
-                <w:rFonts w:ascii="BRH Malayalam Extra" w:hAnsi="BRH Malayalam Extra" w:cs="BRH Malayalam Extra"/>
-                <w:color w:val="000000"/>
-                <w:sz w:val="32"/>
+              <w:spacing w:before="0" w:line="240" w:lineRule="auto"/>
+              <w:rPr>
+                <w:rFonts w:cs="BRH Malayalam Extra"/>
+                <w:color w:val="000000"/>
                 <w:szCs w:val="40"/>
               </w:rPr>
             </w:pPr>
-            <w:r>
-              <w:rPr>
-                <w:rFonts w:ascii="BRH Malayalam Extra" w:hAnsi="BRH Malayalam Extra" w:cs="BRH Malayalam Extra"/>
-                <w:color w:val="000000"/>
-                <w:sz w:val="32"/>
-                <w:szCs w:val="40"/>
-              </w:rPr>
-              <w:t>jR—ixdsõ sû</w:t>
-            </w:r>
-            <w:r>
-              <w:rPr>
-                <w:rFonts w:ascii="BRH Malayalam Extra" w:hAnsi="BRH Malayalam Extra" w:cs="BRH Malayalam Extra"/>
-                <w:color w:val="000000"/>
-                <w:sz w:val="25"/>
-                <w:szCs w:val="40"/>
-              </w:rPr>
-              <w:t>–</w:t>
-            </w:r>
-            <w:r>
-              <w:rPr>
-                <w:rFonts w:ascii="BRH Malayalam Extra" w:hAnsi="BRH Malayalam Extra" w:cs="BRH Malayalam Extra"/>
-                <w:color w:val="000000"/>
-                <w:sz w:val="32"/>
-                <w:szCs w:val="40"/>
-                <w:highlight w:val="green"/>
-              </w:rPr>
-              <w:t>sëõj</w:t>
-            </w:r>
-            <w:r>
-              <w:rPr>
-                <w:rFonts w:ascii="BRH Malayalam Extra" w:hAnsi="BRH Malayalam Extra" w:cs="BRH Malayalam Extra"/>
-                <w:color w:val="000000"/>
-                <w:sz w:val="32"/>
-                <w:szCs w:val="40"/>
-              </w:rPr>
-              <w:t>—dz sû</w:t>
-            </w:r>
-            <w:r>
-              <w:rPr>
-                <w:rFonts w:ascii="BRH Malayalam Extra" w:hAnsi="BRH Malayalam Extra" w:cs="BRH Malayalam Extra"/>
-                <w:color w:val="000000"/>
-                <w:sz w:val="25"/>
-                <w:szCs w:val="40"/>
-              </w:rPr>
-              <w:t>–</w:t>
-            </w:r>
-            <w:r>
-              <w:rPr>
-                <w:rFonts w:ascii="BRH Malayalam Extra" w:hAnsi="BRH Malayalam Extra" w:cs="BRH Malayalam Extra"/>
-                <w:color w:val="000000"/>
-                <w:sz w:val="32"/>
-                <w:szCs w:val="40"/>
-                <w:highlight w:val="green"/>
-              </w:rPr>
-              <w:t>sëõj</w:t>
-            </w:r>
-            <w:r>
-              <w:rPr>
-                <w:rFonts w:ascii="BRH Malayalam Extra" w:hAnsi="BRH Malayalam Extra" w:cs="BRH Malayalam Extra"/>
-                <w:color w:val="000000"/>
-                <w:sz w:val="32"/>
-                <w:szCs w:val="40"/>
-              </w:rPr>
-              <w:t>—dz</w:t>
-            </w:r>
-            <w:r>
-              <w:rPr>
-                <w:rFonts w:ascii="BRH Malayalam Extra" w:hAnsi="BRH Malayalam Extra" w:cs="BRH Malayalam Extra"/>
-                <w:color w:val="000000"/>
-                <w:sz w:val="25"/>
-                <w:szCs w:val="40"/>
-              </w:rPr>
-              <w:t>–</w:t>
-            </w:r>
-            <w:r>
-              <w:rPr>
-                <w:rFonts w:ascii="BRH Malayalam Extra" w:hAnsi="BRH Malayalam Extra" w:cs="BRH Malayalam Extra"/>
-                <w:color w:val="000000"/>
-                <w:sz w:val="32"/>
-                <w:szCs w:val="40"/>
-              </w:rPr>
-              <w:t xml:space="preserve"> jR—ixdsõ</w:t>
-            </w:r>
-            <w:r>
-              <w:rPr>
-                <w:rFonts w:ascii="BRH Malayalam Extra" w:hAnsi="BRH Malayalam Extra" w:cs="BRH Malayalam Extra"/>
-                <w:color w:val="000000"/>
-                <w:sz w:val="25"/>
-                <w:szCs w:val="40"/>
-              </w:rPr>
-              <w:t>–</w:t>
-            </w:r>
-            <w:r>
-              <w:rPr>
-                <w:rFonts w:ascii="BRH Malayalam Extra" w:hAnsi="BRH Malayalam Extra" w:cs="BRH Malayalam Extra"/>
-                <w:color w:val="000000"/>
-                <w:sz w:val="32"/>
-                <w:szCs w:val="40"/>
-              </w:rPr>
-              <w:t xml:space="preserve"> jR—ixdsõ sû</w:t>
-            </w:r>
-            <w:r>
-              <w:rPr>
-                <w:rFonts w:ascii="BRH Malayalam Extra" w:hAnsi="BRH Malayalam Extra" w:cs="BRH Malayalam Extra"/>
-                <w:color w:val="000000"/>
-                <w:sz w:val="25"/>
-                <w:szCs w:val="40"/>
-              </w:rPr>
-              <w:t>–</w:t>
-            </w:r>
-            <w:r>
-              <w:rPr>
-                <w:rFonts w:ascii="BRH Malayalam Extra" w:hAnsi="BRH Malayalam Extra" w:cs="BRH Malayalam Extra"/>
-                <w:color w:val="000000"/>
-                <w:sz w:val="32"/>
-                <w:szCs w:val="40"/>
-                <w:highlight w:val="green"/>
-              </w:rPr>
-              <w:t>sëõj</w:t>
-            </w:r>
-            <w:r>
-              <w:rPr>
-                <w:rFonts w:ascii="BRH Malayalam Extra" w:hAnsi="BRH Malayalam Extra" w:cs="BRH Malayalam Extra"/>
-                <w:color w:val="000000"/>
-                <w:sz w:val="32"/>
-                <w:szCs w:val="40"/>
-                <w:highlight w:val="yellow"/>
-              </w:rPr>
-              <w:t>—</w:t>
-            </w:r>
-            <w:r>
-              <w:rPr>
-                <w:rFonts w:ascii="BRH Malayalam Extra" w:hAnsi="BRH Malayalam Extra" w:cs="BRH Malayalam Extra"/>
-                <w:color w:val="000000"/>
-                <w:sz w:val="32"/>
-                <w:szCs w:val="40"/>
-              </w:rPr>
-              <w:t xml:space="preserve">dz | </w:t>
-            </w:r>
           </w:p>
           <w:p>
             <w:pPr>
@@ -5226,7 +4952,7 @@
               <w:autoSpaceDE w:val="0"/>
               <w:autoSpaceDN w:val="0"/>
               <w:adjustRightInd w:val="0"/>
-              <w:spacing w:line="240" w:lineRule="auto"/>
+              <w:spacing w:before="0" w:line="240" w:lineRule="auto"/>
               <w:rPr>
                 <w:rFonts w:ascii="BRH Malayalam Extra" w:hAnsi="BRH Malayalam Extra" w:cs="BRH Malayalam Extra"/>
                 <w:color w:val="000000"/>
@@ -5240,7 +4966,8 @@
                 <w:color w:val="000000"/>
                 <w:szCs w:val="40"/>
               </w:rPr>
-              <w:t>39</w:t>
+              <w:lastRenderedPageBreak/>
+              <w:t>38</w:t>
             </w:r>
             <w:r>
               <w:rPr>
@@ -5325,16 +5052,16 @@
                 <w:color w:val="000000"/>
                 <w:szCs w:val="40"/>
               </w:rPr>
-              <w:t>35</w:t>
-            </w:r>
-            <w:r>
-              <w:rPr>
-                <w:rFonts w:ascii="BRH Malayalam Extra" w:hAnsi="BRH Malayalam Extra" w:cs="BRH Malayalam Extra"/>
-                <w:color w:val="000000"/>
-                <w:sz w:val="32"/>
-                <w:szCs w:val="40"/>
-              </w:rPr>
-              <w:t>)- sû</w:t>
+              <w:t>34</w:t>
+            </w:r>
+            <w:r>
+              <w:rPr>
+                <w:rFonts w:ascii="BRH Malayalam Extra" w:hAnsi="BRH Malayalam Extra" w:cs="BRH Malayalam Extra"/>
+                <w:color w:val="000000"/>
+                <w:sz w:val="32"/>
+                <w:szCs w:val="40"/>
+              </w:rPr>
+              <w:t>)- jR—ixdsõ | sû</w:t>
             </w:r>
             <w:r>
               <w:rPr>
@@ -5353,52 +5080,16 @@
                 <w:szCs w:val="40"/>
                 <w:highlight w:val="green"/>
               </w:rPr>
-              <w:t>sëõj</w:t>
-            </w:r>
-            <w:r>
-              <w:rPr>
-                <w:rFonts w:ascii="BRH Malayalam Extra" w:hAnsi="BRH Malayalam Extra" w:cs="BRH Malayalam Extra"/>
-                <w:color w:val="000000"/>
-                <w:sz w:val="32"/>
-                <w:szCs w:val="40"/>
-              </w:rPr>
-              <w:t>—dz | A</w:t>
-            </w:r>
-            <w:r>
-              <w:rPr>
-                <w:rFonts w:ascii="BRH Malayalam Extra" w:hAnsi="BRH Malayalam Extra" w:cs="BRH Malayalam Extra"/>
-                <w:color w:val="000000"/>
-                <w:sz w:val="25"/>
-                <w:szCs w:val="40"/>
-              </w:rPr>
-              <w:t>–</w:t>
-            </w:r>
-            <w:r>
-              <w:rPr>
-                <w:rFonts w:ascii="BRH Malayalam Extra" w:hAnsi="BRH Malayalam Extra" w:cs="BRH Malayalam Extra"/>
-                <w:color w:val="000000"/>
-                <w:sz w:val="32"/>
-                <w:szCs w:val="40"/>
-              </w:rPr>
-              <w:t>sy</w:t>
-            </w:r>
-            <w:r>
-              <w:rPr>
-                <w:rFonts w:ascii="BRH Malayalam Extra" w:hAnsi="BRH Malayalam Extra" w:cs="BRH Malayalam Extra"/>
-                <w:color w:val="000000"/>
-                <w:sz w:val="25"/>
-                <w:szCs w:val="40"/>
-              </w:rPr>
-              <w:t>–</w:t>
-            </w:r>
-            <w:r>
-              <w:rPr>
-                <w:rFonts w:ascii="BRH Malayalam Extra" w:hAnsi="BRH Malayalam Extra" w:cs="BRH Malayalam Extra"/>
-                <w:color w:val="000000"/>
-                <w:sz w:val="32"/>
-                <w:szCs w:val="40"/>
-              </w:rPr>
-              <w:t xml:space="preserve"> |</w:t>
+              <w:t>sëõj—</w:t>
+            </w:r>
+            <w:r>
+              <w:rPr>
+                <w:rFonts w:ascii="BRH Malayalam Extra" w:hAnsi="BRH Malayalam Extra" w:cs="BRH Malayalam Extra"/>
+                <w:color w:val="000000"/>
+                <w:sz w:val="32"/>
+                <w:szCs w:val="40"/>
+              </w:rPr>
+              <w:t>dz |</w:t>
             </w:r>
           </w:p>
           <w:p>
@@ -5407,7 +5098,8 @@
               <w:autoSpaceDE w:val="0"/>
               <w:autoSpaceDN w:val="0"/>
               <w:adjustRightInd w:val="0"/>
-              <w:spacing w:line="240" w:lineRule="auto"/>
+              <w:spacing w:before="0" w:line="240" w:lineRule="auto"/>
+              <w:ind w:right="-234"/>
               <w:rPr>
                 <w:rFonts w:ascii="BRH Malayalam Extra" w:hAnsi="BRH Malayalam Extra" w:cs="BRH Malayalam Extra"/>
                 <w:color w:val="000000"/>
@@ -5422,7 +5114,7 @@
                 <w:sz w:val="32"/>
                 <w:szCs w:val="40"/>
               </w:rPr>
-              <w:t>sû</w:t>
+              <w:t>jR—ixdsõ sû</w:t>
             </w:r>
             <w:r>
               <w:rPr>
@@ -5449,6 +5141,98 @@
                 <w:color w:val="000000"/>
                 <w:sz w:val="32"/>
                 <w:szCs w:val="40"/>
+              </w:rPr>
+              <w:t>—dz sû</w:t>
+            </w:r>
+            <w:r>
+              <w:rPr>
+                <w:rFonts w:ascii="BRH Malayalam Extra" w:hAnsi="BRH Malayalam Extra" w:cs="BRH Malayalam Extra"/>
+                <w:color w:val="000000"/>
+                <w:sz w:val="25"/>
+                <w:szCs w:val="40"/>
+              </w:rPr>
+              <w:t>–</w:t>
+            </w:r>
+            <w:r>
+              <w:rPr>
+                <w:rFonts w:ascii="BRH Malayalam Extra" w:hAnsi="BRH Malayalam Extra" w:cs="BRH Malayalam Extra"/>
+                <w:color w:val="000000"/>
+                <w:sz w:val="32"/>
+                <w:szCs w:val="40"/>
+                <w:highlight w:val="green"/>
+              </w:rPr>
+              <w:t>sëõj</w:t>
+            </w:r>
+            <w:r>
+              <w:rPr>
+                <w:rFonts w:ascii="BRH Malayalam Extra" w:hAnsi="BRH Malayalam Extra" w:cs="BRH Malayalam Extra"/>
+                <w:color w:val="000000"/>
+                <w:sz w:val="32"/>
+                <w:szCs w:val="40"/>
+              </w:rPr>
+              <w:t>—dz</w:t>
+            </w:r>
+            <w:r>
+              <w:rPr>
+                <w:rFonts w:ascii="BRH Malayalam Extra" w:hAnsi="BRH Malayalam Extra" w:cs="BRH Malayalam Extra"/>
+                <w:color w:val="000000"/>
+                <w:sz w:val="25"/>
+                <w:szCs w:val="40"/>
+              </w:rPr>
+              <w:t>–</w:t>
+            </w:r>
+            <w:r>
+              <w:rPr>
+                <w:rFonts w:ascii="BRH Malayalam Extra" w:hAnsi="BRH Malayalam Extra" w:cs="BRH Malayalam Extra"/>
+                <w:color w:val="000000"/>
+                <w:sz w:val="32"/>
+                <w:szCs w:val="40"/>
+              </w:rPr>
+              <w:t xml:space="preserve"> jR—ixdsõ</w:t>
+            </w:r>
+            <w:r>
+              <w:rPr>
+                <w:rFonts w:ascii="BRH Malayalam Extra" w:hAnsi="BRH Malayalam Extra" w:cs="BRH Malayalam Extra"/>
+                <w:color w:val="000000"/>
+                <w:sz w:val="25"/>
+                <w:szCs w:val="40"/>
+              </w:rPr>
+              <w:t>–</w:t>
+            </w:r>
+            <w:r>
+              <w:rPr>
+                <w:rFonts w:ascii="BRH Malayalam Extra" w:hAnsi="BRH Malayalam Extra" w:cs="BRH Malayalam Extra"/>
+                <w:color w:val="000000"/>
+                <w:sz w:val="32"/>
+                <w:szCs w:val="40"/>
+              </w:rPr>
+              <w:t xml:space="preserve"> jR—ixdsõ sû</w:t>
+            </w:r>
+            <w:r>
+              <w:rPr>
+                <w:rFonts w:ascii="BRH Malayalam Extra" w:hAnsi="BRH Malayalam Extra" w:cs="BRH Malayalam Extra"/>
+                <w:color w:val="000000"/>
+                <w:sz w:val="25"/>
+                <w:szCs w:val="40"/>
+              </w:rPr>
+              <w:t>–</w:t>
+            </w:r>
+            <w:r>
+              <w:rPr>
+                <w:rFonts w:ascii="BRH Malayalam Extra" w:hAnsi="BRH Malayalam Extra" w:cs="BRH Malayalam Extra"/>
+                <w:color w:val="000000"/>
+                <w:sz w:val="32"/>
+                <w:szCs w:val="40"/>
+                <w:highlight w:val="green"/>
+              </w:rPr>
+              <w:t>sëõj</w:t>
+            </w:r>
+            <w:r>
+              <w:rPr>
+                <w:rFonts w:ascii="BRH Malayalam Extra" w:hAnsi="BRH Malayalam Extra" w:cs="BRH Malayalam Extra"/>
+                <w:color w:val="000000"/>
+                <w:sz w:val="32"/>
+                <w:szCs w:val="40"/>
                 <w:highlight w:val="yellow"/>
               </w:rPr>
               <w:t>—</w:t>
@@ -5460,73 +5244,7 @@
                 <w:sz w:val="32"/>
                 <w:szCs w:val="40"/>
               </w:rPr>
-              <w:t xml:space="preserve"> dõsõsy sû</w:t>
-            </w:r>
-            <w:r>
-              <w:rPr>
-                <w:rFonts w:ascii="BRH Malayalam Extra" w:hAnsi="BRH Malayalam Extra" w:cs="BRH Malayalam Extra"/>
-                <w:color w:val="000000"/>
-                <w:sz w:val="25"/>
-                <w:szCs w:val="40"/>
-              </w:rPr>
-              <w:t>–</w:t>
-            </w:r>
-            <w:r>
-              <w:rPr>
-                <w:rFonts w:ascii="BRH Malayalam Extra" w:hAnsi="BRH Malayalam Extra" w:cs="BRH Malayalam Extra"/>
-                <w:color w:val="000000"/>
-                <w:sz w:val="32"/>
-                <w:szCs w:val="40"/>
-                <w:highlight w:val="green"/>
-              </w:rPr>
-              <w:t>sëõj</w:t>
-            </w:r>
-            <w:r>
-              <w:rPr>
-                <w:rFonts w:ascii="BRH Malayalam Extra" w:hAnsi="BRH Malayalam Extra" w:cs="BRH Malayalam Extra"/>
-                <w:color w:val="000000"/>
-                <w:sz w:val="32"/>
-                <w:szCs w:val="40"/>
-              </w:rPr>
-              <w:t>—dz sû</w:t>
-            </w:r>
-            <w:r>
-              <w:rPr>
-                <w:rFonts w:ascii="BRH Malayalam Extra" w:hAnsi="BRH Malayalam Extra" w:cs="BRH Malayalam Extra"/>
-                <w:color w:val="000000"/>
-                <w:sz w:val="25"/>
-                <w:szCs w:val="40"/>
-              </w:rPr>
-              <w:t>–</w:t>
-            </w:r>
-            <w:r>
-              <w:rPr>
-                <w:rFonts w:ascii="BRH Malayalam Extra" w:hAnsi="BRH Malayalam Extra" w:cs="BRH Malayalam Extra"/>
-                <w:color w:val="000000"/>
-                <w:sz w:val="32"/>
-                <w:szCs w:val="40"/>
-                <w:highlight w:val="green"/>
-              </w:rPr>
-              <w:t>sëõj</w:t>
-            </w:r>
-            <w:r>
-              <w:rPr>
-                <w:rFonts w:ascii="BRH Malayalam Extra" w:hAnsi="BRH Malayalam Extra" w:cs="BRH Malayalam Extra"/>
-                <w:color w:val="000000"/>
-                <w:sz w:val="32"/>
-                <w:szCs w:val="40"/>
-                <w:highlight w:val="yellow"/>
-              </w:rPr>
-              <w:t>—</w:t>
-            </w:r>
-            <w:r>
-              <w:rPr>
-                <w:rFonts w:ascii="BRH Malayalam Extra" w:hAnsi="BRH Malayalam Extra" w:cs="BRH Malayalam Extra"/>
-                <w:color w:val="000000"/>
-                <w:sz w:val="32"/>
-                <w:szCs w:val="40"/>
-              </w:rPr>
-              <w:t xml:space="preserve"> dõsy | </w:t>
+              <w:t xml:space="preserve">dz | </w:t>
             </w:r>
           </w:p>
           <w:p>
@@ -5535,7 +5253,7 @@
               <w:autoSpaceDE w:val="0"/>
               <w:autoSpaceDN w:val="0"/>
               <w:adjustRightInd w:val="0"/>
-              <w:spacing w:line="240" w:lineRule="auto"/>
+              <w:spacing w:before="0" w:line="240" w:lineRule="auto"/>
               <w:rPr>
                 <w:rFonts w:ascii="BRH Malayalam Extra" w:hAnsi="BRH Malayalam Extra" w:cs="BRH Malayalam Extra"/>
                 <w:color w:val="000000"/>
@@ -5549,7 +5267,7 @@
                 <w:color w:val="000000"/>
                 <w:szCs w:val="40"/>
               </w:rPr>
-              <w:t>40</w:t>
+              <w:t>39</w:t>
             </w:r>
             <w:r>
               <w:rPr>
@@ -5671,7 +5389,43 @@
                 <w:sz w:val="32"/>
                 <w:szCs w:val="40"/>
               </w:rPr>
-              <w:t>—dz |</w:t>
+              <w:t>—dz | A</w:t>
+            </w:r>
+            <w:r>
+              <w:rPr>
+                <w:rFonts w:ascii="BRH Malayalam Extra" w:hAnsi="BRH Malayalam Extra" w:cs="BRH Malayalam Extra"/>
+                <w:color w:val="000000"/>
+                <w:sz w:val="25"/>
+                <w:szCs w:val="40"/>
+              </w:rPr>
+              <w:t>–</w:t>
+            </w:r>
+            <w:r>
+              <w:rPr>
+                <w:rFonts w:ascii="BRH Malayalam Extra" w:hAnsi="BRH Malayalam Extra" w:cs="BRH Malayalam Extra"/>
+                <w:color w:val="000000"/>
+                <w:sz w:val="32"/>
+                <w:szCs w:val="40"/>
+              </w:rPr>
+              <w:t>sy</w:t>
+            </w:r>
+            <w:r>
+              <w:rPr>
+                <w:rFonts w:ascii="BRH Malayalam Extra" w:hAnsi="BRH Malayalam Extra" w:cs="BRH Malayalam Extra"/>
+                <w:color w:val="000000"/>
+                <w:sz w:val="25"/>
+                <w:szCs w:val="40"/>
+              </w:rPr>
+              <w:t>–</w:t>
+            </w:r>
+            <w:r>
+              <w:rPr>
+                <w:rFonts w:ascii="BRH Malayalam Extra" w:hAnsi="BRH Malayalam Extra" w:cs="BRH Malayalam Extra"/>
+                <w:color w:val="000000"/>
+                <w:sz w:val="32"/>
+                <w:szCs w:val="40"/>
+              </w:rPr>
+              <w:t xml:space="preserve"> |</w:t>
             </w:r>
           </w:p>
           <w:p>
@@ -5680,7 +5434,7 @@
               <w:autoSpaceDE w:val="0"/>
               <w:autoSpaceDN w:val="0"/>
               <w:adjustRightInd w:val="0"/>
-              <w:spacing w:line="240" w:lineRule="auto"/>
+              <w:spacing w:before="0" w:line="240" w:lineRule="auto"/>
               <w:rPr>
                 <w:rFonts w:ascii="BRH Malayalam Extra" w:hAnsi="BRH Malayalam Extra" w:cs="BRH Malayalam Extra"/>
                 <w:color w:val="000000"/>
@@ -5712,6 +5466,7 @@
                 <w:color w:val="000000"/>
                 <w:sz w:val="32"/>
                 <w:szCs w:val="40"/>
+                <w:highlight w:val="green"/>
               </w:rPr>
               <w:t>sëõj</w:t>
             </w:r>
@@ -5719,19 +5474,86 @@
               <w:rPr>
                 <w:rFonts w:ascii="BRH Malayalam Extra" w:hAnsi="BRH Malayalam Extra" w:cs="BRH Malayalam Extra"/>
                 <w:color w:val="000000"/>
-                <w:sz w:val="25"/>
-                <w:szCs w:val="40"/>
-              </w:rPr>
-              <w:t>–</w:t>
-            </w:r>
-            <w:r>
-              <w:rPr>
-                <w:rFonts w:ascii="BRH Malayalam Extra" w:hAnsi="BRH Malayalam Extra" w:cs="BRH Malayalam Extra"/>
-                <w:color w:val="000000"/>
-                <w:sz w:val="32"/>
-                <w:szCs w:val="40"/>
-              </w:rPr>
-              <w:t xml:space="preserve">dzZy— sûsëy - Aj—dz | </w:t>
+                <w:sz w:val="32"/>
+                <w:szCs w:val="40"/>
+                <w:highlight w:val="yellow"/>
+              </w:rPr>
+              <w:t>—</w:t>
+            </w:r>
+            <w:r>
+              <w:rPr>
+                <w:rFonts w:ascii="BRH Malayalam Extra" w:hAnsi="BRH Malayalam Extra" w:cs="BRH Malayalam Extra"/>
+                <w:color w:val="000000"/>
+                <w:sz w:val="32"/>
+                <w:szCs w:val="40"/>
+              </w:rPr>
+              <w:t xml:space="preserve"> dõsõsy sû</w:t>
+            </w:r>
+            <w:r>
+              <w:rPr>
+                <w:rFonts w:ascii="BRH Malayalam Extra" w:hAnsi="BRH Malayalam Extra" w:cs="BRH Malayalam Extra"/>
+                <w:color w:val="000000"/>
+                <w:sz w:val="25"/>
+                <w:szCs w:val="40"/>
+              </w:rPr>
+              <w:t>–</w:t>
+            </w:r>
+            <w:r>
+              <w:rPr>
+                <w:rFonts w:ascii="BRH Malayalam Extra" w:hAnsi="BRH Malayalam Extra" w:cs="BRH Malayalam Extra"/>
+                <w:color w:val="000000"/>
+                <w:sz w:val="32"/>
+                <w:szCs w:val="40"/>
+                <w:highlight w:val="green"/>
+              </w:rPr>
+              <w:t>sëõj</w:t>
+            </w:r>
+            <w:r>
+              <w:rPr>
+                <w:rFonts w:ascii="BRH Malayalam Extra" w:hAnsi="BRH Malayalam Extra" w:cs="BRH Malayalam Extra"/>
+                <w:color w:val="000000"/>
+                <w:sz w:val="32"/>
+                <w:szCs w:val="40"/>
+              </w:rPr>
+              <w:t>—dz sû</w:t>
+            </w:r>
+            <w:r>
+              <w:rPr>
+                <w:rFonts w:ascii="BRH Malayalam Extra" w:hAnsi="BRH Malayalam Extra" w:cs="BRH Malayalam Extra"/>
+                <w:color w:val="000000"/>
+                <w:sz w:val="25"/>
+                <w:szCs w:val="40"/>
+              </w:rPr>
+              <w:t>–</w:t>
+            </w:r>
+            <w:r>
+              <w:rPr>
+                <w:rFonts w:ascii="BRH Malayalam Extra" w:hAnsi="BRH Malayalam Extra" w:cs="BRH Malayalam Extra"/>
+                <w:color w:val="000000"/>
+                <w:sz w:val="32"/>
+                <w:szCs w:val="40"/>
+                <w:highlight w:val="green"/>
+              </w:rPr>
+              <w:t>sëõj</w:t>
+            </w:r>
+            <w:r>
+              <w:rPr>
+                <w:rFonts w:ascii="BRH Malayalam Extra" w:hAnsi="BRH Malayalam Extra" w:cs="BRH Malayalam Extra"/>
+                <w:color w:val="000000"/>
+                <w:sz w:val="32"/>
+                <w:szCs w:val="40"/>
+                <w:highlight w:val="yellow"/>
+              </w:rPr>
+              <w:t>—</w:t>
+            </w:r>
+            <w:r>
+              <w:rPr>
+                <w:rFonts w:ascii="BRH Malayalam Extra" w:hAnsi="BRH Malayalam Extra" w:cs="BRH Malayalam Extra"/>
+                <w:color w:val="000000"/>
+                <w:sz w:val="32"/>
+                <w:szCs w:val="40"/>
+              </w:rPr>
+              <w:t xml:space="preserve"> dõsy | </w:t>
             </w:r>
           </w:p>
           <w:p>
@@ -5740,7 +5562,212 @@
               <w:autoSpaceDE w:val="0"/>
               <w:autoSpaceDN w:val="0"/>
               <w:adjustRightInd w:val="0"/>
-              <w:spacing w:line="240" w:lineRule="auto"/>
+              <w:spacing w:before="0" w:line="240" w:lineRule="auto"/>
+              <w:rPr>
+                <w:rFonts w:ascii="BRH Malayalam Extra" w:hAnsi="BRH Malayalam Extra" w:cs="BRH Malayalam Extra"/>
+                <w:color w:val="000000"/>
+                <w:sz w:val="32"/>
+                <w:szCs w:val="40"/>
+              </w:rPr>
+            </w:pPr>
+            <w:r>
+              <w:rPr>
+                <w:rFonts w:cs="BRH Malayalam Extra"/>
+                <w:color w:val="000000"/>
+                <w:szCs w:val="40"/>
+              </w:rPr>
+              <w:t>40</w:t>
+            </w:r>
+            <w:r>
+              <w:rPr>
+                <w:rFonts w:ascii="BRH Malayalam Extra" w:hAnsi="BRH Malayalam Extra" w:cs="BRH Malayalam Extra"/>
+                <w:color w:val="000000"/>
+                <w:sz w:val="32"/>
+                <w:szCs w:val="40"/>
+              </w:rPr>
+              <w:t xml:space="preserve">) </w:t>
+            </w:r>
+            <w:r>
+              <w:rPr>
+                <w:rFonts w:cs="BRH Malayalam Extra"/>
+                <w:color w:val="000000"/>
+                <w:szCs w:val="40"/>
+              </w:rPr>
+              <w:t>1</w:t>
+            </w:r>
+            <w:r>
+              <w:rPr>
+                <w:rFonts w:ascii="BRH Malayalam Extra" w:hAnsi="BRH Malayalam Extra" w:cs="BRH Malayalam Extra"/>
+                <w:color w:val="000000"/>
+                <w:sz w:val="32"/>
+                <w:szCs w:val="40"/>
+              </w:rPr>
+              <w:t>.</w:t>
+            </w:r>
+            <w:r>
+              <w:rPr>
+                <w:rFonts w:cs="BRH Malayalam Extra"/>
+                <w:color w:val="000000"/>
+                <w:szCs w:val="40"/>
+              </w:rPr>
+              <w:t>2</w:t>
+            </w:r>
+            <w:r>
+              <w:rPr>
+                <w:rFonts w:ascii="BRH Malayalam Extra" w:hAnsi="BRH Malayalam Extra" w:cs="BRH Malayalam Extra"/>
+                <w:color w:val="000000"/>
+                <w:sz w:val="32"/>
+                <w:szCs w:val="40"/>
+              </w:rPr>
+              <w:t>.</w:t>
+            </w:r>
+            <w:r>
+              <w:rPr>
+                <w:rFonts w:cs="BRH Malayalam Extra"/>
+                <w:color w:val="000000"/>
+                <w:szCs w:val="40"/>
+              </w:rPr>
+              <w:t>9</w:t>
+            </w:r>
+            <w:r>
+              <w:rPr>
+                <w:rFonts w:ascii="BRH Malayalam Extra" w:hAnsi="BRH Malayalam Extra" w:cs="BRH Malayalam Extra"/>
+                <w:color w:val="000000"/>
+                <w:sz w:val="32"/>
+                <w:szCs w:val="40"/>
+              </w:rPr>
+              <w:t>.</w:t>
+            </w:r>
+            <w:r>
+              <w:rPr>
+                <w:rFonts w:cs="BRH Malayalam Extra"/>
+                <w:color w:val="000000"/>
+                <w:szCs w:val="40"/>
+              </w:rPr>
+              <w:t>1</w:t>
+            </w:r>
+            <w:r>
+              <w:rPr>
+                <w:rFonts w:ascii="BRH Malayalam Extra" w:hAnsi="BRH Malayalam Extra" w:cs="BRH Malayalam Extra"/>
+                <w:color w:val="000000"/>
+                <w:sz w:val="32"/>
+                <w:szCs w:val="40"/>
+              </w:rPr>
+              <w:t>(</w:t>
+            </w:r>
+            <w:r>
+              <w:rPr>
+                <w:rFonts w:cs="BRH Malayalam Extra"/>
+                <w:color w:val="000000"/>
+                <w:szCs w:val="40"/>
+              </w:rPr>
+              <w:t>35</w:t>
+            </w:r>
+            <w:r>
+              <w:rPr>
+                <w:rFonts w:ascii="BRH Malayalam Extra" w:hAnsi="BRH Malayalam Extra" w:cs="BRH Malayalam Extra"/>
+                <w:color w:val="000000"/>
+                <w:sz w:val="32"/>
+                <w:szCs w:val="40"/>
+              </w:rPr>
+              <w:t>)- sû</w:t>
+            </w:r>
+            <w:r>
+              <w:rPr>
+                <w:rFonts w:ascii="BRH Malayalam Extra" w:hAnsi="BRH Malayalam Extra" w:cs="BRH Malayalam Extra"/>
+                <w:color w:val="000000"/>
+                <w:sz w:val="25"/>
+                <w:szCs w:val="40"/>
+              </w:rPr>
+              <w:t>–</w:t>
+            </w:r>
+            <w:r>
+              <w:rPr>
+                <w:rFonts w:ascii="BRH Malayalam Extra" w:hAnsi="BRH Malayalam Extra" w:cs="BRH Malayalam Extra"/>
+                <w:color w:val="000000"/>
+                <w:sz w:val="32"/>
+                <w:szCs w:val="40"/>
+                <w:highlight w:val="green"/>
+              </w:rPr>
+              <w:t>sëõj</w:t>
+            </w:r>
+            <w:r>
+              <w:rPr>
+                <w:rFonts w:ascii="BRH Malayalam Extra" w:hAnsi="BRH Malayalam Extra" w:cs="BRH Malayalam Extra"/>
+                <w:color w:val="000000"/>
+                <w:sz w:val="32"/>
+                <w:szCs w:val="40"/>
+              </w:rPr>
+              <w:t>—dz |</w:t>
+            </w:r>
+          </w:p>
+          <w:p>
+            <w:pPr>
+              <w:widowControl w:val="0"/>
+              <w:autoSpaceDE w:val="0"/>
+              <w:autoSpaceDN w:val="0"/>
+              <w:adjustRightInd w:val="0"/>
+              <w:spacing w:before="0" w:line="240" w:lineRule="auto"/>
+              <w:rPr>
+                <w:rFonts w:ascii="BRH Malayalam Extra" w:hAnsi="BRH Malayalam Extra" w:cs="BRH Malayalam Extra"/>
+                <w:color w:val="000000"/>
+                <w:sz w:val="32"/>
+                <w:szCs w:val="40"/>
+              </w:rPr>
+            </w:pPr>
+            <w:r>
+              <w:rPr>
+                <w:rFonts w:ascii="BRH Malayalam Extra" w:hAnsi="BRH Malayalam Extra" w:cs="BRH Malayalam Extra"/>
+                <w:color w:val="000000"/>
+                <w:sz w:val="32"/>
+                <w:szCs w:val="40"/>
+              </w:rPr>
+              <w:t>sû</w:t>
+            </w:r>
+            <w:r>
+              <w:rPr>
+                <w:rFonts w:ascii="BRH Malayalam Extra" w:hAnsi="BRH Malayalam Extra" w:cs="BRH Malayalam Extra"/>
+                <w:color w:val="000000"/>
+                <w:sz w:val="25"/>
+                <w:szCs w:val="40"/>
+              </w:rPr>
+              <w:t>–</w:t>
+            </w:r>
+            <w:r>
+              <w:rPr>
+                <w:rFonts w:ascii="BRH Malayalam Extra" w:hAnsi="BRH Malayalam Extra" w:cs="BRH Malayalam Extra"/>
+                <w:color w:val="000000"/>
+                <w:sz w:val="32"/>
+                <w:szCs w:val="40"/>
+              </w:rPr>
+              <w:t>sëõj</w:t>
+            </w:r>
+            <w:r>
+              <w:rPr>
+                <w:rFonts w:ascii="BRH Malayalam Extra" w:hAnsi="BRH Malayalam Extra" w:cs="BRH Malayalam Extra"/>
+                <w:color w:val="000000"/>
+                <w:sz w:val="25"/>
+                <w:szCs w:val="40"/>
+              </w:rPr>
+              <w:t>–</w:t>
+            </w:r>
+            <w:r>
+              <w:rPr>
+                <w:rFonts w:ascii="BRH Malayalam Extra" w:hAnsi="BRH Malayalam Extra" w:cs="BRH Malayalam Extra"/>
+                <w:color w:val="000000"/>
+                <w:sz w:val="32"/>
+                <w:szCs w:val="40"/>
+              </w:rPr>
+              <w:t xml:space="preserve">dzZy— sûsëy - Aj—dz | </w:t>
+            </w:r>
+          </w:p>
+          <w:p>
+            <w:pPr>
+              <w:widowControl w:val="0"/>
+              <w:autoSpaceDE w:val="0"/>
+              <w:autoSpaceDN w:val="0"/>
+              <w:adjustRightInd w:val="0"/>
+              <w:spacing w:before="0" w:line="240" w:lineRule="auto"/>
               <w:rPr>
                 <w:rFonts w:cs="BRH Malayalam Extra"/>
                 <w:b/>
@@ -5749,6 +5776,471 @@
                 <w:szCs w:val="40"/>
               </w:rPr>
             </w:pPr>
+          </w:p>
+        </w:tc>
+      </w:tr>
+      <w:tr>
+        <w:trPr>
+          <w:trHeight w:val="1155"/>
+        </w:trPr>
+        <w:tc>
+          <w:tcPr>
+            <w:tcW w:w="7024" w:type="dxa"/>
+            <w:tcBorders>
+              <w:top w:val="single" w:sz="4" w:space="0" w:color="000000"/>
+              <w:left w:val="single" w:sz="4" w:space="0" w:color="000000"/>
+              <w:bottom w:val="single" w:sz="4" w:space="0" w:color="000000"/>
+              <w:right w:val="single" w:sz="4" w:space="0" w:color="000000"/>
+            </w:tcBorders>
+          </w:tcPr>
+          <w:p>
+            <w:pPr>
+              <w:widowControl w:val="0"/>
+              <w:autoSpaceDE w:val="0"/>
+              <w:autoSpaceDN w:val="0"/>
+              <w:adjustRightInd w:val="0"/>
+              <w:spacing w:before="0" w:line="240" w:lineRule="auto"/>
+              <w:rPr>
+                <w:rFonts w:ascii="BRH Malayalam Extra" w:hAnsi="BRH Malayalam Extra" w:cs="BRH Malayalam Extra"/>
+                <w:color w:val="000000"/>
+                <w:sz w:val="32"/>
+                <w:szCs w:val="40"/>
+              </w:rPr>
+            </w:pPr>
+            <w:r>
+              <w:rPr>
+                <w:rFonts w:cs="BRH Malayalam Extra"/>
+                <w:color w:val="000000"/>
+                <w:szCs w:val="40"/>
+              </w:rPr>
+              <w:lastRenderedPageBreak/>
+              <w:t>40</w:t>
+            </w:r>
+            <w:r>
+              <w:rPr>
+                <w:rFonts w:ascii="BRH Malayalam Extra" w:hAnsi="BRH Malayalam Extra" w:cs="BRH Malayalam Extra"/>
+                <w:color w:val="000000"/>
+                <w:sz w:val="32"/>
+                <w:szCs w:val="40"/>
+              </w:rPr>
+              <w:t xml:space="preserve">) </w:t>
+            </w:r>
+            <w:r>
+              <w:rPr>
+                <w:rFonts w:cs="BRH Malayalam Extra"/>
+                <w:color w:val="000000"/>
+                <w:szCs w:val="40"/>
+              </w:rPr>
+              <w:t>1</w:t>
+            </w:r>
+            <w:r>
+              <w:rPr>
+                <w:rFonts w:ascii="BRH Malayalam Extra" w:hAnsi="BRH Malayalam Extra" w:cs="BRH Malayalam Extra"/>
+                <w:color w:val="000000"/>
+                <w:sz w:val="32"/>
+                <w:szCs w:val="40"/>
+              </w:rPr>
+              <w:t>.</w:t>
+            </w:r>
+            <w:r>
+              <w:rPr>
+                <w:rFonts w:cs="BRH Malayalam Extra"/>
+                <w:color w:val="000000"/>
+                <w:szCs w:val="40"/>
+              </w:rPr>
+              <w:t>2</w:t>
+            </w:r>
+            <w:r>
+              <w:rPr>
+                <w:rFonts w:ascii="BRH Malayalam Extra" w:hAnsi="BRH Malayalam Extra" w:cs="BRH Malayalam Extra"/>
+                <w:color w:val="000000"/>
+                <w:sz w:val="32"/>
+                <w:szCs w:val="40"/>
+              </w:rPr>
+              <w:t>.</w:t>
+            </w:r>
+            <w:r>
+              <w:rPr>
+                <w:rFonts w:cs="BRH Malayalam Extra"/>
+                <w:color w:val="000000"/>
+                <w:szCs w:val="40"/>
+              </w:rPr>
+              <w:t>14</w:t>
+            </w:r>
+            <w:r>
+              <w:rPr>
+                <w:rFonts w:ascii="BRH Malayalam Extra" w:hAnsi="BRH Malayalam Extra" w:cs="BRH Malayalam Extra"/>
+                <w:color w:val="000000"/>
+                <w:sz w:val="32"/>
+                <w:szCs w:val="40"/>
+              </w:rPr>
+              <w:t>.</w:t>
+            </w:r>
+            <w:r>
+              <w:rPr>
+                <w:rFonts w:cs="BRH Malayalam Extra"/>
+                <w:color w:val="000000"/>
+                <w:szCs w:val="40"/>
+              </w:rPr>
+              <w:t>2</w:t>
+            </w:r>
+            <w:r>
+              <w:rPr>
+                <w:rFonts w:ascii="BRH Malayalam Extra" w:hAnsi="BRH Malayalam Extra" w:cs="BRH Malayalam Extra"/>
+                <w:color w:val="000000"/>
+                <w:sz w:val="32"/>
+                <w:szCs w:val="40"/>
+              </w:rPr>
+              <w:t>(</w:t>
+            </w:r>
+            <w:r>
+              <w:rPr>
+                <w:rFonts w:cs="BRH Malayalam Extra"/>
+                <w:color w:val="000000"/>
+                <w:szCs w:val="40"/>
+              </w:rPr>
+              <w:t>39</w:t>
+            </w:r>
+            <w:r>
+              <w:rPr>
+                <w:rFonts w:ascii="BRH Malayalam Extra" w:hAnsi="BRH Malayalam Extra" w:cs="BRH Malayalam Extra"/>
+                <w:color w:val="000000"/>
+                <w:sz w:val="32"/>
+                <w:szCs w:val="40"/>
+              </w:rPr>
+              <w:t>)- A</w:t>
+            </w:r>
+            <w:r>
+              <w:rPr>
+                <w:rFonts w:ascii="BRH Malayalam Extra" w:hAnsi="BRH Malayalam Extra" w:cs="BRH Malayalam Extra"/>
+                <w:color w:val="000000"/>
+                <w:sz w:val="25"/>
+                <w:szCs w:val="40"/>
+              </w:rPr>
+              <w:t>–</w:t>
+            </w:r>
+            <w:r>
+              <w:rPr>
+                <w:rFonts w:ascii="BRH Malayalam Extra" w:hAnsi="BRH Malayalam Extra" w:cs="BRH Malayalam Extra"/>
+                <w:color w:val="000000"/>
+                <w:sz w:val="32"/>
+                <w:szCs w:val="40"/>
+              </w:rPr>
+              <w:t>¥²</w:t>
+            </w:r>
+            <w:r>
+              <w:rPr>
+                <w:rFonts w:ascii="BRH Malayalam Extra" w:hAnsi="BRH Malayalam Extra" w:cs="BRH Malayalam Extra"/>
+                <w:color w:val="000000"/>
+                <w:sz w:val="25"/>
+                <w:szCs w:val="40"/>
+              </w:rPr>
+              <w:t>–</w:t>
+            </w:r>
+            <w:r>
+              <w:rPr>
+                <w:rFonts w:ascii="BRH Malayalam Extra" w:hAnsi="BRH Malayalam Extra" w:cs="BRH Malayalam Extra"/>
+                <w:color w:val="000000"/>
+                <w:sz w:val="32"/>
+                <w:szCs w:val="40"/>
+              </w:rPr>
+              <w:t xml:space="preserve"> ||</w:t>
+            </w:r>
+          </w:p>
+          <w:p>
+            <w:pPr>
+              <w:widowControl w:val="0"/>
+              <w:autoSpaceDE w:val="0"/>
+              <w:autoSpaceDN w:val="0"/>
+              <w:adjustRightInd w:val="0"/>
+              <w:spacing w:before="0" w:line="240" w:lineRule="auto"/>
+              <w:rPr>
+                <w:rFonts w:cs="BRH Malayalam Extra"/>
+                <w:color w:val="000000"/>
+                <w:szCs w:val="40"/>
+                <w:lang w:val="it-IT"/>
+              </w:rPr>
+            </w:pPr>
+            <w:r>
+              <w:rPr>
+                <w:rFonts w:ascii="BRH Malayalam Extra" w:hAnsi="BRH Malayalam Extra" w:cs="BRH Malayalam Extra"/>
+                <w:color w:val="000000"/>
+                <w:sz w:val="32"/>
+                <w:szCs w:val="40"/>
+              </w:rPr>
+              <w:t>A</w:t>
+            </w:r>
+            <w:r>
+              <w:rPr>
+                <w:rFonts w:ascii="BRH Malayalam Extra" w:hAnsi="BRH Malayalam Extra" w:cs="BRH Malayalam Extra"/>
+                <w:color w:val="000000"/>
+                <w:sz w:val="25"/>
+                <w:szCs w:val="40"/>
+              </w:rPr>
+              <w:t>–</w:t>
+            </w:r>
+            <w:r>
+              <w:rPr>
+                <w:rFonts w:ascii="BRH Malayalam Extra" w:hAnsi="BRH Malayalam Extra" w:cs="BRH Malayalam Extra"/>
+                <w:color w:val="000000"/>
+                <w:sz w:val="32"/>
+                <w:szCs w:val="40"/>
+                <w:highlight w:val="yellow"/>
+              </w:rPr>
+              <w:t>¥</w:t>
+            </w:r>
+            <w:r>
+              <w:rPr>
+                <w:rFonts w:ascii="BRH Malayalam Extra" w:hAnsi="BRH Malayalam Extra" w:cs="BRH Malayalam Extra"/>
+                <w:color w:val="000000"/>
+                <w:sz w:val="32"/>
+                <w:szCs w:val="40"/>
+              </w:rPr>
+              <w:t>²</w:t>
+            </w:r>
+            <w:r>
+              <w:rPr>
+                <w:rFonts w:ascii="BRH Malayalam Extra" w:hAnsi="BRH Malayalam Extra" w:cs="BRH Malayalam Extra"/>
+                <w:color w:val="000000"/>
+                <w:sz w:val="25"/>
+                <w:szCs w:val="40"/>
+              </w:rPr>
+              <w:t>–</w:t>
+            </w:r>
+            <w:r>
+              <w:rPr>
+                <w:rFonts w:ascii="BRH Malayalam Extra" w:hAnsi="BRH Malayalam Extra" w:cs="BRH Malayalam Extra"/>
+                <w:color w:val="000000"/>
+                <w:sz w:val="32"/>
+                <w:szCs w:val="40"/>
+              </w:rPr>
+              <w:t xml:space="preserve"> CZõ—¥²</w:t>
+            </w:r>
+          </w:p>
+        </w:tc>
+        <w:tc>
+          <w:tcPr>
+            <w:tcW w:w="7229" w:type="dxa"/>
+            <w:tcBorders>
+              <w:top w:val="single" w:sz="4" w:space="0" w:color="000000"/>
+              <w:left w:val="single" w:sz="4" w:space="0" w:color="000000"/>
+              <w:bottom w:val="single" w:sz="4" w:space="0" w:color="000000"/>
+              <w:right w:val="single" w:sz="4" w:space="0" w:color="000000"/>
+            </w:tcBorders>
+          </w:tcPr>
+          <w:p>
+            <w:pPr>
+              <w:widowControl w:val="0"/>
+              <w:autoSpaceDE w:val="0"/>
+              <w:autoSpaceDN w:val="0"/>
+              <w:adjustRightInd w:val="0"/>
+              <w:spacing w:before="0" w:line="240" w:lineRule="auto"/>
+              <w:rPr>
+                <w:rFonts w:ascii="BRH Malayalam Extra" w:hAnsi="BRH Malayalam Extra" w:cs="BRH Malayalam Extra"/>
+                <w:color w:val="000000"/>
+                <w:sz w:val="32"/>
+                <w:szCs w:val="40"/>
+              </w:rPr>
+            </w:pPr>
+            <w:r>
+              <w:rPr>
+                <w:rFonts w:cs="BRH Malayalam Extra"/>
+                <w:color w:val="000000"/>
+                <w:szCs w:val="40"/>
+              </w:rPr>
+              <w:t>40</w:t>
+            </w:r>
+            <w:r>
+              <w:rPr>
+                <w:rFonts w:ascii="BRH Malayalam Extra" w:hAnsi="BRH Malayalam Extra" w:cs="BRH Malayalam Extra"/>
+                <w:color w:val="000000"/>
+                <w:sz w:val="32"/>
+                <w:szCs w:val="40"/>
+              </w:rPr>
+              <w:t xml:space="preserve">) </w:t>
+            </w:r>
+            <w:r>
+              <w:rPr>
+                <w:rFonts w:cs="BRH Malayalam Extra"/>
+                <w:color w:val="000000"/>
+                <w:szCs w:val="40"/>
+              </w:rPr>
+              <w:t>1</w:t>
+            </w:r>
+            <w:r>
+              <w:rPr>
+                <w:rFonts w:ascii="BRH Malayalam Extra" w:hAnsi="BRH Malayalam Extra" w:cs="BRH Malayalam Extra"/>
+                <w:color w:val="000000"/>
+                <w:sz w:val="32"/>
+                <w:szCs w:val="40"/>
+              </w:rPr>
+              <w:t>.</w:t>
+            </w:r>
+            <w:r>
+              <w:rPr>
+                <w:rFonts w:cs="BRH Malayalam Extra"/>
+                <w:color w:val="000000"/>
+                <w:szCs w:val="40"/>
+              </w:rPr>
+              <w:t>2</w:t>
+            </w:r>
+            <w:r>
+              <w:rPr>
+                <w:rFonts w:ascii="BRH Malayalam Extra" w:hAnsi="BRH Malayalam Extra" w:cs="BRH Malayalam Extra"/>
+                <w:color w:val="000000"/>
+                <w:sz w:val="32"/>
+                <w:szCs w:val="40"/>
+              </w:rPr>
+              <w:t>.</w:t>
+            </w:r>
+            <w:r>
+              <w:rPr>
+                <w:rFonts w:cs="BRH Malayalam Extra"/>
+                <w:color w:val="000000"/>
+                <w:szCs w:val="40"/>
+              </w:rPr>
+              <w:t>14</w:t>
+            </w:r>
+            <w:r>
+              <w:rPr>
+                <w:rFonts w:ascii="BRH Malayalam Extra" w:hAnsi="BRH Malayalam Extra" w:cs="BRH Malayalam Extra"/>
+                <w:color w:val="000000"/>
+                <w:sz w:val="32"/>
+                <w:szCs w:val="40"/>
+              </w:rPr>
+              <w:t>.</w:t>
+            </w:r>
+            <w:r>
+              <w:rPr>
+                <w:rFonts w:cs="BRH Malayalam Extra"/>
+                <w:color w:val="000000"/>
+                <w:szCs w:val="40"/>
+              </w:rPr>
+              <w:t>2</w:t>
+            </w:r>
+            <w:r>
+              <w:rPr>
+                <w:rFonts w:ascii="BRH Malayalam Extra" w:hAnsi="BRH Malayalam Extra" w:cs="BRH Malayalam Extra"/>
+                <w:color w:val="000000"/>
+                <w:sz w:val="32"/>
+                <w:szCs w:val="40"/>
+              </w:rPr>
+              <w:t>(</w:t>
+            </w:r>
+            <w:r>
+              <w:rPr>
+                <w:rFonts w:cs="BRH Malayalam Extra"/>
+                <w:color w:val="000000"/>
+                <w:szCs w:val="40"/>
+              </w:rPr>
+              <w:t>39</w:t>
+            </w:r>
+            <w:r>
+              <w:rPr>
+                <w:rFonts w:ascii="BRH Malayalam Extra" w:hAnsi="BRH Malayalam Extra" w:cs="BRH Malayalam Extra"/>
+                <w:color w:val="000000"/>
+                <w:sz w:val="32"/>
+                <w:szCs w:val="40"/>
+              </w:rPr>
+              <w:t>)- A</w:t>
+            </w:r>
+            <w:r>
+              <w:rPr>
+                <w:rFonts w:ascii="BRH Malayalam Extra" w:hAnsi="BRH Malayalam Extra" w:cs="BRH Malayalam Extra"/>
+                <w:color w:val="000000"/>
+                <w:sz w:val="25"/>
+                <w:szCs w:val="40"/>
+              </w:rPr>
+              <w:t>–</w:t>
+            </w:r>
+            <w:r>
+              <w:rPr>
+                <w:rFonts w:ascii="BRH Malayalam Extra" w:hAnsi="BRH Malayalam Extra" w:cs="BRH Malayalam Extra"/>
+                <w:color w:val="000000"/>
+                <w:sz w:val="32"/>
+                <w:szCs w:val="40"/>
+              </w:rPr>
+              <w:t>¥²</w:t>
+            </w:r>
+            <w:r>
+              <w:rPr>
+                <w:rFonts w:ascii="BRH Malayalam Extra" w:hAnsi="BRH Malayalam Extra" w:cs="BRH Malayalam Extra"/>
+                <w:color w:val="000000"/>
+                <w:sz w:val="25"/>
+                <w:szCs w:val="40"/>
+              </w:rPr>
+              <w:t>–</w:t>
+            </w:r>
+            <w:r>
+              <w:rPr>
+                <w:rFonts w:ascii="BRH Malayalam Extra" w:hAnsi="BRH Malayalam Extra" w:cs="BRH Malayalam Extra"/>
+                <w:color w:val="000000"/>
+                <w:sz w:val="32"/>
+                <w:szCs w:val="40"/>
+              </w:rPr>
+              <w:t xml:space="preserve"> ||</w:t>
+            </w:r>
+          </w:p>
+          <w:p>
+            <w:pPr>
+              <w:widowControl w:val="0"/>
+              <w:autoSpaceDE w:val="0"/>
+              <w:autoSpaceDN w:val="0"/>
+              <w:adjustRightInd w:val="0"/>
+              <w:spacing w:before="0" w:line="240" w:lineRule="auto"/>
+              <w:rPr>
+                <w:rFonts w:cs="BRH Malayalam Extra"/>
+                <w:color w:val="000000"/>
+                <w:szCs w:val="40"/>
+                <w:lang w:val="it-IT"/>
+              </w:rPr>
+            </w:pPr>
+            <w:r>
+              <w:rPr>
+                <w:rFonts w:ascii="BRH Malayalam Extra" w:hAnsi="BRH Malayalam Extra" w:cs="BRH Malayalam Extra"/>
+                <w:color w:val="000000"/>
+                <w:sz w:val="32"/>
+                <w:szCs w:val="40"/>
+              </w:rPr>
+              <w:t>A</w:t>
+            </w:r>
+            <w:r>
+              <w:rPr>
+                <w:rFonts w:ascii="BRH Malayalam Extra" w:hAnsi="BRH Malayalam Extra" w:cs="BRH Malayalam Extra"/>
+                <w:color w:val="000000"/>
+                <w:sz w:val="25"/>
+                <w:szCs w:val="40"/>
+              </w:rPr>
+              <w:t>–</w:t>
+            </w:r>
+            <w:r>
+              <w:rPr>
+                <w:rFonts w:ascii="BRH Malayalam Extra" w:hAnsi="BRH Malayalam Extra" w:cs="BRH Malayalam Extra"/>
+                <w:color w:val="000000"/>
+                <w:sz w:val="32"/>
+                <w:szCs w:val="40"/>
+                <w:highlight w:val="green"/>
+              </w:rPr>
+              <w:t>²</w:t>
+            </w:r>
+            <w:r>
+              <w:rPr>
+                <w:rFonts w:ascii="BRH Malayalam Extra" w:hAnsi="BRH Malayalam Extra" w:cs="BRH Malayalam Extra"/>
+                <w:color w:val="000000"/>
+                <w:sz w:val="25"/>
+                <w:szCs w:val="40"/>
+              </w:rPr>
+              <w:t>–</w:t>
+            </w:r>
+            <w:r>
+              <w:rPr>
+                <w:rFonts w:ascii="BRH Malayalam Extra" w:hAnsi="BRH Malayalam Extra" w:cs="BRH Malayalam Extra"/>
+                <w:color w:val="000000"/>
+                <w:sz w:val="32"/>
+                <w:szCs w:val="40"/>
+              </w:rPr>
+              <w:t xml:space="preserve"> CZõ—¥² | </w:t>
+            </w:r>
           </w:p>
         </w:tc>
       </w:tr>
@@ -5763,6 +6255,7 @@
           <w:sz w:val="32"/>
           <w:szCs w:val="32"/>
           <w:u w:val="single"/>
+          <w:lang w:val="it-IT"/>
         </w:rPr>
       </w:pPr>
     </w:p>
@@ -5776,6 +6269,7 @@
           <w:sz w:val="32"/>
           <w:szCs w:val="32"/>
           <w:u w:val="single"/>
+          <w:lang w:val="it-IT"/>
         </w:rPr>
       </w:pPr>
     </w:p>
@@ -5789,6 +6283,7 @@
           <w:sz w:val="32"/>
           <w:szCs w:val="32"/>
           <w:u w:val="single"/>
+          <w:lang w:val="it-IT"/>
         </w:rPr>
       </w:pPr>
     </w:p>
@@ -5802,6 +6297,7 @@
           <w:sz w:val="32"/>
           <w:szCs w:val="32"/>
           <w:u w:val="single"/>
+          <w:lang w:val="it-IT"/>
         </w:rPr>
       </w:pPr>
     </w:p>
@@ -5815,6 +6311,7 @@
           <w:sz w:val="32"/>
           <w:szCs w:val="32"/>
           <w:u w:val="single"/>
+          <w:lang w:val="it-IT"/>
         </w:rPr>
       </w:pPr>
     </w:p>
@@ -5869,7 +6366,6 @@
           <w:sz w:val="28"/>
           <w:szCs w:val="32"/>
         </w:rPr>
-        <w:lastRenderedPageBreak/>
         <w:t>(ignore those which are already incorporated in your book’s version and date)</w:t>
       </w:r>
     </w:p>
@@ -6168,6 +6664,7 @@
                 <w:sz w:val="32"/>
                 <w:szCs w:val="40"/>
               </w:rPr>
+              <w:lastRenderedPageBreak/>
               <w:t>Be— DÉ</w:t>
             </w:r>
             <w:r>
@@ -6587,6 +7084,7 @@
                 <w:color w:val="000000"/>
                 <w:szCs w:val="40"/>
               </w:rPr>
+              <w:lastRenderedPageBreak/>
               <w:t>1</w:t>
             </w:r>
             <w:r>
@@ -6759,6 +7257,7 @@
                 <w:sz w:val="32"/>
                 <w:szCs w:val="40"/>
               </w:rPr>
+              <w:lastRenderedPageBreak/>
               <w:t>Be— DÉ</w:t>
             </w:r>
             <w:r>
@@ -7196,6 +7695,7 @@
                 <w:color w:val="000000"/>
                 <w:szCs w:val="40"/>
               </w:rPr>
+              <w:lastRenderedPageBreak/>
               <w:t>20</w:t>
             </w:r>
             <w:r>
@@ -9652,7 +10152,6 @@
                 <w:szCs w:val="40"/>
                 <w:lang w:val="it-IT"/>
               </w:rPr>
-              <w:lastRenderedPageBreak/>
               <w:t>sûxt—ªL§sx</w:t>
             </w:r>
             <w:r>
@@ -9799,6 +10298,7 @@
                 <w:szCs w:val="40"/>
                 <w:lang w:val="it-IT"/>
               </w:rPr>
+              <w:lastRenderedPageBreak/>
               <w:t>46</w:t>
             </w:r>
             <w:r>
@@ -10333,7 +10833,6 @@
                 <w:szCs w:val="40"/>
                 <w:lang w:val="it-IT"/>
               </w:rPr>
-              <w:lastRenderedPageBreak/>
               <w:t>sûxt—ªL§sx</w:t>
             </w:r>
             <w:r>
@@ -10480,6 +10979,7 @@
                 <w:szCs w:val="40"/>
                 <w:lang w:val="it-IT"/>
               </w:rPr>
+              <w:lastRenderedPageBreak/>
               <w:t>46</w:t>
             </w:r>
             <w:r>
@@ -13920,7 +14420,6 @@
                 <w:szCs w:val="40"/>
                 <w:lang w:val="it-IT"/>
               </w:rPr>
-              <w:lastRenderedPageBreak/>
               <w:t>28</w:t>
             </w:r>
             <w:r>
@@ -14546,6 +15045,7 @@
                 <w:szCs w:val="40"/>
                 <w:lang w:val="it-IT"/>
               </w:rPr>
+              <w:lastRenderedPageBreak/>
               <w:t>11</w:t>
             </w:r>
             <w:r>
@@ -18004,7 +18504,6 @@
                 <w:szCs w:val="40"/>
                 <w:lang w:val="it-IT"/>
               </w:rPr>
-              <w:lastRenderedPageBreak/>
               <w:t>36</w:t>
             </w:r>
             <w:r>
@@ -18217,7 +18716,6 @@
                 <w:szCs w:val="40"/>
                 <w:lang w:val="it-IT"/>
               </w:rPr>
-              <w:lastRenderedPageBreak/>
               <w:t>35</w:t>
             </w:r>
             <w:r>
@@ -18405,7 +18903,6 @@
                 <w:szCs w:val="40"/>
                 <w:lang w:val="it-IT"/>
               </w:rPr>
-              <w:lastRenderedPageBreak/>
               <w:t>36</w:t>
             </w:r>
             <w:r>
@@ -21007,21 +21504,31 @@
               </w:rPr>
               <w:t>(³§</w:t>
             </w:r>
-            <w:r>
-              <w:rPr>
-                <w:rFonts w:ascii="BRH Malayalam Extra" w:hAnsi="BRH Malayalam Extra" w:cs="BRH Malayalam Extra"/>
-                <w:sz w:val="25"/>
-                <w:szCs w:val="40"/>
-              </w:rPr>
-              <w:t>–</w:t>
-            </w:r>
-            <w:r>
-              <w:rPr>
-                <w:rFonts w:ascii="BRH Malayalam Extra" w:hAnsi="BRH Malayalam Extra" w:cs="BRH Malayalam Extra"/>
-                <w:sz w:val="32"/>
-                <w:szCs w:val="40"/>
-              </w:rPr>
-              <w:t>)q¡dx˜ | ¥Z</w:t>
+            <w:proofErr w:type="gramStart"/>
+            <w:r>
+              <w:rPr>
+                <w:rFonts w:ascii="BRH Malayalam Extra" w:hAnsi="BRH Malayalam Extra" w:cs="BRH Malayalam Extra"/>
+                <w:sz w:val="25"/>
+                <w:szCs w:val="40"/>
+              </w:rPr>
+              <w:t>–</w:t>
+            </w:r>
+            <w:r>
+              <w:rPr>
+                <w:rFonts w:ascii="BRH Malayalam Extra" w:hAnsi="BRH Malayalam Extra" w:cs="BRH Malayalam Extra"/>
+                <w:sz w:val="32"/>
+                <w:szCs w:val="40"/>
+              </w:rPr>
+              <w:t>)q</w:t>
+            </w:r>
+            <w:proofErr w:type="gramEnd"/>
+            <w:r>
+              <w:rPr>
+                <w:rFonts w:ascii="BRH Malayalam Extra" w:hAnsi="BRH Malayalam Extra" w:cs="BRH Malayalam Extra"/>
+                <w:sz w:val="32"/>
+                <w:szCs w:val="40"/>
+              </w:rPr>
+              <w:t>¡dx˜ | ¥Z</w:t>
             </w:r>
             <w:r>
               <w:rPr>
@@ -21077,21 +21584,31 @@
               </w:rPr>
               <w:t>(³§</w:t>
             </w:r>
-            <w:r>
-              <w:rPr>
-                <w:rFonts w:ascii="BRH Malayalam Extra" w:hAnsi="BRH Malayalam Extra" w:cs="BRH Malayalam Extra"/>
-                <w:sz w:val="25"/>
-                <w:szCs w:val="40"/>
-              </w:rPr>
-              <w:t>–</w:t>
-            </w:r>
-            <w:r>
-              <w:rPr>
-                <w:rFonts w:ascii="BRH Malayalam Extra" w:hAnsi="BRH Malayalam Extra" w:cs="BRH Malayalam Extra"/>
-                <w:sz w:val="32"/>
-                <w:szCs w:val="40"/>
-              </w:rPr>
-              <w:t xml:space="preserve">)q¡dx— ¥Z ¥Z </w:t>
+            <w:proofErr w:type="gramStart"/>
+            <w:r>
+              <w:rPr>
+                <w:rFonts w:ascii="BRH Malayalam Extra" w:hAnsi="BRH Malayalam Extra" w:cs="BRH Malayalam Extra"/>
+                <w:sz w:val="25"/>
+                <w:szCs w:val="40"/>
+              </w:rPr>
+              <w:t>–</w:t>
+            </w:r>
+            <w:r>
+              <w:rPr>
+                <w:rFonts w:ascii="BRH Malayalam Extra" w:hAnsi="BRH Malayalam Extra" w:cs="BRH Malayalam Extra"/>
+                <w:sz w:val="32"/>
+                <w:szCs w:val="40"/>
+              </w:rPr>
+              <w:t>)q</w:t>
+            </w:r>
+            <w:proofErr w:type="gramEnd"/>
+            <w:r>
+              <w:rPr>
+                <w:rFonts w:ascii="BRH Malayalam Extra" w:hAnsi="BRH Malayalam Extra" w:cs="BRH Malayalam Extra"/>
+                <w:sz w:val="32"/>
+                <w:szCs w:val="40"/>
+              </w:rPr>
+              <w:t xml:space="preserve">¡dx— ¥Z ¥Z </w:t>
             </w:r>
             <w:r>
               <w:rPr>
@@ -21119,21 +21636,31 @@
               </w:rPr>
               <w:t>(³§</w:t>
             </w:r>
-            <w:r>
-              <w:rPr>
-                <w:rFonts w:ascii="BRH Malayalam Extra" w:hAnsi="BRH Malayalam Extra" w:cs="BRH Malayalam Extra"/>
-                <w:sz w:val="25"/>
-                <w:szCs w:val="40"/>
-              </w:rPr>
-              <w:t>–</w:t>
-            </w:r>
-            <w:r>
-              <w:rPr>
-                <w:rFonts w:ascii="BRH Malayalam Extra" w:hAnsi="BRH Malayalam Extra" w:cs="BRH Malayalam Extra"/>
-                <w:sz w:val="32"/>
-                <w:szCs w:val="40"/>
-              </w:rPr>
-              <w:t>)q¡dx</w:t>
+            <w:proofErr w:type="gramStart"/>
+            <w:r>
+              <w:rPr>
+                <w:rFonts w:ascii="BRH Malayalam Extra" w:hAnsi="BRH Malayalam Extra" w:cs="BRH Malayalam Extra"/>
+                <w:sz w:val="25"/>
+                <w:szCs w:val="40"/>
+              </w:rPr>
+              <w:t>–</w:t>
+            </w:r>
+            <w:r>
+              <w:rPr>
+                <w:rFonts w:ascii="BRH Malayalam Extra" w:hAnsi="BRH Malayalam Extra" w:cs="BRH Malayalam Extra"/>
+                <w:sz w:val="32"/>
+                <w:szCs w:val="40"/>
+              </w:rPr>
+              <w:t>)q</w:t>
+            </w:r>
+            <w:proofErr w:type="gramEnd"/>
+            <w:r>
+              <w:rPr>
+                <w:rFonts w:ascii="BRH Malayalam Extra" w:hAnsi="BRH Malayalam Extra" w:cs="BRH Malayalam Extra"/>
+                <w:sz w:val="32"/>
+                <w:szCs w:val="40"/>
+              </w:rPr>
+              <w:t>¡dx</w:t>
             </w:r>
             <w:r>
               <w:rPr>
@@ -21151,21 +21678,31 @@
               </w:rPr>
               <w:t xml:space="preserve"> „(³§</w:t>
             </w:r>
-            <w:r>
-              <w:rPr>
-                <w:rFonts w:ascii="BRH Malayalam Extra" w:hAnsi="BRH Malayalam Extra" w:cs="BRH Malayalam Extra"/>
-                <w:sz w:val="25"/>
-                <w:szCs w:val="40"/>
-              </w:rPr>
-              <w:t>–</w:t>
-            </w:r>
-            <w:r>
-              <w:rPr>
-                <w:rFonts w:ascii="BRH Malayalam Extra" w:hAnsi="BRH Malayalam Extra" w:cs="BRH Malayalam Extra"/>
-                <w:sz w:val="32"/>
-                <w:szCs w:val="40"/>
-              </w:rPr>
-              <w:t>)q¡dx— ¥Z</w:t>
+            <w:proofErr w:type="gramStart"/>
+            <w:r>
+              <w:rPr>
+                <w:rFonts w:ascii="BRH Malayalam Extra" w:hAnsi="BRH Malayalam Extra" w:cs="BRH Malayalam Extra"/>
+                <w:sz w:val="25"/>
+                <w:szCs w:val="40"/>
+              </w:rPr>
+              <w:t>–</w:t>
+            </w:r>
+            <w:r>
+              <w:rPr>
+                <w:rFonts w:ascii="BRH Malayalam Extra" w:hAnsi="BRH Malayalam Extra" w:cs="BRH Malayalam Extra"/>
+                <w:sz w:val="32"/>
+                <w:szCs w:val="40"/>
+              </w:rPr>
+              <w:t>)q</w:t>
+            </w:r>
+            <w:proofErr w:type="gramEnd"/>
+            <w:r>
+              <w:rPr>
+                <w:rFonts w:ascii="BRH Malayalam Extra" w:hAnsi="BRH Malayalam Extra" w:cs="BRH Malayalam Extra"/>
+                <w:sz w:val="32"/>
+                <w:szCs w:val="40"/>
+              </w:rPr>
+              <w:t>¡dx— ¥Z</w:t>
             </w:r>
           </w:p>
           <w:p>
@@ -21305,21 +21842,31 @@
               </w:rPr>
               <w:t>(³§</w:t>
             </w:r>
-            <w:r>
-              <w:rPr>
-                <w:rFonts w:ascii="BRH Malayalam Extra" w:hAnsi="BRH Malayalam Extra" w:cs="BRH Malayalam Extra"/>
-                <w:sz w:val="25"/>
-                <w:szCs w:val="40"/>
-              </w:rPr>
-              <w:t>–</w:t>
-            </w:r>
-            <w:r>
-              <w:rPr>
-                <w:rFonts w:ascii="BRH Malayalam Extra" w:hAnsi="BRH Malayalam Extra" w:cs="BRH Malayalam Extra"/>
-                <w:sz w:val="32"/>
-                <w:szCs w:val="40"/>
-              </w:rPr>
-              <w:t>)q¡dx˜ | ¥Z</w:t>
+            <w:proofErr w:type="gramStart"/>
+            <w:r>
+              <w:rPr>
+                <w:rFonts w:ascii="BRH Malayalam Extra" w:hAnsi="BRH Malayalam Extra" w:cs="BRH Malayalam Extra"/>
+                <w:sz w:val="25"/>
+                <w:szCs w:val="40"/>
+              </w:rPr>
+              <w:t>–</w:t>
+            </w:r>
+            <w:r>
+              <w:rPr>
+                <w:rFonts w:ascii="BRH Malayalam Extra" w:hAnsi="BRH Malayalam Extra" w:cs="BRH Malayalam Extra"/>
+                <w:sz w:val="32"/>
+                <w:szCs w:val="40"/>
+              </w:rPr>
+              <w:t>)q</w:t>
+            </w:r>
+            <w:proofErr w:type="gramEnd"/>
+            <w:r>
+              <w:rPr>
+                <w:rFonts w:ascii="BRH Malayalam Extra" w:hAnsi="BRH Malayalam Extra" w:cs="BRH Malayalam Extra"/>
+                <w:sz w:val="32"/>
+                <w:szCs w:val="40"/>
+              </w:rPr>
+              <w:t>¡dx˜ | ¥Z</w:t>
             </w:r>
             <w:r>
               <w:rPr>
@@ -21375,21 +21922,31 @@
               </w:rPr>
               <w:t>(³§</w:t>
             </w:r>
-            <w:r>
-              <w:rPr>
-                <w:rFonts w:ascii="BRH Malayalam Extra" w:hAnsi="BRH Malayalam Extra" w:cs="BRH Malayalam Extra"/>
-                <w:sz w:val="25"/>
-                <w:szCs w:val="40"/>
-              </w:rPr>
-              <w:t>–</w:t>
-            </w:r>
-            <w:r>
-              <w:rPr>
-                <w:rFonts w:ascii="BRH Malayalam Extra" w:hAnsi="BRH Malayalam Extra" w:cs="BRH Malayalam Extra"/>
-                <w:sz w:val="32"/>
-                <w:szCs w:val="40"/>
-              </w:rPr>
-              <w:t xml:space="preserve">)q¡dx— ¥Z </w:t>
+            <w:proofErr w:type="gramStart"/>
+            <w:r>
+              <w:rPr>
+                <w:rFonts w:ascii="BRH Malayalam Extra" w:hAnsi="BRH Malayalam Extra" w:cs="BRH Malayalam Extra"/>
+                <w:sz w:val="25"/>
+                <w:szCs w:val="40"/>
+              </w:rPr>
+              <w:t>–</w:t>
+            </w:r>
+            <w:r>
+              <w:rPr>
+                <w:rFonts w:ascii="BRH Malayalam Extra" w:hAnsi="BRH Malayalam Extra" w:cs="BRH Malayalam Extra"/>
+                <w:sz w:val="32"/>
+                <w:szCs w:val="40"/>
+              </w:rPr>
+              <w:t>)q</w:t>
+            </w:r>
+            <w:proofErr w:type="gramEnd"/>
+            <w:r>
+              <w:rPr>
+                <w:rFonts w:ascii="BRH Malayalam Extra" w:hAnsi="BRH Malayalam Extra" w:cs="BRH Malayalam Extra"/>
+                <w:sz w:val="32"/>
+                <w:szCs w:val="40"/>
+              </w:rPr>
+              <w:t xml:space="preserve">¡dx— ¥Z </w:t>
             </w:r>
             <w:r>
               <w:rPr>
@@ -21418,6 +21975,7 @@
               </w:rPr>
               <w:t xml:space="preserve"> (³§</w:t>
             </w:r>
+            <w:proofErr w:type="gramStart"/>
             <w:r>
               <w:rPr>
                 <w:rFonts w:ascii="BRH Malayalam Extra" w:hAnsi="BRH Malayalam Extra" w:cs="BRH Malayalam Extra"/>
@@ -21442,7 +22000,16 @@
                 <w:sz w:val="32"/>
                 <w:szCs w:val="40"/>
               </w:rPr>
-              <w:t>q¡dx</w:t>
+              <w:t>q</w:t>
+            </w:r>
+            <w:proofErr w:type="gramEnd"/>
+            <w:r>
+              <w:rPr>
+                <w:rFonts w:ascii="BRH Malayalam Extra" w:hAnsi="BRH Malayalam Extra" w:cs="BRH Malayalam Extra"/>
+                <w:sz w:val="32"/>
+                <w:szCs w:val="40"/>
+              </w:rPr>
+              <w:t>¡dx</w:t>
             </w:r>
             <w:r>
               <w:rPr>
@@ -21460,21 +22027,31 @@
               </w:rPr>
               <w:t xml:space="preserve"> „(³§</w:t>
             </w:r>
-            <w:r>
-              <w:rPr>
-                <w:rFonts w:ascii="BRH Malayalam Extra" w:hAnsi="BRH Malayalam Extra" w:cs="BRH Malayalam Extra"/>
-                <w:sz w:val="25"/>
-                <w:szCs w:val="40"/>
-              </w:rPr>
-              <w:t>–</w:t>
-            </w:r>
-            <w:r>
-              <w:rPr>
-                <w:rFonts w:ascii="BRH Malayalam Extra" w:hAnsi="BRH Malayalam Extra" w:cs="BRH Malayalam Extra"/>
-                <w:sz w:val="32"/>
-                <w:szCs w:val="40"/>
-              </w:rPr>
-              <w:t>)q¡dx— ¥Z |</w:t>
+            <w:proofErr w:type="gramStart"/>
+            <w:r>
+              <w:rPr>
+                <w:rFonts w:ascii="BRH Malayalam Extra" w:hAnsi="BRH Malayalam Extra" w:cs="BRH Malayalam Extra"/>
+                <w:sz w:val="25"/>
+                <w:szCs w:val="40"/>
+              </w:rPr>
+              <w:t>–</w:t>
+            </w:r>
+            <w:r>
+              <w:rPr>
+                <w:rFonts w:ascii="BRH Malayalam Extra" w:hAnsi="BRH Malayalam Extra" w:cs="BRH Malayalam Extra"/>
+                <w:sz w:val="32"/>
+                <w:szCs w:val="40"/>
+              </w:rPr>
+              <w:t>)q</w:t>
+            </w:r>
+            <w:proofErr w:type="gramEnd"/>
+            <w:r>
+              <w:rPr>
+                <w:rFonts w:ascii="BRH Malayalam Extra" w:hAnsi="BRH Malayalam Extra" w:cs="BRH Malayalam Extra"/>
+                <w:sz w:val="32"/>
+                <w:szCs w:val="40"/>
+              </w:rPr>
+              <w:t>¡dx— ¥Z |</w:t>
             </w:r>
           </w:p>
           <w:p>
@@ -21517,7 +22094,6 @@
                 <w:color w:val="000000"/>
                 <w:szCs w:val="40"/>
               </w:rPr>
-              <w:lastRenderedPageBreak/>
               <w:t>74</w:t>
             </w:r>
             <w:r>
@@ -22120,6 +22696,7 @@
                 <w:color w:val="000000"/>
                 <w:szCs w:val="40"/>
               </w:rPr>
+              <w:lastRenderedPageBreak/>
               <w:t>38</w:t>
             </w:r>
             <w:r>
@@ -25132,7 +25709,6 @@
                 <w:color w:val="000000"/>
                 <w:szCs w:val="40"/>
               </w:rPr>
-              <w:lastRenderedPageBreak/>
               <w:t>41</w:t>
             </w:r>
             <w:r>
@@ -25264,8 +25840,19 @@
                 <w:sz w:val="32"/>
                 <w:szCs w:val="40"/>
               </w:rPr>
-              <w:t>j—sõxI | )</w:t>
-            </w:r>
+              <w:t xml:space="preserve">j—sõxI </w:t>
+            </w:r>
+            <w:proofErr w:type="gramStart"/>
+            <w:r>
+              <w:rPr>
+                <w:rFonts w:ascii="BRH Malayalam Extra" w:hAnsi="BRH Malayalam Extra" w:cs="BRH Malayalam Extra"/>
+                <w:color w:val="000000"/>
+                <w:sz w:val="32"/>
+                <w:szCs w:val="40"/>
+              </w:rPr>
+              <w:t>| )</w:t>
+            </w:r>
+            <w:proofErr w:type="gramEnd"/>
           </w:p>
           <w:p>
             <w:pPr>
@@ -25482,6 +26069,7 @@
                 <w:color w:val="000000"/>
                 <w:szCs w:val="40"/>
               </w:rPr>
+              <w:lastRenderedPageBreak/>
               <w:t>42</w:t>
             </w:r>
             <w:r>
@@ -26338,6 +26926,7 @@
                 <w:color w:val="000000"/>
                 <w:szCs w:val="40"/>
               </w:rPr>
+              <w:lastRenderedPageBreak/>
               <w:t>41</w:t>
             </w:r>
             <w:r>
@@ -26687,6 +27276,7 @@
                 <w:color w:val="000000"/>
                 <w:szCs w:val="40"/>
               </w:rPr>
+              <w:lastRenderedPageBreak/>
               <w:t>42</w:t>
             </w:r>
             <w:r>
@@ -27549,6 +28139,7 @@
                 <w:rFonts w:cs="BRH Malayalam Extra"/>
                 <w:szCs w:val="40"/>
               </w:rPr>
+              <w:lastRenderedPageBreak/>
               <w:t>47</w:t>
             </w:r>
             <w:r>
@@ -28246,7 +28837,6 @@
                 <w:color w:val="000000"/>
                 <w:szCs w:val="40"/>
               </w:rPr>
-              <w:lastRenderedPageBreak/>
               <w:t>24</w:t>
             </w:r>
             <w:r>
@@ -28577,7 +29167,6 @@
                 <w:color w:val="000000"/>
                 <w:szCs w:val="40"/>
               </w:rPr>
-              <w:lastRenderedPageBreak/>
               <w:t>24</w:t>
             </w:r>
             <w:r>
@@ -28881,7 +29470,6 @@
                 <w:rFonts w:cs="BRH Malayalam Extra"/>
                 <w:szCs w:val="40"/>
               </w:rPr>
-              <w:lastRenderedPageBreak/>
               <w:t>39</w:t>
             </w:r>
             <w:r>
@@ -29019,6 +29607,7 @@
                 <w:sz w:val="32"/>
                 <w:szCs w:val="40"/>
               </w:rPr>
+              <w:lastRenderedPageBreak/>
               <w:t>Zûx</w:t>
             </w:r>
             <w:r>
@@ -29418,6 +30007,7 @@
                 <w:rFonts w:cs="BRH Malayalam Extra"/>
                 <w:szCs w:val="40"/>
               </w:rPr>
+              <w:lastRenderedPageBreak/>
               <w:t>39</w:t>
             </w:r>
             <w:r>
@@ -29555,6 +30145,7 @@
                 <w:sz w:val="32"/>
                 <w:szCs w:val="40"/>
               </w:rPr>
+              <w:lastRenderedPageBreak/>
               <w:t>Zûx</w:t>
             </w:r>
             <w:r>
@@ -29987,6 +30578,7 @@
                 <w:color w:val="000000"/>
                 <w:szCs w:val="40"/>
               </w:rPr>
+              <w:lastRenderedPageBreak/>
               <w:t>47</w:t>
             </w:r>
             <w:r>
@@ -31729,7 +32321,6 @@
                 <w:color w:val="000000"/>
                 <w:szCs w:val="40"/>
               </w:rPr>
-              <w:lastRenderedPageBreak/>
               <w:t>4</w:t>
             </w:r>
             <w:r>
@@ -32046,7 +32637,6 @@
                 <w:color w:val="000000"/>
                 <w:szCs w:val="40"/>
               </w:rPr>
-              <w:lastRenderedPageBreak/>
               <w:t>4</w:t>
             </w:r>
             <w:r>
@@ -34632,7 +35222,6 @@
                 <w:color w:val="000000"/>
                 <w:szCs w:val="40"/>
               </w:rPr>
-              <w:lastRenderedPageBreak/>
               <w:t>38</w:t>
             </w:r>
             <w:r>
@@ -35846,6 +36435,7 @@
                 <w:szCs w:val="40"/>
                 <w:lang w:val="it-IT"/>
               </w:rPr>
+              <w:lastRenderedPageBreak/>
               <w:t>44</w:t>
             </w:r>
             <w:r>

</xml_diff>

<commit_message>
nmv 28 05 2026
</commit_message>
<xml_diff>
--- a/TS Jatai Ghanam Project/TS 1.2/TS 1.2 Jatai Malayalam Corrections.docx
+++ b/TS Jatai Ghanam Project/TS 1.2/TS 1.2 Jatai Malayalam Corrections.docx
@@ -22,9 +22,8 @@
           <w:szCs w:val="32"/>
           <w:u w:val="single"/>
         </w:rPr>
-        <w:t xml:space="preserve">TS Jatai – TS 1.2 Malayalam Corrections – Observed </w:t>
+        <w:t xml:space="preserve">TS Jatai – TS 1.2 Malayalam Corrections – Observed till </w:t>
       </w:r>
-      <w:proofErr w:type="gramStart"/>
       <w:r>
         <w:rPr>
           <w:b/>
@@ -33,20 +32,8 @@
           <w:szCs w:val="32"/>
           <w:u w:val="single"/>
         </w:rPr>
-        <w:t xml:space="preserve">till </w:t>
+        <w:t>30th June 2026</w:t>
       </w:r>
-      <w:r>
-        <w:rPr>
-          <w:b/>
-          <w:bCs/>
-          <w:sz w:val="32"/>
-          <w:szCs w:val="32"/>
-          <w:highlight w:val="red"/>
-          <w:u w:val="single"/>
-        </w:rPr>
-        <w:t>?????</w:t>
-      </w:r>
-      <w:proofErr w:type="gramEnd"/>
     </w:p>
     <w:p>
       <w:pPr>
@@ -6245,6 +6232,87 @@
         </w:tc>
       </w:tr>
     </w:tbl>
+    <w:p>
+      <w:pPr>
+        <w:spacing w:before="0" w:line="240" w:lineRule="auto"/>
+        <w:jc w:val="center"/>
+        <w:rPr>
+          <w:b/>
+          <w:bCs/>
+          <w:sz w:val="32"/>
+          <w:szCs w:val="32"/>
+          <w:u w:val="single"/>
+          <w:lang w:val="it-IT"/>
+        </w:rPr>
+      </w:pPr>
+    </w:p>
+    <w:p>
+      <w:pPr>
+        <w:spacing w:before="0" w:line="240" w:lineRule="auto"/>
+        <w:jc w:val="center"/>
+        <w:rPr>
+          <w:b/>
+          <w:bCs/>
+          <w:sz w:val="32"/>
+          <w:szCs w:val="32"/>
+          <w:u w:val="single"/>
+          <w:lang w:val="it-IT"/>
+        </w:rPr>
+      </w:pPr>
+      <w:r>
+        <w:rPr>
+          <w:b/>
+          <w:bCs/>
+          <w:sz w:val="32"/>
+          <w:szCs w:val="32"/>
+          <w:u w:val="single"/>
+          <w:lang w:val="it-IT"/>
+        </w:rPr>
+        <w:t>===============</w:t>
+      </w:r>
+    </w:p>
+    <w:p>
+      <w:pPr>
+        <w:spacing w:before="0" w:line="240" w:lineRule="auto"/>
+        <w:jc w:val="center"/>
+        <w:rPr>
+          <w:b/>
+          <w:bCs/>
+          <w:sz w:val="32"/>
+          <w:szCs w:val="32"/>
+          <w:u w:val="single"/>
+          <w:lang w:val="it-IT"/>
+        </w:rPr>
+      </w:pPr>
+    </w:p>
+    <w:p>
+      <w:pPr>
+        <w:spacing w:before="0" w:line="240" w:lineRule="auto"/>
+        <w:jc w:val="center"/>
+        <w:rPr>
+          <w:b/>
+          <w:bCs/>
+          <w:sz w:val="32"/>
+          <w:szCs w:val="32"/>
+          <w:u w:val="single"/>
+          <w:lang w:val="it-IT"/>
+        </w:rPr>
+      </w:pPr>
+    </w:p>
+    <w:p>
+      <w:pPr>
+        <w:spacing w:before="0" w:line="240" w:lineRule="auto"/>
+        <w:jc w:val="center"/>
+        <w:rPr>
+          <w:b/>
+          <w:bCs/>
+          <w:sz w:val="32"/>
+          <w:szCs w:val="32"/>
+          <w:u w:val="single"/>
+          <w:lang w:val="it-IT"/>
+        </w:rPr>
+      </w:pPr>
+    </w:p>
     <w:p>
       <w:pPr>
         <w:spacing w:before="0" w:line="240" w:lineRule="auto"/>
@@ -6335,6 +6403,7 @@
           <w:szCs w:val="32"/>
           <w:u w:val="single"/>
         </w:rPr>
+        <w:lastRenderedPageBreak/>
         <w:t xml:space="preserve">TS Jatai – TS 1.2 Malayalam Corrections – Observed till </w:t>
       </w:r>
       <w:r>
@@ -6664,7 +6733,6 @@
                 <w:sz w:val="32"/>
                 <w:szCs w:val="40"/>
               </w:rPr>
-              <w:lastRenderedPageBreak/>
               <w:t>Be— DÉ</w:t>
             </w:r>
             <w:r>
@@ -7084,7 +7152,6 @@
                 <w:color w:val="000000"/>
                 <w:szCs w:val="40"/>
               </w:rPr>
-              <w:lastRenderedPageBreak/>
               <w:t>1</w:t>
             </w:r>
             <w:r>
@@ -7257,7 +7324,6 @@
                 <w:sz w:val="32"/>
                 <w:szCs w:val="40"/>
               </w:rPr>
-              <w:lastRenderedPageBreak/>
               <w:t>Be— DÉ</w:t>
             </w:r>
             <w:r>
@@ -7695,7 +7761,6 @@
                 <w:color w:val="000000"/>
                 <w:szCs w:val="40"/>
               </w:rPr>
-              <w:lastRenderedPageBreak/>
               <w:t>20</w:t>
             </w:r>
             <w:r>
@@ -9981,6 +10046,7 @@
                 <w:szCs w:val="40"/>
                 <w:lang w:val="it-IT"/>
               </w:rPr>
+              <w:lastRenderedPageBreak/>
               <w:t>45</w:t>
             </w:r>
             <w:r>
@@ -10298,7 +10364,6 @@
                 <w:szCs w:val="40"/>
                 <w:lang w:val="it-IT"/>
               </w:rPr>
-              <w:lastRenderedPageBreak/>
               <w:t>46</w:t>
             </w:r>
             <w:r>
@@ -10661,7 +10726,6 @@
                 <w:szCs w:val="40"/>
                 <w:lang w:val="it-IT"/>
               </w:rPr>
-              <w:lastRenderedPageBreak/>
               <w:t>45</w:t>
             </w:r>
             <w:r>
@@ -10979,7 +11043,6 @@
                 <w:szCs w:val="40"/>
                 <w:lang w:val="it-IT"/>
               </w:rPr>
-              <w:lastRenderedPageBreak/>
               <w:t>46</w:t>
             </w:r>
             <w:r>
@@ -11370,7 +11433,6 @@
                 <w:szCs w:val="40"/>
                 <w:lang w:val="it-IT"/>
               </w:rPr>
-              <w:lastRenderedPageBreak/>
               <w:t>49</w:t>
             </w:r>
             <w:r>
@@ -14420,6 +14482,7 @@
                 <w:szCs w:val="40"/>
                 <w:lang w:val="it-IT"/>
               </w:rPr>
+              <w:lastRenderedPageBreak/>
               <w:t>28</w:t>
             </w:r>
             <w:r>
@@ -15045,7 +15108,6 @@
                 <w:szCs w:val="40"/>
                 <w:lang w:val="it-IT"/>
               </w:rPr>
-              <w:lastRenderedPageBreak/>
               <w:t>11</w:t>
             </w:r>
             <w:r>
@@ -18504,6 +18566,7 @@
                 <w:szCs w:val="40"/>
                 <w:lang w:val="it-IT"/>
               </w:rPr>
+              <w:lastRenderedPageBreak/>
               <w:t>36</w:t>
             </w:r>
             <w:r>
@@ -18716,6 +18779,7 @@
                 <w:szCs w:val="40"/>
                 <w:lang w:val="it-IT"/>
               </w:rPr>
+              <w:lastRenderedPageBreak/>
               <w:t>35</w:t>
             </w:r>
             <w:r>
@@ -18903,6 +18967,7 @@
                 <w:szCs w:val="40"/>
                 <w:lang w:val="it-IT"/>
               </w:rPr>
+              <w:lastRenderedPageBreak/>
               <w:t>36</w:t>
             </w:r>
             <w:r>
@@ -20382,21 +20447,6 @@
                 <w:szCs w:val="40"/>
               </w:rPr>
             </w:pPr>
-          </w:p>
-          <w:p>
-            <w:pPr>
-              <w:widowControl w:val="0"/>
-              <w:autoSpaceDE w:val="0"/>
-              <w:autoSpaceDN w:val="0"/>
-              <w:adjustRightInd w:val="0"/>
-              <w:spacing w:before="0" w:line="240" w:lineRule="auto"/>
-              <w:rPr>
-                <w:rFonts w:ascii="BRH Malayalam Extra" w:hAnsi="BRH Malayalam Extra" w:cs="BRH Malayalam Extra"/>
-                <w:color w:val="000000"/>
-                <w:sz w:val="32"/>
-                <w:szCs w:val="40"/>
-              </w:rPr>
-            </w:pPr>
             <w:r>
               <w:rPr>
                 <w:rFonts w:cs="BRH Malayalam Extra"/>
@@ -21055,21 +21105,6 @@
               </w:rPr>
               <w:t xml:space="preserve">iZz | </w:t>
             </w:r>
-          </w:p>
-          <w:p>
-            <w:pPr>
-              <w:widowControl w:val="0"/>
-              <w:autoSpaceDE w:val="0"/>
-              <w:autoSpaceDN w:val="0"/>
-              <w:adjustRightInd w:val="0"/>
-              <w:spacing w:before="0" w:line="240" w:lineRule="auto"/>
-              <w:rPr>
-                <w:rFonts w:ascii="BRH Malayalam Extra" w:hAnsi="BRH Malayalam Extra" w:cs="BRH Malayalam Extra"/>
-                <w:color w:val="000000"/>
-                <w:sz w:val="32"/>
-                <w:szCs w:val="40"/>
-              </w:rPr>
-            </w:pPr>
           </w:p>
           <w:p>
             <w:pPr>
@@ -22082,18 +22117,47 @@
               <w:adjustRightInd w:val="0"/>
               <w:spacing w:before="0" w:line="240" w:lineRule="auto"/>
               <w:rPr>
-                <w:rFonts w:ascii="BRH Malayalam Extra" w:hAnsi="BRH Malayalam Extra" w:cs="BRH Malayalam Extra"/>
-                <w:color w:val="000000"/>
-                <w:sz w:val="32"/>
+                <w:rFonts w:cs="BRH Malayalam Extra"/>
+                <w:color w:val="000000"/>
                 <w:szCs w:val="40"/>
               </w:rPr>
             </w:pPr>
-            <w:r>
-              <w:rPr>
-                <w:rFonts w:cs="BRH Malayalam Extra"/>
-                <w:color w:val="000000"/>
-                <w:szCs w:val="40"/>
-              </w:rPr>
+          </w:p>
+          <w:p>
+            <w:pPr>
+              <w:widowControl w:val="0"/>
+              <w:autoSpaceDE w:val="0"/>
+              <w:autoSpaceDN w:val="0"/>
+              <w:adjustRightInd w:val="0"/>
+              <w:spacing w:before="0" w:line="240" w:lineRule="auto"/>
+              <w:rPr>
+                <w:rFonts w:cs="BRH Malayalam Extra"/>
+                <w:color w:val="000000"/>
+                <w:szCs w:val="40"/>
+              </w:rPr>
+            </w:pPr>
+          </w:p>
+          <w:p>
+            <w:pPr>
+              <w:widowControl w:val="0"/>
+              <w:autoSpaceDE w:val="0"/>
+              <w:autoSpaceDN w:val="0"/>
+              <w:adjustRightInd w:val="0"/>
+              <w:spacing w:before="0" w:line="240" w:lineRule="auto"/>
+              <w:rPr>
+                <w:rFonts w:ascii="BRH Malayalam Extra" w:hAnsi="BRH Malayalam Extra" w:cs="BRH Malayalam Extra"/>
+                <w:color w:val="000000"/>
+                <w:sz w:val="32"/>
+                <w:szCs w:val="40"/>
+              </w:rPr>
+            </w:pPr>
+            <w:r>
+              <w:rPr>
+                <w:rFonts w:cs="BRH Malayalam Extra"/>
+                <w:color w:val="000000"/>
+                <w:szCs w:val="40"/>
+              </w:rPr>
+              <w:lastRenderedPageBreak/>
               <w:t>74</w:t>
             </w:r>
             <w:r>
@@ -22376,18 +22440,47 @@
               <w:adjustRightInd w:val="0"/>
               <w:spacing w:before="0" w:line="240" w:lineRule="auto"/>
               <w:rPr>
-                <w:rFonts w:ascii="BRH Malayalam Extra" w:hAnsi="BRH Malayalam Extra" w:cs="BRH Malayalam Extra"/>
-                <w:color w:val="000000"/>
-                <w:sz w:val="32"/>
+                <w:rFonts w:cs="BRH Malayalam Extra"/>
+                <w:color w:val="000000"/>
                 <w:szCs w:val="40"/>
               </w:rPr>
             </w:pPr>
-            <w:r>
-              <w:rPr>
-                <w:rFonts w:cs="BRH Malayalam Extra"/>
-                <w:color w:val="000000"/>
-                <w:szCs w:val="40"/>
-              </w:rPr>
+          </w:p>
+          <w:p>
+            <w:pPr>
+              <w:widowControl w:val="0"/>
+              <w:autoSpaceDE w:val="0"/>
+              <w:autoSpaceDN w:val="0"/>
+              <w:adjustRightInd w:val="0"/>
+              <w:spacing w:before="0" w:line="240" w:lineRule="auto"/>
+              <w:rPr>
+                <w:rFonts w:cs="BRH Malayalam Extra"/>
+                <w:color w:val="000000"/>
+                <w:szCs w:val="40"/>
+              </w:rPr>
+            </w:pPr>
+          </w:p>
+          <w:p>
+            <w:pPr>
+              <w:widowControl w:val="0"/>
+              <w:autoSpaceDE w:val="0"/>
+              <w:autoSpaceDN w:val="0"/>
+              <w:adjustRightInd w:val="0"/>
+              <w:spacing w:before="0" w:line="240" w:lineRule="auto"/>
+              <w:rPr>
+                <w:rFonts w:ascii="BRH Malayalam Extra" w:hAnsi="BRH Malayalam Extra" w:cs="BRH Malayalam Extra"/>
+                <w:color w:val="000000"/>
+                <w:sz w:val="32"/>
+                <w:szCs w:val="40"/>
+              </w:rPr>
+            </w:pPr>
+            <w:r>
+              <w:rPr>
+                <w:rFonts w:cs="BRH Malayalam Extra"/>
+                <w:color w:val="000000"/>
+                <w:szCs w:val="40"/>
+              </w:rPr>
+              <w:lastRenderedPageBreak/>
               <w:t>74</w:t>
             </w:r>
             <w:r>
@@ -25709,6 +25802,7 @@
                 <w:color w:val="000000"/>
                 <w:szCs w:val="40"/>
               </w:rPr>
+              <w:lastRenderedPageBreak/>
               <w:t>41</w:t>
             </w:r>
             <w:r>
@@ -26069,7 +26163,6 @@
                 <w:color w:val="000000"/>
                 <w:szCs w:val="40"/>
               </w:rPr>
-              <w:lastRenderedPageBreak/>
               <w:t>42</w:t>
             </w:r>
             <w:r>
@@ -26926,7 +27019,6 @@
                 <w:color w:val="000000"/>
                 <w:szCs w:val="40"/>
               </w:rPr>
-              <w:lastRenderedPageBreak/>
               <w:t>41</w:t>
             </w:r>
             <w:r>
@@ -27276,7 +27368,6 @@
                 <w:color w:val="000000"/>
                 <w:szCs w:val="40"/>
               </w:rPr>
-              <w:lastRenderedPageBreak/>
               <w:t>42</w:t>
             </w:r>
             <w:r>
@@ -28139,7 +28230,6 @@
                 <w:rFonts w:cs="BRH Malayalam Extra"/>
                 <w:szCs w:val="40"/>
               </w:rPr>
-              <w:lastRenderedPageBreak/>
               <w:t>47</w:t>
             </w:r>
             <w:r>
@@ -28837,6 +28927,7 @@
                 <w:color w:val="000000"/>
                 <w:szCs w:val="40"/>
               </w:rPr>
+              <w:lastRenderedPageBreak/>
               <w:t>24</w:t>
             </w:r>
             <w:r>
@@ -29167,6 +29258,7 @@
                 <w:color w:val="000000"/>
                 <w:szCs w:val="40"/>
               </w:rPr>
+              <w:lastRenderedPageBreak/>
               <w:t>24</w:t>
             </w:r>
             <w:r>
@@ -29470,6 +29562,7 @@
                 <w:rFonts w:cs="BRH Malayalam Extra"/>
                 <w:szCs w:val="40"/>
               </w:rPr>
+              <w:lastRenderedPageBreak/>
               <w:t>39</w:t>
             </w:r>
             <w:r>
@@ -29607,7 +29700,6 @@
                 <w:sz w:val="32"/>
                 <w:szCs w:val="40"/>
               </w:rPr>
-              <w:lastRenderedPageBreak/>
               <w:t>Zûx</w:t>
             </w:r>
             <w:r>
@@ -30007,7 +30099,6 @@
                 <w:rFonts w:cs="BRH Malayalam Extra"/>
                 <w:szCs w:val="40"/>
               </w:rPr>
-              <w:lastRenderedPageBreak/>
               <w:t>39</w:t>
             </w:r>
             <w:r>
@@ -30145,7 +30236,6 @@
                 <w:sz w:val="32"/>
                 <w:szCs w:val="40"/>
               </w:rPr>
-              <w:lastRenderedPageBreak/>
               <w:t>Zûx</w:t>
             </w:r>
             <w:r>
@@ -30578,7 +30668,6 @@
                 <w:color w:val="000000"/>
                 <w:szCs w:val="40"/>
               </w:rPr>
-              <w:lastRenderedPageBreak/>
               <w:t>47</w:t>
             </w:r>
             <w:r>
@@ -32321,6 +32410,7 @@
                 <w:color w:val="000000"/>
                 <w:szCs w:val="40"/>
               </w:rPr>
+              <w:lastRenderedPageBreak/>
               <w:t>4</w:t>
             </w:r>
             <w:r>
@@ -32637,6 +32727,7 @@
                 <w:color w:val="000000"/>
                 <w:szCs w:val="40"/>
               </w:rPr>
+              <w:lastRenderedPageBreak/>
               <w:t>4</w:t>
             </w:r>
             <w:r>
@@ -35222,6 +35313,7 @@
                 <w:color w:val="000000"/>
                 <w:szCs w:val="40"/>
               </w:rPr>
+              <w:lastRenderedPageBreak/>
               <w:t>38</w:t>
             </w:r>
             <w:r>
@@ -36435,7 +36527,6 @@
                 <w:szCs w:val="40"/>
                 <w:lang w:val="it-IT"/>
               </w:rPr>
-              <w:lastRenderedPageBreak/>
               <w:t>44</w:t>
             </w:r>
             <w:r>

</xml_diff>